<commit_message>
More changes and about at 3561 words. Right on the button. Need to complete boxes now and update examples and figures
</commit_message>
<xml_diff>
--- a/docs/Revision1/ms_revision.docx
+++ b/docs/Revision1/ms_revision.docx
@@ -988,13 +988,7 @@
       </w:pPr>
       <w:ins w:id="83" w:author="Daniel Noble" w:date="2025-10-28T10:38:00Z" w16du:dateUtc="2025-10-27T23:38:00Z">
         <w:r>
-          <w:t xml:space="preserve">Using plants and insects as </w:t>
-        </w:r>
-        <w:r>
-          <w:t>examples</w:t>
-        </w:r>
-        <w:r>
-          <w:t xml:space="preserve">, </w:t>
+          <w:t xml:space="preserve">Using plants and insects as examples, </w:t>
         </w:r>
       </w:ins>
       <w:ins w:id="84" w:author="Daniel Noble" w:date="2025-10-28T10:37:00Z" w16du:dateUtc="2025-10-27T23:37:00Z">
@@ -1562,126 +1556,78 @@
                 <w:t xml:space="preserve">. </w:t>
               </w:r>
               <w:r>
-                <w:rPr>
-                  <w:lang w:val="en-AU"/>
-                </w:rPr>
                 <w:t xml:space="preserve">The modelling approach </w:t>
               </w:r>
             </w:ins>
             <w:ins w:id="149" w:author="Daniel Noble" w:date="2025-10-27T10:22:00Z" w16du:dateUtc="2025-10-26T23:22:00Z">
               <w:r>
-                <w:rPr>
-                  <w:lang w:val="en-AU"/>
-                </w:rPr>
                 <w:t xml:space="preserve">we </w:t>
               </w:r>
             </w:ins>
             <w:ins w:id="150" w:author="Daniel Noble" w:date="2025-10-27T09:50:00Z" w16du:dateUtc="2025-10-26T22:50:00Z">
               <w:r>
-                <w:rPr>
-                  <w:lang w:val="en-AU"/>
-                </w:rPr>
                 <w:t xml:space="preserve">develop here integrates (1) climate/biophysical models to predict the different microclimates species experience. (2) Microclimates experienced by organisms then provide inputs for </w:t>
               </w:r>
             </w:ins>
             <w:ins w:id="151" w:author="Daniel Noble" w:date="2025-10-27T10:12:00Z" w16du:dateUtc="2025-10-26T23:12:00Z">
               <w:r>
-                <w:rPr>
-                  <w:lang w:val="en-AU"/>
-                </w:rPr>
                 <w:t>physiological</w:t>
               </w:r>
             </w:ins>
             <w:ins w:id="152" w:author="Daniel Noble" w:date="2025-10-27T09:50:00Z" w16du:dateUtc="2025-10-26T22:50:00Z">
               <w:r>
-                <w:rPr>
-                  <w:lang w:val="en-AU"/>
-                </w:rPr>
                 <w:t xml:space="preserve"> models that integrate temperature exposure with explicit physiological </w:t>
               </w:r>
             </w:ins>
             <w:ins w:id="153" w:author="Daniel Noble" w:date="2025-10-27T10:13:00Z" w16du:dateUtc="2025-10-26T23:13:00Z">
               <w:r>
-                <w:rPr>
-                  <w:lang w:val="en-AU"/>
-                </w:rPr>
                 <w:t>processes</w:t>
               </w:r>
             </w:ins>
             <w:ins w:id="154" w:author="Daniel Noble" w:date="2025-10-27T09:50:00Z" w16du:dateUtc="2025-10-26T22:50:00Z">
               <w:r>
-                <w:rPr>
-                  <w:lang w:val="en-AU"/>
-                </w:rPr>
                 <w:t xml:space="preserve"> that simulate development, behavio</w:t>
               </w:r>
             </w:ins>
             <w:ins w:id="155" w:author="Daniel Noble" w:date="2025-10-28T10:39:00Z" w16du:dateUtc="2025-10-27T23:39:00Z">
               <w:r>
-                <w:rPr>
-                  <w:lang w:val="en-AU"/>
-                </w:rPr>
                 <w:t>u</w:t>
               </w:r>
             </w:ins>
             <w:ins w:id="156" w:author="Daniel Noble" w:date="2025-10-27T09:50:00Z" w16du:dateUtc="2025-10-26T22:50:00Z">
               <w:r>
-                <w:rPr>
-                  <w:lang w:val="en-AU"/>
-                </w:rPr>
                 <w:t xml:space="preserve">r, survival and reproduction in response to </w:t>
               </w:r>
             </w:ins>
             <w:ins w:id="157" w:author="Daniel Noble" w:date="2025-10-27T11:51:00Z" w16du:dateUtc="2025-10-27T00:51:00Z">
               <w:r>
-                <w:rPr>
-                  <w:lang w:val="en-AU"/>
-                </w:rPr>
                 <w:t>microclimate</w:t>
               </w:r>
             </w:ins>
             <w:ins w:id="158" w:author="Daniel Noble" w:date="2025-10-27T09:50:00Z" w16du:dateUtc="2025-10-26T22:50:00Z">
               <w:r>
-                <w:rPr>
-                  <w:lang w:val="en-AU"/>
-                </w:rPr>
                 <w:t xml:space="preserve"> dynamics across life history stages. Physiological models can be built around the unique life cycles of the diverse species in communities, capturing lagged responses to extreme heat, phenological mismatches and mechanistically informed responses to extreme heat for species of the system in question. Outputs </w:t>
               </w:r>
               <w:r>
-                <w:rPr>
-                  <w:lang w:val="en-AU"/>
-                </w:rPr>
                 <w:lastRenderedPageBreak/>
                 <w:t>(</w:t>
               </w:r>
               <w:proofErr w:type="spellStart"/>
               <w:r>
-                <w:rPr>
-                  <w:lang w:val="en-AU"/>
-                </w:rPr>
                 <w:t>behavior</w:t>
               </w:r>
               <w:proofErr w:type="spellEnd"/>
               <w:r>
-                <w:rPr>
-                  <w:lang w:val="en-AU"/>
-                </w:rPr>
                 <w:t xml:space="preserve">, growth rate, biomass accumulation, survival and reproduction) from physiological models of individual organisms can then be integrated into (3) population and community ecology models to predict population growth and community composition under a specific type of change (either to the environment or suite of interacting organisms). Environment-mediated feedback loops (4) influence organism thermal exposure and sensitivity (e.g., water availability, microbiota), which can vary across different life stages and organs. Coupling existing models will allow </w:t>
               </w:r>
             </w:ins>
             <w:ins w:id="159" w:author="Daniel Noble" w:date="2025-10-27T11:52:00Z" w16du:dateUtc="2025-10-27T00:52:00Z">
               <w:r>
-                <w:rPr>
-                  <w:lang w:val="en-AU"/>
-                </w:rPr>
                 <w:t xml:space="preserve">for </w:t>
               </w:r>
             </w:ins>
             <w:ins w:id="160" w:author="Daniel Noble" w:date="2025-10-27T09:50:00Z" w16du:dateUtc="2025-10-26T22:50:00Z">
               <w:r>
-                <w:rPr>
-                  <w:lang w:val="en-AU"/>
-                </w:rPr>
                 <w:t>quantitative predictions to be made on how extreme heatwaves perturb biological systems and allow for the development and implementation of strategies to enhance biological system resilience to extreme heat.</w:t>
               </w:r>
             </w:ins>
@@ -1958,15 +1904,7 @@
         </w:r>
       </w:ins>
       <w:r>
-        <w:t xml:space="preserve">. For example, while air temperature may be 50°C, an organism a </w:t>
-      </w:r>
-      <w:proofErr w:type="spellStart"/>
-      <w:r>
-        <w:t>metre</w:t>
-      </w:r>
-      <w:proofErr w:type="spellEnd"/>
-      <w:r>
-        <w:t xml:space="preserve"> below the soil surface may be exposed to temperatures 25°C cooler (</w:t>
+        <w:t>. For example, while air temperature may be 50°C, an organism a metre below the soil surface may be exposed to temperatures 25°C cooler (</w:t>
       </w:r>
       <w:hyperlink w:anchor="fig-sys">
         <w:r>
@@ -2046,15 +1984,7 @@
       </w:ins>
       <w:ins w:id="212" w:author="Daniel Noble" w:date="2025-10-27T10:42:00Z" w16du:dateUtc="2025-10-26T23:42:00Z">
         <w:r>
-          <w:t xml:space="preserve"> them with detailed information on terrain (slope, aspect, hill shade), vegetation [plant-area index (PAI), stomatal </w:t>
-        </w:r>
-        <w:proofErr w:type="spellStart"/>
-        <w:r>
-          <w:t>behaviour</w:t>
-        </w:r>
-        <w:proofErr w:type="spellEnd"/>
-        <w:r>
-          <w:t xml:space="preserve">, leaf </w:t>
+          <w:t xml:space="preserve"> them with detailed information on terrain (slope, aspect, hill shade), vegetation [plant-area index (PAI), stomatal behaviour, leaf </w:t>
         </w:r>
       </w:ins>
       <w:commentRangeEnd w:id="185"/>
@@ -2817,14 +2747,7 @@
             <w:b/>
             <w:bCs/>
           </w:rPr>
-          <w:t>b</w:t>
-        </w:r>
-        <w:r>
-          <w:rPr>
-            <w:b/>
-            <w:bCs/>
-          </w:rPr>
-          <w:t xml:space="preserve">iophysical </w:t>
+          <w:t xml:space="preserve">biophysical </w:t>
         </w:r>
       </w:ins>
       <w:r>
@@ -3116,15 +3039,7 @@
       </w:ins>
       <w:ins w:id="389" w:author="Daniel Noble" w:date="2025-10-28T11:07:00Z" w16du:dateUtc="2025-10-28T00:07:00Z">
         <w:r>
-          <w:t xml:space="preserve">In addition, incorporating stomatal </w:t>
-        </w:r>
-        <w:proofErr w:type="spellStart"/>
-        <w:r>
-          <w:t>behaviour</w:t>
-        </w:r>
-        <w:proofErr w:type="spellEnd"/>
-        <w:r>
-          <w:t xml:space="preserve"> can mitigate or exacerbate the extreme </w:t>
+          <w:t xml:space="preserve">In addition, incorporating stomatal behaviour can mitigate or exacerbate the extreme </w:t>
         </w:r>
         <w:r>
           <w:lastRenderedPageBreak/>
@@ -3143,15 +3058,7 @@
         </w:r>
       </w:del>
       <w:r>
-        <w:t xml:space="preserve">models in concert with microclimate models can thus be used to infer the thermal conditions to which members of the same ecological community are exposed with different degrees of detail. </w:t>
-      </w:r>
-      <w:proofErr w:type="spellStart"/>
-      <w:r>
-        <w:t>Realised</w:t>
-      </w:r>
-      <w:proofErr w:type="spellEnd"/>
-      <w:r>
-        <w:t xml:space="preserve"> thermal exposure can then be linked to physiological models of damage and repair.</w:t>
+        <w:t>models in concert with microclimate models can thus be used to infer the thermal conditions to which members of the same ecological community are exposed with different degrees of detail. Realised thermal exposure can then be linked to physiological models of damage and repair.</w:t>
       </w:r>
       <w:ins w:id="391" w:author="Daniel Noble" w:date="2025-10-27T13:26:00Z" w16du:dateUtc="2025-10-27T02:26:00Z">
         <w:r>
@@ -3489,17 +3396,28 @@
         </w:r>
         <w:proofErr w:type="spellEnd"/>
         <w:r>
-          <w:t xml:space="preserve"> can impact heat tolerance in animals [@Hoang2019]. Modelling the intricate balance between damage and repair for a suite of different species can help identify susceptible species, life stages and tissues that are most at risk from extreme heat events due to direct sensitivity to extreme heat, which allows for more accurate predictions of the varying levels of species sensitivity within a community under particular types of climate events.</w:t>
-        </w:r>
-      </w:ins>
-      <w:del w:id="415" w:author="Daniel Noble" w:date="2025-10-28T11:49:00Z" w16du:dateUtc="2025-10-28T00:49:00Z">
+          <w:t xml:space="preserve"> can impact heat tolerance in animals [@Hoang2019]. </w:t>
+        </w:r>
+      </w:ins>
+      <w:ins w:id="415" w:author="Daniel Noble" w:date="2025-10-29T11:38:00Z" w16du:dateUtc="2025-10-29T00:38:00Z">
+        <w:r>
+          <w:t>M</w:t>
+        </w:r>
+        <w:r>
+          <w:t>odelling the intricate balance between damage and repair for a suite of different species can help identify susceptible species, life stages and tissues that are most at risk from extreme heat events due to direct sensitivity to extreme heat, which should allow for more accurate predictions of the varying levels of species sensitivity within a community.</w:t>
+        </w:r>
+        <w:r>
+          <w:t xml:space="preserve"> </w:t>
+        </w:r>
+      </w:ins>
+      <w:del w:id="416" w:author="Daniel Noble" w:date="2025-10-28T11:49:00Z" w16du:dateUtc="2025-10-28T00:49:00Z">
         <w:r>
           <w:delText xml:space="preserve">The concept of damage and repair is important for understanding how heat waves affect organisms because both processes can result in lagged responses to heat stress – a common feature of extreme heat events [20,54]. Once the thermal sensitivity (i.e., the slope </w:delText>
         </w:r>
       </w:del>
       <m:oMath>
         <m:r>
-          <w:del w:id="416" w:author="Daniel Noble" w:date="2025-10-28T11:49:00Z" w16du:dateUtc="2025-10-28T00:49:00Z">
+          <w:del w:id="417" w:author="Daniel Noble" w:date="2025-10-28T11:49:00Z" w16du:dateUtc="2025-10-28T00:49:00Z">
             <w:rPr>
               <w:rFonts w:ascii="Cambria Math" w:hAnsi="Cambria Math"/>
             </w:rPr>
@@ -3507,7 +3425,7 @@
           </w:del>
         </m:r>
       </m:oMath>
-      <w:del w:id="417" w:author="Daniel Noble" w:date="2025-10-28T11:49:00Z" w16du:dateUtc="2025-10-28T00:49:00Z">
+      <w:del w:id="418" w:author="Daniel Noble" w:date="2025-10-28T11:49:00Z" w16du:dateUtc="2025-10-28T00:49:00Z">
         <w:r>
           <w:delText xml:space="preserve">, Figure 1) for a particular endpoint has been quantified it can be used to predict the accumulation of damage during stressful temperatures experienced under realistic conditions [10,11,20,51]. Several approaches can be used to capture the accumulation of damage [10,11,51], but a simplistic way follows Ørsted </w:delText>
         </w:r>
@@ -3528,17 +3446,17 @@
         <w:pStyle w:val="BodyText"/>
         <w:spacing w:line="360" w:lineRule="auto"/>
         <w:rPr>
-          <w:del w:id="418" w:author="Daniel Noble" w:date="2025-10-28T11:49:00Z" w16du:dateUtc="2025-10-28T00:49:00Z"/>
-        </w:rPr>
-      </w:pPr>
-      <w:bookmarkStart w:id="419" w:name="eq-hi"/>
+          <w:del w:id="419" w:author="Daniel Noble" w:date="2025-10-28T11:49:00Z" w16du:dateUtc="2025-10-28T00:49:00Z"/>
+        </w:rPr>
+      </w:pPr>
+      <w:bookmarkStart w:id="420" w:name="eq-hi"/>
       <m:oMathPara>
         <m:oMathParaPr>
           <m:jc m:val="center"/>
         </m:oMathParaPr>
         <m:oMath>
           <m:r>
-            <w:del w:id="420" w:author="Daniel Noble" w:date="2025-10-28T11:49:00Z" w16du:dateUtc="2025-10-28T00:49:00Z">
+            <w:del w:id="421" w:author="Daniel Noble" w:date="2025-10-28T11:49:00Z" w16du:dateUtc="2025-10-28T00:49:00Z">
               <w:rPr>
                 <w:rFonts w:ascii="Cambria Math" w:hAnsi="Cambria Math"/>
               </w:rPr>
@@ -3546,7 +3464,7 @@
             </w:del>
           </m:r>
           <m:r>
-            <w:del w:id="421" w:author="Daniel Noble" w:date="2025-10-28T11:49:00Z" w16du:dateUtc="2025-10-28T00:49:00Z">
+            <w:del w:id="422" w:author="Daniel Noble" w:date="2025-10-28T11:49:00Z" w16du:dateUtc="2025-10-28T00:49:00Z">
               <m:rPr>
                 <m:sty m:val="p"/>
               </m:rPr>
@@ -3561,7 +3479,7 @@
               <m:chr m:val="∑"/>
               <m:limLoc m:val="undOvr"/>
               <m:ctrlPr>
-                <w:del w:id="422" w:author="Daniel Noble" w:date="2025-10-28T11:49:00Z" w16du:dateUtc="2025-10-28T00:49:00Z">
+                <w:del w:id="423" w:author="Daniel Noble" w:date="2025-10-28T11:49:00Z" w16du:dateUtc="2025-10-28T00:49:00Z">
                   <w:rPr>
                     <w:rFonts w:ascii="Cambria Math" w:hAnsi="Cambria Math"/>
                   </w:rPr>
@@ -3570,7 +3488,7 @@
             </m:naryPr>
             <m:sub>
               <m:r>
-                <w:del w:id="423" w:author="Daniel Noble" w:date="2025-10-28T11:49:00Z" w16du:dateUtc="2025-10-28T00:49:00Z">
+                <w:del w:id="424" w:author="Daniel Noble" w:date="2025-10-28T11:49:00Z" w16du:dateUtc="2025-10-28T00:49:00Z">
                   <w:rPr>
                     <w:rFonts w:ascii="Cambria Math" w:hAnsi="Cambria Math"/>
                   </w:rPr>
@@ -3578,7 +3496,7 @@
                 </w:del>
               </m:r>
               <m:r>
-                <w:del w:id="424" w:author="Daniel Noble" w:date="2025-10-28T11:49:00Z" w16du:dateUtc="2025-10-28T00:49:00Z">
+                <w:del w:id="425" w:author="Daniel Noble" w:date="2025-10-28T11:49:00Z" w16du:dateUtc="2025-10-28T00:49:00Z">
                   <m:rPr>
                     <m:sty m:val="p"/>
                   </m:rPr>
@@ -3589,7 +3507,7 @@
                 </w:del>
               </m:r>
               <m:r>
-                <w:del w:id="425" w:author="Daniel Noble" w:date="2025-10-28T11:49:00Z" w16du:dateUtc="2025-10-28T00:49:00Z">
+                <w:del w:id="426" w:author="Daniel Noble" w:date="2025-10-28T11:49:00Z" w16du:dateUtc="2025-10-28T00:49:00Z">
                   <w:rPr>
                     <w:rFonts w:ascii="Cambria Math" w:hAnsi="Cambria Math"/>
                   </w:rPr>
@@ -3601,7 +3519,7 @@
               <m:sSub>
                 <m:sSubPr>
                   <m:ctrlPr>
-                    <w:del w:id="426" w:author="Daniel Noble" w:date="2025-10-28T11:49:00Z" w16du:dateUtc="2025-10-28T00:49:00Z">
+                    <w:del w:id="427" w:author="Daniel Noble" w:date="2025-10-28T11:49:00Z" w16du:dateUtc="2025-10-28T00:49:00Z">
                       <w:rPr>
                         <w:rFonts w:ascii="Cambria Math" w:hAnsi="Cambria Math"/>
                       </w:rPr>
@@ -3610,7 +3528,7 @@
                 </m:sSubPr>
                 <m:e>
                   <m:r>
-                    <w:del w:id="427" w:author="Daniel Noble" w:date="2025-10-28T11:49:00Z" w16du:dateUtc="2025-10-28T00:49:00Z">
+                    <w:del w:id="428" w:author="Daniel Noble" w:date="2025-10-28T11:49:00Z" w16du:dateUtc="2025-10-28T00:49:00Z">
                       <w:rPr>
                         <w:rFonts w:ascii="Cambria Math" w:hAnsi="Cambria Math"/>
                       </w:rPr>
@@ -3620,7 +3538,7 @@
                 </m:e>
                 <m:sub>
                   <m:r>
-                    <w:del w:id="428" w:author="Daniel Noble" w:date="2025-10-28T11:49:00Z" w16du:dateUtc="2025-10-28T00:49:00Z">
+                    <w:del w:id="429" w:author="Daniel Noble" w:date="2025-10-28T11:49:00Z" w16du:dateUtc="2025-10-28T00:49:00Z">
                       <w:rPr>
                         <w:rFonts w:ascii="Cambria Math" w:hAnsi="Cambria Math"/>
                       </w:rPr>
@@ -3630,7 +3548,7 @@
                 </m:sub>
               </m:sSub>
               <m:r>
-                <w:del w:id="429" w:author="Daniel Noble" w:date="2025-10-28T11:49:00Z" w16du:dateUtc="2025-10-28T00:49:00Z">
+                <w:del w:id="430" w:author="Daniel Noble" w:date="2025-10-28T11:49:00Z" w16du:dateUtc="2025-10-28T00:49:00Z">
                   <m:rPr>
                     <m:sty m:val="p"/>
                   </m:rPr>
@@ -3643,7 +3561,7 @@
               <m:sSub>
                 <m:sSubPr>
                   <m:ctrlPr>
-                    <w:del w:id="430" w:author="Daniel Noble" w:date="2025-10-28T11:49:00Z" w16du:dateUtc="2025-10-28T00:49:00Z">
+                    <w:del w:id="431" w:author="Daniel Noble" w:date="2025-10-28T11:49:00Z" w16du:dateUtc="2025-10-28T00:49:00Z">
                       <w:rPr>
                         <w:rFonts w:ascii="Cambria Math" w:hAnsi="Cambria Math"/>
                       </w:rPr>
@@ -3652,7 +3570,7 @@
                 </m:sSubPr>
                 <m:e>
                   <m:r>
-                    <w:del w:id="431" w:author="Daniel Noble" w:date="2025-10-28T11:49:00Z" w16du:dateUtc="2025-10-28T00:49:00Z">
+                    <w:del w:id="432" w:author="Daniel Noble" w:date="2025-10-28T11:49:00Z" w16du:dateUtc="2025-10-28T00:49:00Z">
                       <w:rPr>
                         <w:rFonts w:ascii="Cambria Math" w:hAnsi="Cambria Math"/>
                       </w:rPr>
@@ -3662,7 +3580,7 @@
                 </m:e>
                 <m:sub>
                   <m:r>
-                    <w:del w:id="432" w:author="Daniel Noble" w:date="2025-10-28T11:49:00Z" w16du:dateUtc="2025-10-28T00:49:00Z">
+                    <w:del w:id="433" w:author="Daniel Noble" w:date="2025-10-28T11:49:00Z" w16du:dateUtc="2025-10-28T00:49:00Z">
                       <w:rPr>
                         <w:rFonts w:ascii="Cambria Math" w:hAnsi="Cambria Math"/>
                       </w:rPr>
@@ -3676,7 +3594,7 @@
               <m:f>
                 <m:fPr>
                   <m:ctrlPr>
-                    <w:del w:id="433" w:author="Daniel Noble" w:date="2025-10-28T11:49:00Z" w16du:dateUtc="2025-10-28T00:49:00Z">
+                    <w:del w:id="434" w:author="Daniel Noble" w:date="2025-10-28T11:49:00Z" w16du:dateUtc="2025-10-28T00:49:00Z">
                       <w:rPr>
                         <w:rFonts w:ascii="Cambria Math" w:hAnsi="Cambria Math"/>
                       </w:rPr>
@@ -3685,7 +3603,7 @@
                 </m:fPr>
                 <m:num>
                   <m:r>
-                    <w:del w:id="434" w:author="Daniel Noble" w:date="2025-10-28T11:49:00Z" w16du:dateUtc="2025-10-28T00:49:00Z">
+                    <w:del w:id="435" w:author="Daniel Noble" w:date="2025-10-28T11:49:00Z" w16du:dateUtc="2025-10-28T00:49:00Z">
                       <w:rPr>
                         <w:rFonts w:ascii="Cambria Math" w:hAnsi="Cambria Math"/>
                       </w:rPr>
@@ -3693,7 +3611,7 @@
                     </w:del>
                   </m:r>
                   <m:r>
-                    <w:del w:id="435" w:author="Daniel Noble" w:date="2025-10-28T11:49:00Z" w16du:dateUtc="2025-10-28T00:49:00Z">
+                    <w:del w:id="436" w:author="Daniel Noble" w:date="2025-10-28T11:49:00Z" w16du:dateUtc="2025-10-28T00:49:00Z">
                       <m:rPr>
                         <m:sty m:val="p"/>
                       </m:rPr>
@@ -3706,7 +3624,7 @@
                   <m:d>
                     <m:dPr>
                       <m:ctrlPr>
-                        <w:del w:id="436" w:author="Daniel Noble" w:date="2025-10-28T11:49:00Z" w16du:dateUtc="2025-10-28T00:49:00Z">
+                        <w:del w:id="437" w:author="Daniel Noble" w:date="2025-10-28T11:49:00Z" w16du:dateUtc="2025-10-28T00:49:00Z">
                           <w:rPr>
                             <w:rFonts w:ascii="Cambria Math" w:hAnsi="Cambria Math"/>
                           </w:rPr>
@@ -3717,7 +3635,7 @@
                       <m:sSub>
                         <m:sSubPr>
                           <m:ctrlPr>
-                            <w:del w:id="437" w:author="Daniel Noble" w:date="2025-10-28T11:49:00Z" w16du:dateUtc="2025-10-28T00:49:00Z">
+                            <w:del w:id="438" w:author="Daniel Noble" w:date="2025-10-28T11:49:00Z" w16du:dateUtc="2025-10-28T00:49:00Z">
                               <w:rPr>
                                 <w:rFonts w:ascii="Cambria Math" w:hAnsi="Cambria Math"/>
                               </w:rPr>
@@ -3726,7 +3644,7 @@
                         </m:sSubPr>
                         <m:e>
                           <m:r>
-                            <w:del w:id="438" w:author="Daniel Noble" w:date="2025-10-28T11:49:00Z" w16du:dateUtc="2025-10-28T00:49:00Z">
+                            <w:del w:id="439" w:author="Daniel Noble" w:date="2025-10-28T11:49:00Z" w16du:dateUtc="2025-10-28T00:49:00Z">
                               <w:rPr>
                                 <w:rFonts w:ascii="Cambria Math" w:hAnsi="Cambria Math"/>
                               </w:rPr>
@@ -3736,7 +3654,7 @@
                         </m:e>
                         <m:sub>
                           <m:r>
-                            <w:del w:id="439" w:author="Daniel Noble" w:date="2025-10-28T11:49:00Z" w16du:dateUtc="2025-10-28T00:49:00Z">
+                            <w:del w:id="440" w:author="Daniel Noble" w:date="2025-10-28T11:49:00Z" w16du:dateUtc="2025-10-28T00:49:00Z">
                               <w:rPr>
                                 <w:rFonts w:ascii="Cambria Math" w:hAnsi="Cambria Math"/>
                               </w:rPr>
@@ -3744,7 +3662,7 @@
                             </w:del>
                           </m:r>
                           <m:r>
-                            <w:del w:id="440" w:author="Daniel Noble" w:date="2025-10-28T11:49:00Z" w16du:dateUtc="2025-10-28T00:49:00Z">
+                            <w:del w:id="441" w:author="Daniel Noble" w:date="2025-10-28T11:49:00Z" w16du:dateUtc="2025-10-28T00:49:00Z">
                               <m:rPr>
                                 <m:sty m:val="p"/>
                               </m:rPr>
@@ -3755,7 +3673,7 @@
                             </w:del>
                           </m:r>
                           <m:r>
-                            <w:del w:id="441" w:author="Daniel Noble" w:date="2025-10-28T11:49:00Z" w16du:dateUtc="2025-10-28T00:49:00Z">
+                            <w:del w:id="442" w:author="Daniel Noble" w:date="2025-10-28T11:49:00Z" w16du:dateUtc="2025-10-28T00:49:00Z">
                               <w:rPr>
                                 <w:rFonts w:ascii="Cambria Math" w:hAnsi="Cambria Math"/>
                               </w:rPr>
@@ -3765,7 +3683,7 @@
                         </m:sub>
                       </m:sSub>
                       <m:r>
-                        <w:del w:id="442" w:author="Daniel Noble" w:date="2025-10-28T11:49:00Z" w16du:dateUtc="2025-10-28T00:49:00Z">
+                        <w:del w:id="443" w:author="Daniel Noble" w:date="2025-10-28T11:49:00Z" w16du:dateUtc="2025-10-28T00:49:00Z">
                           <m:rPr>
                             <m:sty m:val="p"/>
                           </m:rPr>
@@ -3778,7 +3696,7 @@
                       <m:sSub>
                         <m:sSubPr>
                           <m:ctrlPr>
-                            <w:del w:id="443" w:author="Daniel Noble" w:date="2025-10-28T11:49:00Z" w16du:dateUtc="2025-10-28T00:49:00Z">
+                            <w:del w:id="444" w:author="Daniel Noble" w:date="2025-10-28T11:49:00Z" w16du:dateUtc="2025-10-28T00:49:00Z">
                               <w:rPr>
                                 <w:rFonts w:ascii="Cambria Math" w:hAnsi="Cambria Math"/>
                               </w:rPr>
@@ -3787,7 +3705,7 @@
                         </m:sSubPr>
                         <m:e>
                           <m:r>
-                            <w:del w:id="444" w:author="Daniel Noble" w:date="2025-10-28T11:49:00Z" w16du:dateUtc="2025-10-28T00:49:00Z">
+                            <w:del w:id="445" w:author="Daniel Noble" w:date="2025-10-28T11:49:00Z" w16du:dateUtc="2025-10-28T00:49:00Z">
                               <w:rPr>
                                 <w:rFonts w:ascii="Cambria Math" w:hAnsi="Cambria Math"/>
                               </w:rPr>
@@ -3797,7 +3715,7 @@
                         </m:e>
                         <m:sub>
                           <m:r>
-                            <w:del w:id="445" w:author="Daniel Noble" w:date="2025-10-28T11:49:00Z" w16du:dateUtc="2025-10-28T00:49:00Z">
+                            <w:del w:id="446" w:author="Daniel Noble" w:date="2025-10-28T11:49:00Z" w16du:dateUtc="2025-10-28T00:49:00Z">
                               <w:rPr>
                                 <w:rFonts w:ascii="Cambria Math" w:hAnsi="Cambria Math"/>
                               </w:rPr>
@@ -3813,7 +3731,7 @@
                   <m:sSup>
                     <m:sSupPr>
                       <m:ctrlPr>
-                        <w:del w:id="446" w:author="Daniel Noble" w:date="2025-10-28T11:49:00Z" w16du:dateUtc="2025-10-28T00:49:00Z">
+                        <w:del w:id="447" w:author="Daniel Noble" w:date="2025-10-28T11:49:00Z" w16du:dateUtc="2025-10-28T00:49:00Z">
                           <w:rPr>
                             <w:rFonts w:ascii="Cambria Math" w:hAnsi="Cambria Math"/>
                           </w:rPr>
@@ -3822,7 +3740,7 @@
                     </m:sSupPr>
                     <m:e>
                       <m:r>
-                        <w:del w:id="447" w:author="Daniel Noble" w:date="2025-10-28T11:49:00Z" w16du:dateUtc="2025-10-28T00:49:00Z">
+                        <w:del w:id="448" w:author="Daniel Noble" w:date="2025-10-28T11:49:00Z" w16du:dateUtc="2025-10-28T00:49:00Z">
                           <w:rPr>
                             <w:rFonts w:ascii="Cambria Math" w:hAnsi="Cambria Math"/>
                           </w:rPr>
@@ -3834,7 +3752,7 @@
                       <m:d>
                         <m:dPr>
                           <m:ctrlPr>
-                            <w:del w:id="448" w:author="Daniel Noble" w:date="2025-10-28T11:49:00Z" w16du:dateUtc="2025-10-28T00:49:00Z">
+                            <w:del w:id="449" w:author="Daniel Noble" w:date="2025-10-28T11:49:00Z" w16du:dateUtc="2025-10-28T00:49:00Z">
                               <w:rPr>
                                 <w:rFonts w:ascii="Cambria Math" w:hAnsi="Cambria Math"/>
                               </w:rPr>
@@ -3843,7 +3761,7 @@
                         </m:dPr>
                         <m:e>
                           <m:r>
-                            <w:del w:id="449" w:author="Daniel Noble" w:date="2025-10-28T11:49:00Z" w16du:dateUtc="2025-10-28T00:49:00Z">
+                            <w:del w:id="450" w:author="Daniel Noble" w:date="2025-10-28T11:49:00Z" w16du:dateUtc="2025-10-28T00:49:00Z">
                               <m:rPr>
                                 <m:sty m:val="p"/>
                               </m:rPr>
@@ -3856,7 +3774,7 @@
                           <m:f>
                             <m:fPr>
                               <m:ctrlPr>
-                                <w:del w:id="450" w:author="Daniel Noble" w:date="2025-10-28T11:49:00Z" w16du:dateUtc="2025-10-28T00:49:00Z">
+                                <w:del w:id="451" w:author="Daniel Noble" w:date="2025-10-28T11:49:00Z" w16du:dateUtc="2025-10-28T00:49:00Z">
                                   <w:rPr>
                                     <w:rFonts w:ascii="Cambria Math" w:hAnsi="Cambria Math"/>
                                   </w:rPr>
@@ -3865,7 +3783,7 @@
                             </m:fPr>
                             <m:num>
                               <m:r>
-                                <w:del w:id="451" w:author="Daniel Noble" w:date="2025-10-28T11:49:00Z" w16du:dateUtc="2025-10-28T00:49:00Z">
+                                <w:del w:id="452" w:author="Daniel Noble" w:date="2025-10-28T11:49:00Z" w16du:dateUtc="2025-10-28T00:49:00Z">
                                   <w:rPr>
                                     <w:rFonts w:ascii="Cambria Math" w:hAnsi="Cambria Math"/>
                                   </w:rPr>
@@ -3875,7 +3793,7 @@
                             </m:num>
                             <m:den>
                               <m:r>
-                                <w:del w:id="452" w:author="Daniel Noble" w:date="2025-10-28T11:49:00Z" w16du:dateUtc="2025-10-28T00:49:00Z">
+                                <w:del w:id="453" w:author="Daniel Noble" w:date="2025-10-28T11:49:00Z" w16du:dateUtc="2025-10-28T00:49:00Z">
                                   <w:rPr>
                                     <w:rFonts w:ascii="Cambria Math" w:hAnsi="Cambria Math"/>
                                   </w:rPr>
@@ -3885,7 +3803,7 @@
                             </m:den>
                           </m:f>
                           <m:r>
-                            <w:del w:id="453" w:author="Daniel Noble" w:date="2025-10-28T11:49:00Z" w16du:dateUtc="2025-10-28T00:49:00Z">
+                            <w:del w:id="454" w:author="Daniel Noble" w:date="2025-10-28T11:49:00Z" w16du:dateUtc="2025-10-28T00:49:00Z">
                               <m:rPr>
                                 <m:sty m:val="p"/>
                               </m:rPr>
@@ -3896,7 +3814,7 @@
                             </w:del>
                           </m:r>
                           <m:r>
-                            <w:del w:id="454" w:author="Daniel Noble" w:date="2025-10-28T11:49:00Z" w16du:dateUtc="2025-10-28T00:49:00Z">
+                            <w:del w:id="455" w:author="Daniel Noble" w:date="2025-10-28T11:49:00Z" w16du:dateUtc="2025-10-28T00:49:00Z">
                               <w:rPr>
                                 <w:rFonts w:ascii="Cambria Math" w:hAnsi="Cambria Math"/>
                               </w:rPr>
@@ -3906,7 +3824,7 @@
                           <m:d>
                             <m:dPr>
                               <m:ctrlPr>
-                                <w:del w:id="455" w:author="Daniel Noble" w:date="2025-10-28T11:49:00Z" w16du:dateUtc="2025-10-28T00:49:00Z">
+                                <w:del w:id="456" w:author="Daniel Noble" w:date="2025-10-28T11:49:00Z" w16du:dateUtc="2025-10-28T00:49:00Z">
                                   <w:rPr>
                                     <w:rFonts w:ascii="Cambria Math" w:hAnsi="Cambria Math"/>
                                   </w:rPr>
@@ -3917,7 +3835,7 @@
                               <m:sSub>
                                 <m:sSubPr>
                                   <m:ctrlPr>
-                                    <w:del w:id="456" w:author="Daniel Noble" w:date="2025-10-28T11:49:00Z" w16du:dateUtc="2025-10-28T00:49:00Z">
+                                    <w:del w:id="457" w:author="Daniel Noble" w:date="2025-10-28T11:49:00Z" w16du:dateUtc="2025-10-28T00:49:00Z">
                                       <w:rPr>
                                         <w:rFonts w:ascii="Cambria Math" w:hAnsi="Cambria Math"/>
                                       </w:rPr>
@@ -3926,7 +3844,7 @@
                                 </m:sSubPr>
                                 <m:e>
                                   <m:r>
-                                    <w:del w:id="457" w:author="Daniel Noble" w:date="2025-10-28T11:49:00Z" w16du:dateUtc="2025-10-28T00:49:00Z">
+                                    <w:del w:id="458" w:author="Daniel Noble" w:date="2025-10-28T11:49:00Z" w16du:dateUtc="2025-10-28T00:49:00Z">
                                       <w:rPr>
                                         <w:rFonts w:ascii="Cambria Math" w:hAnsi="Cambria Math"/>
                                       </w:rPr>
@@ -3936,7 +3854,7 @@
                                 </m:e>
                                 <m:sub>
                                   <m:r>
-                                    <w:del w:id="458" w:author="Daniel Noble" w:date="2025-10-28T11:49:00Z" w16du:dateUtc="2025-10-28T00:49:00Z">
+                                    <w:del w:id="459" w:author="Daniel Noble" w:date="2025-10-28T11:49:00Z" w16du:dateUtc="2025-10-28T00:49:00Z">
                                       <w:rPr>
                                         <w:rFonts w:ascii="Cambria Math" w:hAnsi="Cambria Math"/>
                                       </w:rPr>
@@ -3946,7 +3864,7 @@
                                 </m:sub>
                               </m:sSub>
                               <m:r>
-                                <w:del w:id="459" w:author="Daniel Noble" w:date="2025-10-28T11:49:00Z" w16du:dateUtc="2025-10-28T00:49:00Z">
+                                <w:del w:id="460" w:author="Daniel Noble" w:date="2025-10-28T11:49:00Z" w16du:dateUtc="2025-10-28T00:49:00Z">
                                   <m:rPr>
                                     <m:sty m:val="p"/>
                                   </m:rPr>
@@ -3959,7 +3877,7 @@
                               <m:sSub>
                                 <m:sSubPr>
                                   <m:ctrlPr>
-                                    <w:del w:id="460" w:author="Daniel Noble" w:date="2025-10-28T11:49:00Z" w16du:dateUtc="2025-10-28T00:49:00Z">
+                                    <w:del w:id="461" w:author="Daniel Noble" w:date="2025-10-28T11:49:00Z" w16du:dateUtc="2025-10-28T00:49:00Z">
                                       <w:rPr>
                                         <w:rFonts w:ascii="Cambria Math" w:hAnsi="Cambria Math"/>
                                       </w:rPr>
@@ -3968,7 +3886,7 @@
                                 </m:sSubPr>
                                 <m:e>
                                   <m:r>
-                                    <w:del w:id="461" w:author="Daniel Noble" w:date="2025-10-28T11:49:00Z" w16du:dateUtc="2025-10-28T00:49:00Z">
+                                    <w:del w:id="462" w:author="Daniel Noble" w:date="2025-10-28T11:49:00Z" w16du:dateUtc="2025-10-28T00:49:00Z">
                                       <w:rPr>
                                         <w:rFonts w:ascii="Cambria Math" w:hAnsi="Cambria Math"/>
                                       </w:rPr>
@@ -3978,7 +3896,7 @@
                                 </m:e>
                                 <m:sub>
                                   <m:r>
-                                    <w:del w:id="462" w:author="Daniel Noble" w:date="2025-10-28T11:49:00Z" w16du:dateUtc="2025-10-28T00:49:00Z">
+                                    <w:del w:id="463" w:author="Daniel Noble" w:date="2025-10-28T11:49:00Z" w16du:dateUtc="2025-10-28T00:49:00Z">
                                       <w:rPr>
                                         <w:rFonts w:ascii="Cambria Math" w:hAnsi="Cambria Math"/>
                                       </w:rPr>
@@ -3986,7 +3904,7 @@
                                     </w:del>
                                   </m:r>
                                   <m:r>
-                                    <w:del w:id="463" w:author="Daniel Noble" w:date="2025-10-28T11:49:00Z" w16du:dateUtc="2025-10-28T00:49:00Z">
+                                    <w:del w:id="464" w:author="Daniel Noble" w:date="2025-10-28T11:49:00Z" w16du:dateUtc="2025-10-28T00:49:00Z">
                                       <m:rPr>
                                         <m:sty m:val="p"/>
                                       </m:rPr>
@@ -3997,7 +3915,7 @@
                                     </w:del>
                                   </m:r>
                                   <m:r>
-                                    <w:del w:id="464" w:author="Daniel Noble" w:date="2025-10-28T11:49:00Z" w16du:dateUtc="2025-10-28T00:49:00Z">
+                                    <w:del w:id="465" w:author="Daniel Noble" w:date="2025-10-28T11:49:00Z" w16du:dateUtc="2025-10-28T00:49:00Z">
                                       <w:rPr>
                                         <w:rFonts w:ascii="Cambria Math" w:hAnsi="Cambria Math"/>
                                       </w:rPr>
@@ -4009,7 +3927,7 @@
                             </m:e>
                           </m:d>
                           <m:r>
-                            <w:del w:id="465" w:author="Daniel Noble" w:date="2025-10-28T11:49:00Z" w16du:dateUtc="2025-10-28T00:49:00Z">
+                            <w:del w:id="466" w:author="Daniel Noble" w:date="2025-10-28T11:49:00Z" w16du:dateUtc="2025-10-28T00:49:00Z">
                               <m:rPr>
                                 <m:sty m:val="p"/>
                               </m:rPr>
@@ -4020,7 +3938,7 @@
                             </w:del>
                           </m:r>
                           <m:r>
-                            <w:del w:id="466" w:author="Daniel Noble" w:date="2025-10-28T11:49:00Z" w16du:dateUtc="2025-10-28T00:49:00Z">
+                            <w:del w:id="467" w:author="Daniel Noble" w:date="2025-10-28T11:49:00Z" w16du:dateUtc="2025-10-28T00:49:00Z">
                               <w:rPr>
                                 <w:rFonts w:ascii="Cambria Math" w:hAnsi="Cambria Math"/>
                               </w:rPr>
@@ -4036,7 +3954,7 @@
             </m:e>
           </m:nary>
           <m:r>
-            <w:del w:id="467" w:author="Daniel Noble" w:date="2025-10-28T11:49:00Z" w16du:dateUtc="2025-10-28T00:49:00Z">
+            <w:del w:id="468" w:author="Daniel Noble" w:date="2025-10-28T11:49:00Z" w16du:dateUtc="2025-10-28T00:49:00Z">
               <w:rPr>
                 <w:rFonts w:ascii="Cambria Math" w:hAnsi="Cambria Math"/>
               </w:rPr>
@@ -4046,7 +3964,7 @@
           <m:d>
             <m:dPr>
               <m:ctrlPr>
-                <w:del w:id="468" w:author="Daniel Noble" w:date="2025-10-28T11:49:00Z" w16du:dateUtc="2025-10-28T00:49:00Z">
+                <w:del w:id="469" w:author="Daniel Noble" w:date="2025-10-28T11:49:00Z" w16du:dateUtc="2025-10-28T00:49:00Z">
                   <w:rPr>
                     <w:rFonts w:ascii="Cambria Math" w:hAnsi="Cambria Math"/>
                   </w:rPr>
@@ -4055,7 +3973,7 @@
             </m:dPr>
             <m:e>
               <m:r>
-                <w:del w:id="469" w:author="Daniel Noble" w:date="2025-10-28T11:49:00Z" w16du:dateUtc="2025-10-28T00:49:00Z">
+                <w:del w:id="470" w:author="Daniel Noble" w:date="2025-10-28T11:49:00Z" w16du:dateUtc="2025-10-28T00:49:00Z">
                   <w:rPr>
                     <w:rFonts w:ascii="Cambria Math" w:hAnsi="Cambria Math"/>
                   </w:rPr>
@@ -4066,17 +3984,17 @@
           </m:d>
         </m:oMath>
       </m:oMathPara>
-      <w:bookmarkEnd w:id="419"/>
+      <w:bookmarkEnd w:id="420"/>
     </w:p>
     <w:p>
       <w:pPr>
         <w:pStyle w:val="FirstParagraph"/>
         <w:spacing w:line="360" w:lineRule="auto"/>
         <w:rPr>
-          <w:del w:id="470" w:author="Daniel Noble" w:date="2025-10-28T11:49:00Z" w16du:dateUtc="2025-10-28T00:49:00Z"/>
-        </w:rPr>
-      </w:pPr>
-      <w:del w:id="471" w:author="Daniel Noble" w:date="2025-10-28T11:49:00Z" w16du:dateUtc="2025-10-28T00:49:00Z">
+          <w:del w:id="471" w:author="Daniel Noble" w:date="2025-10-28T11:49:00Z" w16du:dateUtc="2025-10-28T00:49:00Z"/>
+        </w:rPr>
+      </w:pPr>
+      <w:del w:id="472" w:author="Daniel Noble" w:date="2025-10-28T11:49:00Z" w16du:dateUtc="2025-10-28T00:49:00Z">
         <w:r>
           <w:fldChar w:fldCharType="begin"/>
         </w:r>
@@ -4101,7 +4019,7 @@
       </w:del>
       <m:oMath>
         <m:r>
-          <w:del w:id="472" w:author="Daniel Noble" w:date="2025-10-28T11:49:00Z" w16du:dateUtc="2025-10-28T00:49:00Z">
+          <w:del w:id="473" w:author="Daniel Noble" w:date="2025-10-28T11:49:00Z" w16du:dateUtc="2025-10-28T00:49:00Z">
             <w:rPr>
               <w:rFonts w:ascii="Cambria Math" w:hAnsi="Cambria Math"/>
             </w:rPr>
@@ -4109,7 +4027,7 @@
           </w:del>
         </m:r>
       </m:oMath>
-      <w:del w:id="473" w:author="Daniel Noble" w:date="2025-10-28T11:49:00Z" w16du:dateUtc="2025-10-28T00:49:00Z">
+      <w:del w:id="474" w:author="Daniel Noble" w:date="2025-10-28T11:49:00Z" w16du:dateUtc="2025-10-28T00:49:00Z">
         <w:r>
           <w:delText xml:space="preserve">, during heat stress events (i.e., when body temperatures are greater than the critical temperatures, </w:delText>
         </w:r>
@@ -4118,7 +4036,7 @@
         <m:sSub>
           <m:sSubPr>
             <m:ctrlPr>
-              <w:del w:id="474" w:author="Daniel Noble" w:date="2025-10-28T11:49:00Z" w16du:dateUtc="2025-10-28T00:49:00Z">
+              <w:del w:id="475" w:author="Daniel Noble" w:date="2025-10-28T11:49:00Z" w16du:dateUtc="2025-10-28T00:49:00Z">
                 <w:rPr>
                   <w:rFonts w:ascii="Cambria Math" w:hAnsi="Cambria Math"/>
                 </w:rPr>
@@ -4127,7 +4045,7 @@
           </m:sSubPr>
           <m:e>
             <m:r>
-              <w:del w:id="475" w:author="Daniel Noble" w:date="2025-10-28T11:49:00Z" w16du:dateUtc="2025-10-28T00:49:00Z">
+              <w:del w:id="476" w:author="Daniel Noble" w:date="2025-10-28T11:49:00Z" w16du:dateUtc="2025-10-28T00:49:00Z">
                 <w:rPr>
                   <w:rFonts w:ascii="Cambria Math" w:hAnsi="Cambria Math"/>
                 </w:rPr>
@@ -4137,7 +4055,7 @@
           </m:e>
           <m:sub>
             <m:r>
-              <w:del w:id="476" w:author="Daniel Noble" w:date="2025-10-28T11:49:00Z" w16du:dateUtc="2025-10-28T00:49:00Z">
+              <w:del w:id="477" w:author="Daniel Noble" w:date="2025-10-28T11:49:00Z" w16du:dateUtc="2025-10-28T00:49:00Z">
                 <w:rPr>
                   <w:rFonts w:ascii="Cambria Math" w:hAnsi="Cambria Math"/>
                 </w:rPr>
@@ -4147,7 +4065,7 @@
           </m:sub>
         </m:sSub>
         <m:r>
-          <w:del w:id="477" w:author="Daniel Noble" w:date="2025-10-28T11:49:00Z" w16du:dateUtc="2025-10-28T00:49:00Z">
+          <w:del w:id="478" w:author="Daniel Noble" w:date="2025-10-28T11:49:00Z" w16du:dateUtc="2025-10-28T00:49:00Z">
             <m:rPr>
               <m:sty m:val="p"/>
             </m:rPr>
@@ -4160,7 +4078,7 @@
         <m:sSub>
           <m:sSubPr>
             <m:ctrlPr>
-              <w:del w:id="478" w:author="Daniel Noble" w:date="2025-10-28T11:49:00Z" w16du:dateUtc="2025-10-28T00:49:00Z">
+              <w:del w:id="479" w:author="Daniel Noble" w:date="2025-10-28T11:49:00Z" w16du:dateUtc="2025-10-28T00:49:00Z">
                 <w:rPr>
                   <w:rFonts w:ascii="Cambria Math" w:hAnsi="Cambria Math"/>
                 </w:rPr>
@@ -4169,7 +4087,7 @@
           </m:sSubPr>
           <m:e>
             <m:r>
-              <w:del w:id="479" w:author="Daniel Noble" w:date="2025-10-28T11:49:00Z" w16du:dateUtc="2025-10-28T00:49:00Z">
+              <w:del w:id="480" w:author="Daniel Noble" w:date="2025-10-28T11:49:00Z" w16du:dateUtc="2025-10-28T00:49:00Z">
                 <w:rPr>
                   <w:rFonts w:ascii="Cambria Math" w:hAnsi="Cambria Math"/>
                 </w:rPr>
@@ -4179,7 +4097,7 @@
           </m:e>
           <m:sub>
             <m:r>
-              <w:del w:id="480" w:author="Daniel Noble" w:date="2025-10-28T11:49:00Z" w16du:dateUtc="2025-10-28T00:49:00Z">
+              <w:del w:id="481" w:author="Daniel Noble" w:date="2025-10-28T11:49:00Z" w16du:dateUtc="2025-10-28T00:49:00Z">
                 <w:rPr>
                   <w:rFonts w:ascii="Cambria Math" w:hAnsi="Cambria Math"/>
                 </w:rPr>
@@ -4189,14 +4107,14 @@
           </m:sub>
         </m:sSub>
       </m:oMath>
-      <w:del w:id="481" w:author="Daniel Noble" w:date="2025-10-28T11:49:00Z" w16du:dateUtc="2025-10-28T00:49:00Z">
+      <w:del w:id="482" w:author="Daniel Noble" w:date="2025-10-28T11:49:00Z" w16du:dateUtc="2025-10-28T00:49:00Z">
         <w:r>
           <w:delText xml:space="preserve">) using information about the maximum temperature, </w:delText>
         </w:r>
       </w:del>
       <m:oMath>
         <m:r>
-          <w:del w:id="482" w:author="Daniel Noble" w:date="2025-10-28T11:49:00Z" w16du:dateUtc="2025-10-28T00:49:00Z">
+          <w:del w:id="483" w:author="Daniel Noble" w:date="2025-10-28T11:49:00Z" w16du:dateUtc="2025-10-28T00:49:00Z">
             <w:rPr>
               <w:rFonts w:ascii="Cambria Math" w:hAnsi="Cambria Math"/>
             </w:rPr>
@@ -4204,7 +4122,7 @@
           </w:del>
         </m:r>
       </m:oMath>
-      <w:del w:id="483" w:author="Daniel Noble" w:date="2025-10-28T11:49:00Z" w16du:dateUtc="2025-10-28T00:49:00Z">
+      <w:del w:id="484" w:author="Daniel Noble" w:date="2025-10-28T11:49:00Z" w16du:dateUtc="2025-10-28T00:49:00Z">
         <w:r>
           <w:delText xml:space="preserve">, experienced between time point </w:delText>
         </w:r>
@@ -4213,7 +4131,7 @@
         <m:sSub>
           <m:sSubPr>
             <m:ctrlPr>
-              <w:del w:id="484" w:author="Daniel Noble" w:date="2025-10-28T11:49:00Z" w16du:dateUtc="2025-10-28T00:49:00Z">
+              <w:del w:id="485" w:author="Daniel Noble" w:date="2025-10-28T11:49:00Z" w16du:dateUtc="2025-10-28T00:49:00Z">
                 <w:rPr>
                   <w:rFonts w:ascii="Cambria Math" w:hAnsi="Cambria Math"/>
                 </w:rPr>
@@ -4222,7 +4140,7 @@
           </m:sSubPr>
           <m:e>
             <m:r>
-              <w:del w:id="485" w:author="Daniel Noble" w:date="2025-10-28T11:49:00Z" w16du:dateUtc="2025-10-28T00:49:00Z">
+              <w:del w:id="486" w:author="Daniel Noble" w:date="2025-10-28T11:49:00Z" w16du:dateUtc="2025-10-28T00:49:00Z">
                 <w:rPr>
                   <w:rFonts w:ascii="Cambria Math" w:hAnsi="Cambria Math"/>
                 </w:rPr>
@@ -4232,7 +4150,7 @@
           </m:e>
           <m:sub>
             <m:r>
-              <w:del w:id="486" w:author="Daniel Noble" w:date="2025-10-28T11:49:00Z" w16du:dateUtc="2025-10-28T00:49:00Z">
+              <w:del w:id="487" w:author="Daniel Noble" w:date="2025-10-28T11:49:00Z" w16du:dateUtc="2025-10-28T00:49:00Z">
                 <w:rPr>
                   <w:rFonts w:ascii="Cambria Math" w:hAnsi="Cambria Math"/>
                 </w:rPr>
@@ -4242,7 +4160,7 @@
           </m:sub>
         </m:sSub>
       </m:oMath>
-      <w:del w:id="487" w:author="Daniel Noble" w:date="2025-10-28T11:49:00Z" w16du:dateUtc="2025-10-28T00:49:00Z">
+      <w:del w:id="488" w:author="Daniel Noble" w:date="2025-10-28T11:49:00Z" w16du:dateUtc="2025-10-28T00:49:00Z">
         <w:r>
           <w:delText xml:space="preserve"> and </w:delText>
         </w:r>
@@ -4251,7 +4169,7 @@
         <m:sSub>
           <m:sSubPr>
             <m:ctrlPr>
-              <w:del w:id="488" w:author="Daniel Noble" w:date="2025-10-28T11:49:00Z" w16du:dateUtc="2025-10-28T00:49:00Z">
+              <w:del w:id="489" w:author="Daniel Noble" w:date="2025-10-28T11:49:00Z" w16du:dateUtc="2025-10-28T00:49:00Z">
                 <w:rPr>
                   <w:rFonts w:ascii="Cambria Math" w:hAnsi="Cambria Math"/>
                 </w:rPr>
@@ -4260,7 +4178,7 @@
           </m:sSubPr>
           <m:e>
             <m:r>
-              <w:del w:id="489" w:author="Daniel Noble" w:date="2025-10-28T11:49:00Z" w16du:dateUtc="2025-10-28T00:49:00Z">
+              <w:del w:id="490" w:author="Daniel Noble" w:date="2025-10-28T11:49:00Z" w16du:dateUtc="2025-10-28T00:49:00Z">
                 <w:rPr>
                   <w:rFonts w:ascii="Cambria Math" w:hAnsi="Cambria Math"/>
                 </w:rPr>
@@ -4270,7 +4188,7 @@
           </m:e>
           <m:sub>
             <m:r>
-              <w:del w:id="490" w:author="Daniel Noble" w:date="2025-10-28T11:49:00Z" w16du:dateUtc="2025-10-28T00:49:00Z">
+              <w:del w:id="491" w:author="Daniel Noble" w:date="2025-10-28T11:49:00Z" w16du:dateUtc="2025-10-28T00:49:00Z">
                 <w:rPr>
                   <w:rFonts w:ascii="Cambria Math" w:hAnsi="Cambria Math"/>
                 </w:rPr>
@@ -4278,7 +4196,7 @@
               </w:del>
             </m:r>
             <m:r>
-              <w:del w:id="491" w:author="Daniel Noble" w:date="2025-10-28T11:49:00Z" w16du:dateUtc="2025-10-28T00:49:00Z">
+              <w:del w:id="492" w:author="Daniel Noble" w:date="2025-10-28T11:49:00Z" w16du:dateUtc="2025-10-28T00:49:00Z">
                 <m:rPr>
                   <m:sty m:val="p"/>
                 </m:rPr>
@@ -4289,7 +4207,7 @@
               </w:del>
             </m:r>
             <m:r>
-              <w:del w:id="492" w:author="Daniel Noble" w:date="2025-10-28T11:49:00Z" w16du:dateUtc="2025-10-28T00:49:00Z">
+              <w:del w:id="493" w:author="Daniel Noble" w:date="2025-10-28T11:49:00Z" w16du:dateUtc="2025-10-28T00:49:00Z">
                 <w:rPr>
                   <w:rFonts w:ascii="Cambria Math" w:hAnsi="Cambria Math"/>
                 </w:rPr>
@@ -4299,14 +4217,14 @@
           </m:sub>
         </m:sSub>
       </m:oMath>
-      <w:del w:id="493" w:author="Daniel Noble" w:date="2025-10-28T11:49:00Z" w16du:dateUtc="2025-10-28T00:49:00Z">
+      <w:del w:id="494" w:author="Daniel Noble" w:date="2025-10-28T11:49:00Z" w16du:dateUtc="2025-10-28T00:49:00Z">
         <w:r>
           <w:delText xml:space="preserve"> and the thermal sensitivity (i.e., </w:delText>
         </w:r>
       </w:del>
       <m:oMath>
         <m:r>
-          <w:del w:id="494" w:author="Daniel Noble" w:date="2025-10-28T11:49:00Z" w16du:dateUtc="2025-10-28T00:49:00Z">
+          <w:del w:id="495" w:author="Daniel Noble" w:date="2025-10-28T11:49:00Z" w16du:dateUtc="2025-10-28T00:49:00Z">
             <w:rPr>
               <w:rFonts w:ascii="Cambria Math" w:hAnsi="Cambria Math"/>
             </w:rPr>
@@ -4314,14 +4232,14 @@
           </w:del>
         </m:r>
       </m:oMath>
-      <w:del w:id="495" w:author="Daniel Noble" w:date="2025-10-28T11:49:00Z" w16du:dateUtc="2025-10-28T00:49:00Z">
+      <w:del w:id="496" w:author="Daniel Noble" w:date="2025-10-28T11:49:00Z" w16du:dateUtc="2025-10-28T00:49:00Z">
         <w:r>
           <w:delText xml:space="preserve"> and </w:delText>
         </w:r>
       </w:del>
       <m:oMath>
         <m:r>
-          <w:del w:id="496" w:author="Daniel Noble" w:date="2025-10-28T11:49:00Z" w16du:dateUtc="2025-10-28T00:49:00Z">
+          <w:del w:id="497" w:author="Daniel Noble" w:date="2025-10-28T11:49:00Z" w16du:dateUtc="2025-10-28T00:49:00Z">
             <w:rPr>
               <w:rFonts w:ascii="Cambria Math" w:hAnsi="Cambria Math"/>
             </w:rPr>
@@ -4329,7 +4247,7 @@
           </w:del>
         </m:r>
       </m:oMath>
-      <w:del w:id="497" w:author="Daniel Noble" w:date="2025-10-28T11:49:00Z" w16du:dateUtc="2025-10-28T00:49:00Z">
+      <w:del w:id="498" w:author="Daniel Noble" w:date="2025-10-28T11:49:00Z" w16du:dateUtc="2025-10-28T00:49:00Z">
         <w:r>
           <w:delText xml:space="preserve">). Once an organism accumulates damage to reach a given threshold the endpoint has been reached. Arnold </w:delText>
         </w:r>
@@ -4350,7 +4268,7 @@
         <w:pStyle w:val="BodyText"/>
         <w:spacing w:line="360" w:lineRule="auto"/>
       </w:pPr>
-      <w:del w:id="498" w:author="Daniel Noble" w:date="2025-10-28T11:49:00Z" w16du:dateUtc="2025-10-28T00:49:00Z">
+      <w:del w:id="499" w:author="Daniel Noble" w:date="2025-10-28T11:49:00Z" w16du:dateUtc="2025-10-28T00:49:00Z">
         <w:r>
           <w:delText>Environmental factors that impact thermal sensitivity can also be incorporated into TLS models (</w:delText>
         </w:r>
@@ -4421,10 +4339,10 @@
               <w:pStyle w:val="BodyText"/>
               <w:spacing w:before="16" w:line="360" w:lineRule="auto"/>
               <w:rPr>
-                <w:del w:id="499" w:author="Daniel Noble" w:date="2025-10-28T11:50:00Z" w16du:dateUtc="2025-10-28T00:50:00Z"/>
+                <w:del w:id="500" w:author="Daniel Noble" w:date="2025-10-28T11:50:00Z" w16du:dateUtc="2025-10-28T00:50:00Z"/>
               </w:rPr>
             </w:pPr>
-            <w:del w:id="500" w:author="Daniel Noble" w:date="2025-10-28T11:50:00Z" w16du:dateUtc="2025-10-28T00:50:00Z">
+            <w:del w:id="501" w:author="Daniel Noble" w:date="2025-10-28T11:50:00Z" w16du:dateUtc="2025-10-28T00:50:00Z">
               <w:r>
                 <w:delText>Natural and anthropogenic environments shape thermal sensitivity and should be considered in any systems modelling approach to assessing community responses to extreme heat [20]. Some of the biotic and abiotic interactions likely to mediate plant and animal community responses include:</w:delText>
               </w:r>
@@ -4435,10 +4353,10 @@
               <w:pStyle w:val="BodyText"/>
               <w:spacing w:line="360" w:lineRule="auto"/>
               <w:rPr>
-                <w:del w:id="501" w:author="Daniel Noble" w:date="2025-10-28T11:50:00Z" w16du:dateUtc="2025-10-28T00:50:00Z"/>
+                <w:del w:id="502" w:author="Daniel Noble" w:date="2025-10-28T11:50:00Z" w16du:dateUtc="2025-10-28T00:50:00Z"/>
               </w:rPr>
             </w:pPr>
-            <w:del w:id="502" w:author="Daniel Noble" w:date="2025-10-28T11:50:00Z" w16du:dateUtc="2025-10-28T00:50:00Z">
+            <w:del w:id="503" w:author="Daniel Noble" w:date="2025-10-28T11:50:00Z" w16du:dateUtc="2025-10-28T00:50:00Z">
               <w:r>
                 <w:rPr>
                   <w:b/>
@@ -4518,10 +4436,10 @@
               <w:pStyle w:val="BodyText"/>
               <w:spacing w:line="360" w:lineRule="auto"/>
               <w:rPr>
-                <w:del w:id="503" w:author="Daniel Noble" w:date="2025-10-28T11:50:00Z" w16du:dateUtc="2025-10-28T00:50:00Z"/>
+                <w:del w:id="504" w:author="Daniel Noble" w:date="2025-10-28T11:50:00Z" w16du:dateUtc="2025-10-28T00:50:00Z"/>
               </w:rPr>
             </w:pPr>
-            <w:del w:id="504" w:author="Daniel Noble" w:date="2025-10-28T11:50:00Z" w16du:dateUtc="2025-10-28T00:50:00Z">
+            <w:del w:id="505" w:author="Daniel Noble" w:date="2025-10-28T11:50:00Z" w16du:dateUtc="2025-10-28T00:50:00Z">
               <w:r>
                 <w:rPr>
                   <w:b/>
@@ -4581,10 +4499,10 @@
               <w:pStyle w:val="BodyText"/>
               <w:spacing w:line="360" w:lineRule="auto"/>
               <w:rPr>
-                <w:del w:id="505" w:author="Daniel Noble" w:date="2025-10-28T11:50:00Z" w16du:dateUtc="2025-10-28T00:50:00Z"/>
+                <w:del w:id="506" w:author="Daniel Noble" w:date="2025-10-28T11:50:00Z" w16du:dateUtc="2025-10-28T00:50:00Z"/>
               </w:rPr>
             </w:pPr>
-            <w:del w:id="506" w:author="Daniel Noble" w:date="2025-10-28T11:50:00Z" w16du:dateUtc="2025-10-28T00:50:00Z">
+            <w:del w:id="507" w:author="Daniel Noble" w:date="2025-10-28T11:50:00Z" w16du:dateUtc="2025-10-28T00:50:00Z">
               <w:r>
                 <w:rPr>
                   <w:b/>
@@ -4664,20 +4582,20 @@
               <w:pStyle w:val="BodyText"/>
               <w:spacing w:line="360" w:lineRule="auto"/>
               <w:rPr>
-                <w:del w:id="507" w:author="Daniel Noble" w:date="2025-10-28T11:50:00Z" w16du:dateUtc="2025-10-28T00:50:00Z"/>
+                <w:del w:id="508" w:author="Daniel Noble" w:date="2025-10-28T11:50:00Z" w16du:dateUtc="2025-10-28T00:50:00Z"/>
               </w:rPr>
             </w:pPr>
-            <w:del w:id="508" w:author="Daniel Noble" w:date="2025-10-28T11:50:00Z" w16du:dateUtc="2025-10-28T00:50:00Z">
+            <w:del w:id="509" w:author="Daniel Noble" w:date="2025-10-28T11:50:00Z" w16du:dateUtc="2025-10-28T00:50:00Z">
               <w:r>
                 <w:delText xml:space="preserve">The above list is not exhaustive. Many environmental stressors, such as pollution and salinity, along with interactions between environmental stressors and cross-trophic interactions among species exposed to those stressors can also impact thermal sensitivity </w:delText>
               </w:r>
             </w:del>
-            <w:del w:id="509" w:author="Daniel Noble" w:date="2025-10-18T11:00:00Z" w16du:dateUtc="2025-10-18T00:00:00Z">
+            <w:del w:id="510" w:author="Daniel Noble" w:date="2025-10-18T11:00:00Z" w16du:dateUtc="2025-10-18T00:00:00Z">
               <w:r>
                 <w:delText xml:space="preserve">can also impact thermal sensitivity </w:delText>
               </w:r>
             </w:del>
-            <w:del w:id="510" w:author="Daniel Noble" w:date="2025-10-28T11:50:00Z" w16du:dateUtc="2025-10-28T00:50:00Z">
+            <w:del w:id="511" w:author="Daniel Noble" w:date="2025-10-28T11:50:00Z" w16du:dateUtc="2025-10-28T00:50:00Z">
               <w:r>
                 <w:delText>[20,54]. The point we make here is that to fully model heat sensitivity, it is important to account for the abiotic and biotic environment in which an organism experiences heat stress where possible.</w:delText>
               </w:r>
@@ -4695,7 +4613,7 @@
             </w:tblGrid>
             <w:tr>
               <w:trPr>
-                <w:del w:id="511" w:author="Daniel Noble" w:date="2025-10-28T11:50:00Z" w16du:dateUtc="2025-10-28T00:50:00Z"/>
+                <w:del w:id="512" w:author="Daniel Noble" w:date="2025-10-28T11:50:00Z"/>
               </w:trPr>
               <w:tc>
                 <w:tcPr>
@@ -4707,11 +4625,11 @@
                     <w:spacing w:line="360" w:lineRule="auto"/>
                     <w:jc w:val="center"/>
                     <w:rPr>
-                      <w:del w:id="512" w:author="Daniel Noble" w:date="2025-10-28T11:50:00Z" w16du:dateUtc="2025-10-28T00:50:00Z"/>
+                      <w:del w:id="513" w:author="Daniel Noble" w:date="2025-10-28T11:50:00Z" w16du:dateUtc="2025-10-28T00:50:00Z"/>
                     </w:rPr>
                   </w:pPr>
-                  <w:bookmarkStart w:id="513" w:name="fig-box1"/>
-                  <w:del w:id="514" w:author="Daniel Noble" w:date="2025-10-28T11:50:00Z" w16du:dateUtc="2025-10-28T00:50:00Z">
+                  <w:bookmarkStart w:id="514" w:name="fig-box1"/>
+                  <w:del w:id="515" w:author="Daniel Noble" w:date="2025-10-28T11:50:00Z" w16du:dateUtc="2025-10-28T00:50:00Z">
                     <w:r>
                       <w:rPr>
                         <w:noProof/>
@@ -4765,10 +4683,10 @@
                     <w:pStyle w:val="ImageCaption"/>
                     <w:spacing w:before="200" w:line="360" w:lineRule="auto"/>
                     <w:rPr>
-                      <w:del w:id="515" w:author="Daniel Noble" w:date="2025-10-28T11:50:00Z" w16du:dateUtc="2025-10-28T00:50:00Z"/>
+                      <w:del w:id="516" w:author="Daniel Noble" w:date="2025-10-28T11:50:00Z" w16du:dateUtc="2025-10-28T00:50:00Z"/>
                     </w:rPr>
                   </w:pPr>
-                  <w:del w:id="516" w:author="Daniel Noble" w:date="2025-10-28T11:50:00Z" w16du:dateUtc="2025-10-28T00:50:00Z">
+                  <w:del w:id="517" w:author="Daniel Noble" w:date="2025-10-28T11:50:00Z" w16du:dateUtc="2025-10-28T00:50:00Z">
                     <w:r>
                       <w:rPr>
                         <w:b/>
@@ -4792,12 +4710,12 @@
                   </w:del>
                 </w:p>
               </w:tc>
-              <w:bookmarkEnd w:id="513"/>
+              <w:bookmarkEnd w:id="514"/>
             </w:tr>
           </w:tbl>
           <w:p>
             <w:pPr>
-              <w:spacing w:after="0" w:line="360" w:lineRule="auto"/>
+              <w:spacing w:line="360" w:lineRule="auto"/>
             </w:pPr>
           </w:p>
         </w:tc>
@@ -4869,7 +4787,7 @@
             <w:r>
               <w:t xml:space="preserve">: Coexistence occurs when </w:t>
             </w:r>
-            <w:del w:id="517" w:author="Daniel Noble" w:date="2025-10-18T11:04:00Z" w16du:dateUtc="2025-10-18T00:04:00Z">
+            <w:del w:id="518" w:author="Daniel Noble" w:date="2025-10-18T11:04:00Z" w16du:dateUtc="2025-10-18T00:04:00Z">
               <w:r>
                 <w:delText xml:space="preserve">two </w:delText>
               </w:r>
@@ -4877,7 +4795,7 @@
             <w:r>
               <w:t xml:space="preserve">populations of two </w:t>
             </w:r>
-            <w:ins w:id="518" w:author="Daniel Noble" w:date="2025-10-18T11:04:00Z" w16du:dateUtc="2025-10-18T00:04:00Z">
+            <w:ins w:id="519" w:author="Daniel Noble" w:date="2025-10-18T11:04:00Z" w16du:dateUtc="2025-10-18T00:04:00Z">
               <w:r>
                 <w:t xml:space="preserve">or more </w:t>
               </w:r>
@@ -4885,87 +4803,87 @@
             <w:r>
               <w:t xml:space="preserve">species are able to persist in each other’s presence indefinitely under constant, equilibrium conditions. </w:t>
             </w:r>
-            <w:del w:id="519" w:author="Daniel Noble" w:date="2025-10-28T14:42:00Z" w16du:dateUtc="2025-10-28T03:42:00Z">
+            <w:del w:id="520" w:author="Daniel Noble" w:date="2025-10-28T14:42:00Z" w16du:dateUtc="2025-10-28T03:42:00Z">
               <w:r>
                 <w:delText xml:space="preserve">Coexistence can be defined by differences in how species compete or through the ability of species to invade environments successfully when the other species </w:delText>
               </w:r>
             </w:del>
-            <w:del w:id="520" w:author="Daniel Noble" w:date="2025-10-18T11:05:00Z" w16du:dateUtc="2025-10-18T00:05:00Z">
+            <w:del w:id="521" w:author="Daniel Noble" w:date="2025-10-18T11:05:00Z" w16du:dateUtc="2025-10-18T00:05:00Z">
               <w:r>
                 <w:delText xml:space="preserve">is </w:delText>
               </w:r>
             </w:del>
-            <w:del w:id="521" w:author="Daniel Noble" w:date="2025-10-28T14:42:00Z" w16du:dateUtc="2025-10-28T03:42:00Z">
+            <w:del w:id="522" w:author="Daniel Noble" w:date="2025-10-28T14:42:00Z" w16du:dateUtc="2025-10-28T03:42:00Z">
               <w:r>
                 <w:delText xml:space="preserve">present at low abundances. </w:delText>
               </w:r>
             </w:del>
-            <w:del w:id="522" w:author="Daniel Noble" w:date="2025-10-18T11:04:00Z" w16du:dateUtc="2025-10-18T00:04:00Z">
+            <w:del w:id="523" w:author="Daniel Noble" w:date="2025-10-18T11:04:00Z" w16du:dateUtc="2025-10-18T00:04:00Z">
               <w:r>
                 <w:delText xml:space="preserve">The majority of known models of coexistence rely on equilibrium conditions. </w:delText>
               </w:r>
             </w:del>
-            <w:del w:id="523" w:author="Daniel Noble" w:date="2025-10-18T11:03:00Z" w16du:dateUtc="2025-10-18T00:03:00Z">
+            <w:del w:id="524" w:author="Daniel Noble" w:date="2025-10-18T11:03:00Z" w16du:dateUtc="2025-10-18T00:03:00Z">
               <w:r>
                 <w:delText xml:space="preserve">A condition at odds with extreme heat events and directional climate change. </w:delText>
               </w:r>
             </w:del>
-            <w:del w:id="524" w:author="Daniel Noble" w:date="2025-10-18T11:04:00Z" w16du:dateUtc="2025-10-18T00:04:00Z">
+            <w:del w:id="525" w:author="Daniel Noble" w:date="2025-10-18T11:04:00Z" w16du:dateUtc="2025-10-18T00:04:00Z">
               <w:r>
                 <w:delText>However, the emphasis of m</w:delText>
               </w:r>
             </w:del>
-            <w:del w:id="525" w:author="Daniel Noble" w:date="2025-10-28T14:42:00Z" w16du:dateUtc="2025-10-28T03:42:00Z">
+            <w:del w:id="526" w:author="Daniel Noble" w:date="2025-10-28T14:42:00Z" w16du:dateUtc="2025-10-28T03:42:00Z">
               <w:r>
                 <w:delText xml:space="preserve">any coexistence models </w:delText>
               </w:r>
             </w:del>
-            <w:del w:id="526" w:author="Daniel Noble" w:date="2025-10-18T11:04:00Z" w16du:dateUtc="2025-10-18T00:04:00Z">
+            <w:del w:id="527" w:author="Daniel Noble" w:date="2025-10-18T11:04:00Z" w16du:dateUtc="2025-10-18T00:04:00Z">
               <w:r>
                 <w:delText xml:space="preserve">on the </w:delText>
               </w:r>
             </w:del>
-            <w:del w:id="527" w:author="Daniel Noble" w:date="2025-10-28T14:42:00Z" w16du:dateUtc="2025-10-28T03:42:00Z">
+            <w:del w:id="528" w:author="Daniel Noble" w:date="2025-10-28T14:42:00Z" w16du:dateUtc="2025-10-28T03:42:00Z">
               <w:r>
                 <w:delText xml:space="preserve">importance of species interactions in variable environments </w:delText>
               </w:r>
             </w:del>
-            <w:del w:id="528" w:author="Daniel Noble" w:date="2025-10-18T11:04:00Z" w16du:dateUtc="2025-10-18T00:04:00Z">
+            <w:del w:id="529" w:author="Daniel Noble" w:date="2025-10-18T11:04:00Z" w16du:dateUtc="2025-10-18T00:04:00Z">
               <w:r>
                 <w:delText xml:space="preserve">makes </w:delText>
               </w:r>
             </w:del>
-            <w:del w:id="529" w:author="Daniel Noble" w:date="2025-10-28T14:42:00Z" w16du:dateUtc="2025-10-28T03:42:00Z">
+            <w:del w:id="530" w:author="Daniel Noble" w:date="2025-10-28T14:42:00Z" w16du:dateUtc="2025-10-28T03:42:00Z">
               <w:r>
                 <w:delText xml:space="preserve">coexistence </w:delText>
               </w:r>
             </w:del>
-            <w:del w:id="530" w:author="Daniel Noble" w:date="2025-10-18T11:05:00Z" w16du:dateUtc="2025-10-18T00:05:00Z">
+            <w:del w:id="531" w:author="Daniel Noble" w:date="2025-10-18T11:05:00Z" w16du:dateUtc="2025-10-18T00:05:00Z">
               <w:r>
                 <w:delText xml:space="preserve">models and associated </w:delText>
               </w:r>
             </w:del>
-            <w:del w:id="531" w:author="Daniel Noble" w:date="2025-10-28T14:42:00Z" w16du:dateUtc="2025-10-28T03:42:00Z">
+            <w:del w:id="532" w:author="Daniel Noble" w:date="2025-10-28T14:42:00Z" w16du:dateUtc="2025-10-28T03:42:00Z">
               <w:r>
                 <w:delText xml:space="preserve">frameworks for </w:delText>
               </w:r>
             </w:del>
-            <w:del w:id="532" w:author="Daniel Noble" w:date="2025-10-18T11:06:00Z" w16du:dateUtc="2025-10-18T00:06:00Z">
+            <w:del w:id="533" w:author="Daniel Noble" w:date="2025-10-18T11:06:00Z" w16du:dateUtc="2025-10-18T00:06:00Z">
               <w:r>
                 <w:delText xml:space="preserve">understanding community assembly and diversity maintenance </w:delText>
               </w:r>
             </w:del>
-            <w:del w:id="533" w:author="Daniel Noble" w:date="2025-10-18T11:04:00Z" w16du:dateUtc="2025-10-18T00:04:00Z">
+            <w:del w:id="534" w:author="Daniel Noble" w:date="2025-10-18T11:04:00Z" w16du:dateUtc="2025-10-18T00:04:00Z">
               <w:r>
                 <w:delText xml:space="preserve">are potentially </w:delText>
               </w:r>
             </w:del>
-            <w:del w:id="534" w:author="Daniel Noble" w:date="2025-10-18T11:06:00Z" w16du:dateUtc="2025-10-18T00:06:00Z">
+            <w:del w:id="535" w:author="Daniel Noble" w:date="2025-10-18T11:06:00Z" w16du:dateUtc="2025-10-18T00:06:00Z">
               <w:r>
                 <w:delText xml:space="preserve">useful for exploring </w:delText>
               </w:r>
             </w:del>
-            <w:del w:id="535" w:author="Daniel Noble" w:date="2025-10-28T14:42:00Z" w16du:dateUtc="2025-10-28T03:42:00Z">
+            <w:del w:id="536" w:author="Daniel Noble" w:date="2025-10-28T14:42:00Z" w16du:dateUtc="2025-10-28T03:42:00Z">
               <w:r>
                 <w:delText>whole community responses to extreme events.</w:delText>
               </w:r>
@@ -5032,8 +4950,7 @@
               <w:pStyle w:val="BodyText"/>
               <w:spacing w:line="360" w:lineRule="auto"/>
               <w:rPr>
-                <w:ins w:id="536" w:author="Daniel Noble" w:date="2025-10-27T11:44:00Z"/>
-                <w:lang w:val="en-AU"/>
+                <w:ins w:id="537" w:author="Daniel Noble" w:date="2025-10-27T11:44:00Z"/>
               </w:rPr>
             </w:pPr>
             <w:r>
@@ -5043,7 +4960,7 @@
               </w:rPr>
               <w:t xml:space="preserve">Thermal load sensitivity (TLS) </w:t>
             </w:r>
-            <w:ins w:id="537" w:author="Daniel Noble" w:date="2025-10-27T11:42:00Z" w16du:dateUtc="2025-10-27T00:42:00Z">
+            <w:ins w:id="538" w:author="Daniel Noble" w:date="2025-10-27T11:42:00Z" w16du:dateUtc="2025-10-27T00:42:00Z">
               <w:r>
                 <w:rPr>
                   <w:b/>
@@ -5062,11 +4979,8 @@
             <w:r>
               <w:t xml:space="preserve">: </w:t>
             </w:r>
-            <w:ins w:id="538" w:author="Daniel Noble" w:date="2025-10-27T11:44:00Z">
-              <w:r>
-                <w:rPr>
-                  <w:lang w:val="en-AU"/>
-                </w:rPr>
+            <w:ins w:id="539" w:author="Daniel Noble" w:date="2025-10-27T11:44:00Z">
+              <w:r>
                 <w:t xml:space="preserve">Models that use biophysical models to predict organism temperature and calculate thermal load that captures lethal and sublethal impacts on tissues, organs and whole organisms. </w:t>
               </w:r>
             </w:ins>
@@ -5076,10 +4990,10 @@
               <w:pStyle w:val="BodyText"/>
               <w:spacing w:line="360" w:lineRule="auto"/>
               <w:rPr>
-                <w:del w:id="539" w:author="Daniel Noble" w:date="2025-10-27T11:44:00Z" w16du:dateUtc="2025-10-27T00:44:00Z"/>
+                <w:del w:id="540" w:author="Daniel Noble" w:date="2025-10-27T11:44:00Z" w16du:dateUtc="2025-10-27T00:44:00Z"/>
               </w:rPr>
             </w:pPr>
-            <w:del w:id="540" w:author="Daniel Noble" w:date="2025-10-27T11:44:00Z" w16du:dateUtc="2025-10-27T00:44:00Z">
+            <w:del w:id="541" w:author="Daniel Noble" w:date="2025-10-27T11:44:00Z" w16du:dateUtc="2025-10-27T00:44:00Z">
               <w:r>
                 <w:delText>Models that use biophysical principles to quantify thermal exposure and thermal load and integrate them with physiological models that capture the dynamics of damage and repair processes in driving lethal and sublethal impacts on tissues, organs and whole organisms.</w:delText>
               </w:r>
@@ -5109,7 +5023,7 @@
         <w:pStyle w:val="Heading1"/>
         <w:spacing w:line="360" w:lineRule="auto"/>
       </w:pPr>
-      <w:bookmarkStart w:id="541" w:name="Xa42fff9f9b55ab8c457a10a6df2c5c7c3edac3c"/>
+      <w:bookmarkStart w:id="542" w:name="Xa42fff9f9b55ab8c457a10a6df2c5c7c3edac3c"/>
       <w:bookmarkEnd w:id="402"/>
       <w:r>
         <w:t>Physiological models that capture the effects of extreme heat across life</w:t>
@@ -5125,13 +5039,44 @@
       </w:r>
       <w:r>
         <w:lastRenderedPageBreak/>
-        <w:t xml:space="preserve">impacted by heat and interact with each other to predict how traits such as birth, age at maturity, reproductive events, energy flow and lifespan vary across species. DEB models </w:t>
-      </w:r>
-      <w:r>
-        <w:t xml:space="preserve">integrate many processes in a parameter-sparse manner, and </w:t>
-      </w:r>
-      <w:r>
-        <w:t xml:space="preserve">necessary parameters have been estimated for &gt; </w:t>
+        <w:t xml:space="preserve">impacted by heat and interact with each other to predict how traits such as birth, age at maturity, reproductive events, energy flow and lifespan vary across species. </w:t>
+      </w:r>
+      <w:commentRangeStart w:id="543"/>
+      <w:r>
+        <w:t xml:space="preserve">DEB models </w:t>
+      </w:r>
+      <w:r>
+        <w:t xml:space="preserve">integrate many </w:t>
+      </w:r>
+      <w:ins w:id="544" w:author="Daniel Noble" w:date="2025-10-29T09:29:00Z" w16du:dateUtc="2025-10-28T22:29:00Z">
+        <w:r>
+          <w:t xml:space="preserve">known physiological </w:t>
+        </w:r>
+      </w:ins>
+      <w:r>
+        <w:t>processes</w:t>
+      </w:r>
+      <w:del w:id="545" w:author="Daniel Noble" w:date="2025-10-29T09:29:00Z" w16du:dateUtc="2025-10-28T22:29:00Z">
+        <w:r>
+          <w:delText xml:space="preserve"> in a parameter-sparse manner</w:delText>
+        </w:r>
+      </w:del>
+      <w:r>
+        <w:t xml:space="preserve">, and </w:t>
+      </w:r>
+      <w:r>
+        <w:t>necessary parameters hav</w:t>
+      </w:r>
+      <w:commentRangeEnd w:id="543"/>
+      <w:r>
+        <w:rPr>
+          <w:rStyle w:val="CommentReference"/>
+          <w:rFonts w:asciiTheme="minorHAnsi" w:hAnsiTheme="minorHAnsi"/>
+        </w:rPr>
+        <w:commentReference w:id="543"/>
+      </w:r>
+      <w:r>
+        <w:t xml:space="preserve">e been estimated for &gt; </w:t>
       </w:r>
       <w:r>
         <w:t>6</w:t>
@@ -5194,8 +5139,26 @@
           <w:b/>
           <w:bCs/>
         </w:rPr>
-        <w:t>Box 2</w:t>
-      </w:r>
+        <w:t xml:space="preserve">Box </w:t>
+      </w:r>
+      <w:del w:id="546" w:author="Daniel Noble" w:date="2025-10-29T11:38:00Z" w16du:dateUtc="2025-10-29T00:38:00Z">
+        <w:r>
+          <w:rPr>
+            <w:b/>
+            <w:bCs/>
+          </w:rPr>
+          <w:delText>2</w:delText>
+        </w:r>
+      </w:del>
+      <w:ins w:id="547" w:author="Daniel Noble" w:date="2025-10-29T11:38:00Z" w16du:dateUtc="2025-10-29T00:38:00Z">
+        <w:r>
+          <w:rPr>
+            <w:b/>
+            <w:bCs/>
+          </w:rPr>
+          <w:t>3</w:t>
+        </w:r>
+      </w:ins>
       <w:r>
         <w:t>).</w:t>
       </w:r>
@@ -5230,8 +5193,8 @@
         <w:pStyle w:val="Heading1"/>
         <w:spacing w:line="360" w:lineRule="auto"/>
       </w:pPr>
-      <w:bookmarkStart w:id="542" w:name="Xe20b556bb99a49ef81dd5b1307d42fae8e49e0c"/>
-      <w:bookmarkEnd w:id="541"/>
+      <w:bookmarkStart w:id="548" w:name="Xe20b556bb99a49ef81dd5b1307d42fae8e49e0c"/>
+      <w:bookmarkEnd w:id="542"/>
       <w:r>
         <w:t>Mechanistic approaches that ‘speak’ to population and community ecology under extreme heat</w:t>
       </w:r>
@@ -5251,7 +5214,7 @@
       <w:r>
         <w:t xml:space="preserve"> frameworks offer an intriguing approach that can bring the many elements discussed above together to understand whole community responses to extreme climate events. Modern coexistence theory [MCT; [74]] uses simple two-species individual-based population growth models</w:t>
       </w:r>
-      <w:del w:id="543" w:author="Daniel Noble" w:date="2025-10-28T13:44:00Z" w16du:dateUtc="2025-10-28T02:44:00Z">
+      <w:del w:id="549" w:author="Daniel Noble" w:date="2025-10-28T13:44:00Z" w16du:dateUtc="2025-10-28T02:44:00Z">
         <w:r>
           <w:delText>, such as Beverton-Holt or Ricker models</w:delText>
         </w:r>
@@ -5385,7 +5348,7 @@
               </w:rPr>
               <w:t>Box 2:</w:t>
             </w:r>
-            <w:ins w:id="544" w:author="Daniel Noble" w:date="2025-10-27T13:41:00Z" w16du:dateUtc="2025-10-27T02:41:00Z">
+            <w:ins w:id="550" w:author="Daniel Noble" w:date="2025-10-27T13:41:00Z" w16du:dateUtc="2025-10-27T02:41:00Z">
               <w:r>
                 <w:rPr>
                   <w:b/>
@@ -5394,7 +5357,7 @@
                 <w:t xml:space="preserve"> </w:t>
               </w:r>
             </w:ins>
-            <w:ins w:id="545" w:author="Daniel Noble" w:date="2025-10-28T14:44:00Z" w16du:dateUtc="2025-10-28T03:44:00Z">
+            <w:ins w:id="551" w:author="Daniel Noble" w:date="2025-10-28T14:44:00Z" w16du:dateUtc="2025-10-28T03:44:00Z">
               <w:r>
                 <w:rPr>
                   <w:b/>
@@ -5417,7 +5380,7 @@
                 <w:t>from individuals to communities</w:t>
               </w:r>
             </w:ins>
-            <w:del w:id="546" w:author="Daniel Noble" w:date="2025-10-27T13:41:00Z" w16du:dateUtc="2025-10-27T02:41:00Z">
+            <w:del w:id="552" w:author="Daniel Noble" w:date="2025-10-27T13:41:00Z" w16du:dateUtc="2025-10-27T02:41:00Z">
               <w:r>
                 <w:rPr>
                   <w:b/>
@@ -5426,7 +5389,7 @@
                 <w:delText xml:space="preserve"> </w:delText>
               </w:r>
             </w:del>
-            <w:del w:id="547" w:author="Daniel Noble" w:date="2025-10-27T13:40:00Z" w16du:dateUtc="2025-10-27T02:40:00Z">
+            <w:del w:id="553" w:author="Daniel Noble" w:date="2025-10-27T13:40:00Z" w16du:dateUtc="2025-10-27T02:40:00Z">
               <w:r>
                 <w:rPr>
                   <w:b/>
@@ -5435,7 +5398,7 @@
                 <w:delText>Integrating eco-evolutionary feedback within a systems-modelling framework</w:delText>
               </w:r>
             </w:del>
-            <w:ins w:id="548" w:author="Daniel Noble" w:date="2025-10-27T13:40:00Z" w16du:dateUtc="2025-10-27T02:40:00Z">
+            <w:ins w:id="554" w:author="Daniel Noble" w:date="2025-10-27T13:40:00Z" w16du:dateUtc="2025-10-27T02:40:00Z">
               <w:r>
                 <w:rPr>
                   <w:b/>
@@ -5450,10 +5413,10 @@
               <w:pStyle w:val="BodyText"/>
               <w:spacing w:before="16" w:line="360" w:lineRule="auto"/>
               <w:rPr>
-                <w:del w:id="549" w:author="Daniel Noble" w:date="2025-10-27T13:40:00Z" w16du:dateUtc="2025-10-27T02:40:00Z"/>
+                <w:del w:id="555" w:author="Daniel Noble" w:date="2025-10-27T13:40:00Z" w16du:dateUtc="2025-10-27T02:40:00Z"/>
               </w:rPr>
             </w:pPr>
-            <w:del w:id="550" w:author="Daniel Noble" w:date="2025-10-27T13:40:00Z" w16du:dateUtc="2025-10-27T02:40:00Z">
+            <w:del w:id="556" w:author="Daniel Noble" w:date="2025-10-27T13:40:00Z" w16du:dateUtc="2025-10-27T02:40:00Z">
               <w:r>
                 <w:delText>Extreme environments can act as a potent selective force triggering evolutionary change in populations [81–83]. Evolutionary responses will depend on the amount of phenotypic and genetic variation present in a population and exposed to natural selection along with the strength of selection on phenotypes. Extreme environments pose unique challenges for predicting evolutionary change because they are, by definition, rare events. Adaptive evolution will therefore depend on the frequency of extreme environments and the underlying genetic correlation between traits expressed across environments and other conditions [81]. In addition, phenotypic plasticity can result in both maladaptive and adaptive outcomes by either shielding selection on genetic variation or by facilitating persistence and selection, making it difficult to predict the long term effects of plasticity and adaptive evolution in building population resilience [82,84–87].</w:delText>
               </w:r>
@@ -5464,10 +5427,10 @@
               <w:pStyle w:val="BodyText"/>
               <w:spacing w:line="360" w:lineRule="auto"/>
               <w:rPr>
-                <w:del w:id="551" w:author="Daniel Noble" w:date="2025-10-27T13:40:00Z" w16du:dateUtc="2025-10-27T02:40:00Z"/>
+                <w:del w:id="557" w:author="Daniel Noble" w:date="2025-10-27T13:40:00Z" w16du:dateUtc="2025-10-27T02:40:00Z"/>
               </w:rPr>
             </w:pPr>
-            <w:del w:id="552" w:author="Daniel Noble" w:date="2025-10-27T13:40:00Z" w16du:dateUtc="2025-10-27T02:40:00Z">
+            <w:del w:id="558" w:author="Daniel Noble" w:date="2025-10-27T13:40:00Z" w16du:dateUtc="2025-10-27T02:40:00Z">
               <w:r>
                 <w:delText>Plasticity and evolution can be incorporated into a systems modelling framework by allowing environments to govern ‘trait’ development (plasticity) and by incorporating selection and genetic (co)variance estimates for ‘traits’ within these models (evolution). We speak of ‘traits’ broadly here because these need not be traits typically thought of by evolutionary ecologists (e.g., body mass, vital rates). Rather, ‘traits’ can include the parameters within models that establish functional traits within a population (e.g., DEB parameters)[88]. Plasticity can be captured by mapping trait development to the environment. In contrast, evolutionary change takes place in multivariate trait space where genetic variance and covariance between traits (i.e., constraints) along with varying patterns of selection can be used to predict trait changes across generations. One simple way to make such predictions is by using the multivariate breeders equation [89]:</w:delText>
               </w:r>
@@ -5478,17 +5441,17 @@
               <w:pStyle w:val="BodyText"/>
               <w:spacing w:line="360" w:lineRule="auto"/>
               <w:rPr>
-                <w:del w:id="553" w:author="Daniel Noble" w:date="2025-10-27T13:40:00Z" w16du:dateUtc="2025-10-27T02:40:00Z"/>
+                <w:del w:id="559" w:author="Daniel Noble" w:date="2025-10-27T13:40:00Z" w16du:dateUtc="2025-10-27T02:40:00Z"/>
               </w:rPr>
             </w:pPr>
-            <w:bookmarkStart w:id="554" w:name="eq-breeders"/>
+            <w:bookmarkStart w:id="560" w:name="eq-breeders"/>
             <m:oMathPara>
               <m:oMathParaPr>
                 <m:jc m:val="center"/>
               </m:oMathParaPr>
               <m:oMath>
                 <m:r>
-                  <w:del w:id="555" w:author="Daniel Noble" w:date="2025-10-27T13:40:00Z" w16du:dateUtc="2025-10-27T02:40:00Z">
+                  <w:del w:id="561" w:author="Daniel Noble" w:date="2025-10-27T13:40:00Z" w16du:dateUtc="2025-10-27T02:40:00Z">
                     <w:rPr>
                       <w:rFonts w:ascii="Cambria Math" w:hAnsi="Cambria Math"/>
                     </w:rPr>
@@ -5499,7 +5462,7 @@
                   <m:accPr>
                     <m:chr m:val="‾"/>
                     <m:ctrlPr>
-                      <w:del w:id="556" w:author="Daniel Noble" w:date="2025-10-27T13:40:00Z" w16du:dateUtc="2025-10-27T02:40:00Z">
+                      <w:del w:id="562" w:author="Daniel Noble" w:date="2025-10-27T13:40:00Z" w16du:dateUtc="2025-10-27T02:40:00Z">
                         <w:rPr>
                           <w:rFonts w:ascii="Cambria Math" w:hAnsi="Cambria Math"/>
                         </w:rPr>
@@ -5508,7 +5471,7 @@
                   </m:accPr>
                   <m:e>
                     <m:r>
-                      <w:del w:id="557" w:author="Daniel Noble" w:date="2025-10-27T13:40:00Z" w16du:dateUtc="2025-10-27T02:40:00Z">
+                      <w:del w:id="563" w:author="Daniel Noble" w:date="2025-10-27T13:40:00Z" w16du:dateUtc="2025-10-27T02:40:00Z">
                         <m:rPr>
                           <m:sty m:val="b"/>
                         </m:rPr>
@@ -5521,7 +5484,7 @@
                   </m:e>
                 </m:acc>
                 <m:r>
-                  <w:del w:id="558" w:author="Daniel Noble" w:date="2025-10-27T13:40:00Z" w16du:dateUtc="2025-10-27T02:40:00Z">
+                  <w:del w:id="564" w:author="Daniel Noble" w:date="2025-10-27T13:40:00Z" w16du:dateUtc="2025-10-27T02:40:00Z">
                     <m:rPr>
                       <m:sty m:val="p"/>
                     </m:rPr>
@@ -5532,7 +5495,7 @@
                   </w:del>
                 </m:r>
                 <m:r>
-                  <w:del w:id="559" w:author="Daniel Noble" w:date="2025-10-27T13:40:00Z" w16du:dateUtc="2025-10-27T02:40:00Z">
+                  <w:del w:id="565" w:author="Daniel Noble" w:date="2025-10-27T13:40:00Z" w16du:dateUtc="2025-10-27T02:40:00Z">
                     <m:rPr>
                       <m:sty m:val="b"/>
                     </m:rPr>
@@ -5543,7 +5506,7 @@
                   </w:del>
                 </m:r>
                 <m:r>
-                  <w:del w:id="560" w:author="Daniel Noble" w:date="2025-10-27T13:40:00Z" w16du:dateUtc="2025-10-27T02:40:00Z">
+                  <w:del w:id="566" w:author="Daniel Noble" w:date="2025-10-27T13:40:00Z" w16du:dateUtc="2025-10-27T02:40:00Z">
                     <m:rPr>
                       <m:sty m:val="p"/>
                     </m:rPr>
@@ -5554,7 +5517,7 @@
                   </w:del>
                 </m:r>
                 <m:r>
-                  <w:del w:id="561" w:author="Daniel Noble" w:date="2025-10-27T13:40:00Z" w16du:dateUtc="2025-10-27T02:40:00Z">
+                  <w:del w:id="567" w:author="Daniel Noble" w:date="2025-10-27T13:40:00Z" w16du:dateUtc="2025-10-27T02:40:00Z">
                     <m:rPr>
                       <m:sty m:val="b"/>
                     </m:rPr>
@@ -5565,7 +5528,7 @@
                   </w:del>
                 </m:r>
                 <m:r>
-                  <w:del w:id="562" w:author="Daniel Noble" w:date="2025-10-27T13:40:00Z" w16du:dateUtc="2025-10-27T02:40:00Z">
+                  <w:del w:id="568" w:author="Daniel Noble" w:date="2025-10-27T13:40:00Z" w16du:dateUtc="2025-10-27T02:40:00Z">
                     <w:rPr>
                       <w:rFonts w:ascii="Cambria Math" w:hAnsi="Cambria Math"/>
                     </w:rPr>
@@ -5575,7 +5538,7 @@
                 <m:d>
                   <m:dPr>
                     <m:ctrlPr>
-                      <w:del w:id="563" w:author="Daniel Noble" w:date="2025-10-27T13:40:00Z" w16du:dateUtc="2025-10-27T02:40:00Z">
+                      <w:del w:id="569" w:author="Daniel Noble" w:date="2025-10-27T13:40:00Z" w16du:dateUtc="2025-10-27T02:40:00Z">
                         <w:rPr>
                           <w:rFonts w:ascii="Cambria Math" w:hAnsi="Cambria Math"/>
                         </w:rPr>
@@ -5584,7 +5547,7 @@
                   </m:dPr>
                   <m:e>
                     <m:r>
-                      <w:del w:id="564" w:author="Daniel Noble" w:date="2025-10-27T13:40:00Z" w16du:dateUtc="2025-10-27T02:40:00Z">
+                      <w:del w:id="570" w:author="Daniel Noble" w:date="2025-10-27T13:40:00Z" w16du:dateUtc="2025-10-27T02:40:00Z">
                         <w:rPr>
                           <w:rFonts w:ascii="Cambria Math" w:hAnsi="Cambria Math"/>
                         </w:rPr>
@@ -5595,24 +5558,24 @@
                 </m:d>
               </m:oMath>
             </m:oMathPara>
-            <w:bookmarkEnd w:id="554"/>
+            <w:bookmarkEnd w:id="560"/>
           </w:p>
           <w:p>
             <w:pPr>
               <w:pStyle w:val="FirstParagraph"/>
               <w:spacing w:line="360" w:lineRule="auto"/>
               <w:rPr>
-                <w:del w:id="565" w:author="Daniel Noble" w:date="2025-10-27T13:40:00Z" w16du:dateUtc="2025-10-27T02:40:00Z"/>
+                <w:del w:id="571" w:author="Daniel Noble" w:date="2025-10-27T13:40:00Z" w16du:dateUtc="2025-10-27T02:40:00Z"/>
               </w:rPr>
             </w:pPr>
-            <w:del w:id="566" w:author="Daniel Noble" w:date="2025-10-27T13:40:00Z" w16du:dateUtc="2025-10-27T02:40:00Z">
+            <w:del w:id="572" w:author="Daniel Noble" w:date="2025-10-27T13:40:00Z" w16du:dateUtc="2025-10-27T02:40:00Z">
               <w:r>
                 <w:delText xml:space="preserve">where </w:delText>
               </w:r>
             </w:del>
             <m:oMath>
               <m:r>
-                <w:del w:id="567" w:author="Daniel Noble" w:date="2025-10-27T13:40:00Z" w16du:dateUtc="2025-10-27T02:40:00Z">
+                <w:del w:id="573" w:author="Daniel Noble" w:date="2025-10-27T13:40:00Z" w16du:dateUtc="2025-10-27T02:40:00Z">
                   <w:rPr>
                     <w:rFonts w:ascii="Cambria Math" w:hAnsi="Cambria Math"/>
                   </w:rPr>
@@ -5623,7 +5586,7 @@
                 <m:accPr>
                   <m:chr m:val="‾"/>
                   <m:ctrlPr>
-                    <w:del w:id="568" w:author="Daniel Noble" w:date="2025-10-27T13:40:00Z" w16du:dateUtc="2025-10-27T02:40:00Z">
+                    <w:del w:id="574" w:author="Daniel Noble" w:date="2025-10-27T13:40:00Z" w16du:dateUtc="2025-10-27T02:40:00Z">
                       <w:rPr>
                         <w:rFonts w:ascii="Cambria Math" w:hAnsi="Cambria Math"/>
                       </w:rPr>
@@ -5632,7 +5595,7 @@
                 </m:accPr>
                 <m:e>
                   <m:r>
-                    <w:del w:id="569" w:author="Daniel Noble" w:date="2025-10-27T13:40:00Z" w16du:dateUtc="2025-10-27T02:40:00Z">
+                    <w:del w:id="575" w:author="Daniel Noble" w:date="2025-10-27T13:40:00Z" w16du:dateUtc="2025-10-27T02:40:00Z">
                       <m:rPr>
                         <m:sty m:val="b"/>
                       </m:rPr>
@@ -5645,14 +5608,14 @@
                 </m:e>
               </m:acc>
             </m:oMath>
-            <w:del w:id="570" w:author="Daniel Noble" w:date="2025-10-27T13:40:00Z" w16du:dateUtc="2025-10-27T02:40:00Z">
+            <w:del w:id="576" w:author="Daniel Noble" w:date="2025-10-27T13:40:00Z" w16du:dateUtc="2025-10-27T02:40:00Z">
               <w:r>
                 <w:delText xml:space="preserve"> is the vector of changes in the mean trait values, </w:delText>
               </w:r>
             </w:del>
             <m:oMath>
               <m:r>
-                <w:del w:id="571" w:author="Daniel Noble" w:date="2025-10-27T13:40:00Z" w16du:dateUtc="2025-10-27T02:40:00Z">
+                <w:del w:id="577" w:author="Daniel Noble" w:date="2025-10-27T13:40:00Z" w16du:dateUtc="2025-10-27T02:40:00Z">
                   <m:rPr>
                     <m:sty m:val="b"/>
                   </m:rPr>
@@ -5663,14 +5626,14 @@
                 </w:del>
               </m:r>
             </m:oMath>
-            <w:del w:id="572" w:author="Daniel Noble" w:date="2025-10-27T13:40:00Z" w16du:dateUtc="2025-10-27T02:40:00Z">
+            <w:del w:id="578" w:author="Daniel Noble" w:date="2025-10-27T13:40:00Z" w16du:dateUtc="2025-10-27T02:40:00Z">
               <w:r>
                 <w:delText xml:space="preserve"> is the genetic covariance matrix and </w:delText>
               </w:r>
             </w:del>
             <m:oMath>
               <m:r>
-                <w:del w:id="573" w:author="Daniel Noble" w:date="2025-10-27T13:40:00Z" w16du:dateUtc="2025-10-27T02:40:00Z">
+                <w:del w:id="579" w:author="Daniel Noble" w:date="2025-10-27T13:40:00Z" w16du:dateUtc="2025-10-27T02:40:00Z">
                   <m:rPr>
                     <m:sty m:val="b"/>
                   </m:rPr>
@@ -5681,14 +5644,14 @@
                 </w:del>
               </m:r>
             </m:oMath>
-            <w:del w:id="574" w:author="Daniel Noble" w:date="2025-10-27T13:40:00Z" w16du:dateUtc="2025-10-27T02:40:00Z">
+            <w:del w:id="580" w:author="Daniel Noble" w:date="2025-10-27T13:40:00Z" w16du:dateUtc="2025-10-27T02:40:00Z">
               <w:r>
                 <w:delText xml:space="preserve"> is the vector of standardised selection gradients that regress each trait on relative fitness (i.e., </w:delText>
               </w:r>
             </w:del>
             <m:oMath>
               <m:r>
-                <w:del w:id="575" w:author="Daniel Noble" w:date="2025-10-27T13:40:00Z" w16du:dateUtc="2025-10-27T02:40:00Z">
+                <w:del w:id="581" w:author="Daniel Noble" w:date="2025-10-27T13:40:00Z" w16du:dateUtc="2025-10-27T02:40:00Z">
                   <m:rPr>
                     <m:sty m:val="b"/>
                   </m:rPr>
@@ -5699,7 +5662,7 @@
                 </w:del>
               </m:r>
               <m:r>
-                <w:del w:id="576" w:author="Daniel Noble" w:date="2025-10-27T13:40:00Z" w16du:dateUtc="2025-10-27T02:40:00Z">
+                <w:del w:id="582" w:author="Daniel Noble" w:date="2025-10-27T13:40:00Z" w16du:dateUtc="2025-10-27T02:40:00Z">
                   <m:rPr>
                     <m:sty m:val="p"/>
                   </m:rPr>
@@ -5710,7 +5673,7 @@
                 </w:del>
               </m:r>
               <m:r>
-                <w:del w:id="577" w:author="Daniel Noble" w:date="2025-10-27T13:40:00Z" w16du:dateUtc="2025-10-27T02:40:00Z">
+                <w:del w:id="583" w:author="Daniel Noble" w:date="2025-10-27T13:40:00Z" w16du:dateUtc="2025-10-27T02:40:00Z">
                   <m:rPr>
                     <m:sty m:val="b"/>
                   </m:rPr>
@@ -5718,76 +5681,6 @@
                     <w:rFonts w:ascii="Cambria Math" w:hAnsi="Cambria Math"/>
                   </w:rPr>
                   <m:t>α</m:t>
-                </w:del>
-              </m:r>
-              <m:r>
-                <w:del w:id="578" w:author="Daniel Noble" w:date="2025-10-27T13:40:00Z" w16du:dateUtc="2025-10-27T02:40:00Z">
-                  <m:rPr>
-                    <m:sty m:val="p"/>
-                  </m:rPr>
-                  <w:rPr>
-                    <w:rFonts w:ascii="Cambria Math" w:hAnsi="Cambria Math"/>
-                  </w:rPr>
-                  <m:t>+</m:t>
-                </w:del>
-              </m:r>
-              <m:sSup>
-                <m:sSupPr>
-                  <m:ctrlPr>
-                    <w:del w:id="579" w:author="Daniel Noble" w:date="2025-10-27T13:40:00Z" w16du:dateUtc="2025-10-27T02:40:00Z">
-                      <w:rPr>
-                        <w:rFonts w:ascii="Cambria Math" w:hAnsi="Cambria Math"/>
-                      </w:rPr>
-                    </w:del>
-                  </m:ctrlPr>
-                </m:sSupPr>
-                <m:e>
-                  <m:r>
-                    <w:del w:id="580" w:author="Daniel Noble" w:date="2025-10-27T13:40:00Z" w16du:dateUtc="2025-10-27T02:40:00Z">
-                      <m:rPr>
-                        <m:sty m:val="b"/>
-                      </m:rPr>
-                      <w:rPr>
-                        <w:rFonts w:ascii="Cambria Math" w:hAnsi="Cambria Math"/>
-                      </w:rPr>
-                      <m:t>β</m:t>
-                    </w:del>
-                  </m:r>
-                </m:e>
-                <m:sup>
-                  <m:r>
-                    <w:del w:id="581" w:author="Daniel Noble" w:date="2025-10-27T13:40:00Z" w16du:dateUtc="2025-10-27T02:40:00Z">
-                      <m:rPr>
-                        <m:sty m:val="b"/>
-                      </m:rPr>
-                      <w:rPr>
-                        <w:rFonts w:ascii="Cambria Math" w:hAnsi="Cambria Math"/>
-                      </w:rPr>
-                      <m:t>T</m:t>
-                    </w:del>
-                  </m:r>
-                </m:sup>
-              </m:sSup>
-              <m:r>
-                <w:del w:id="582" w:author="Daniel Noble" w:date="2025-10-27T13:40:00Z" w16du:dateUtc="2025-10-27T02:40:00Z">
-                  <m:rPr>
-                    <m:sty m:val="p"/>
-                  </m:rPr>
-                  <w:rPr>
-                    <w:rFonts w:ascii="Cambria Math" w:hAnsi="Cambria Math"/>
-                  </w:rPr>
-                  <m:t>⋅</m:t>
-                </w:del>
-              </m:r>
-              <m:r>
-                <w:del w:id="583" w:author="Daniel Noble" w:date="2025-10-27T13:40:00Z" w16du:dateUtc="2025-10-27T02:40:00Z">
-                  <m:rPr>
-                    <m:sty m:val="b"/>
-                  </m:rPr>
-                  <w:rPr>
-                    <w:rFonts w:ascii="Cambria Math" w:hAnsi="Cambria Math"/>
-                  </w:rPr>
-                  <m:t>z</m:t>
                 </w:del>
               </m:r>
               <m:r>
@@ -5801,8 +5694,78 @@
                   <m:t>+</m:t>
                 </w:del>
               </m:r>
+              <m:sSup>
+                <m:sSupPr>
+                  <m:ctrlPr>
+                    <w:del w:id="585" w:author="Daniel Noble" w:date="2025-10-27T13:40:00Z" w16du:dateUtc="2025-10-27T02:40:00Z">
+                      <w:rPr>
+                        <w:rFonts w:ascii="Cambria Math" w:hAnsi="Cambria Math"/>
+                      </w:rPr>
+                    </w:del>
+                  </m:ctrlPr>
+                </m:sSupPr>
+                <m:e>
+                  <m:r>
+                    <w:del w:id="586" w:author="Daniel Noble" w:date="2025-10-27T13:40:00Z" w16du:dateUtc="2025-10-27T02:40:00Z">
+                      <m:rPr>
+                        <m:sty m:val="b"/>
+                      </m:rPr>
+                      <w:rPr>
+                        <w:rFonts w:ascii="Cambria Math" w:hAnsi="Cambria Math"/>
+                      </w:rPr>
+                      <m:t>β</m:t>
+                    </w:del>
+                  </m:r>
+                </m:e>
+                <m:sup>
+                  <m:r>
+                    <w:del w:id="587" w:author="Daniel Noble" w:date="2025-10-27T13:40:00Z" w16du:dateUtc="2025-10-27T02:40:00Z">
+                      <m:rPr>
+                        <m:sty m:val="b"/>
+                      </m:rPr>
+                      <w:rPr>
+                        <w:rFonts w:ascii="Cambria Math" w:hAnsi="Cambria Math"/>
+                      </w:rPr>
+                      <m:t>T</m:t>
+                    </w:del>
+                  </m:r>
+                </m:sup>
+              </m:sSup>
               <m:r>
-                <w:del w:id="585" w:author="Daniel Noble" w:date="2025-10-27T13:40:00Z" w16du:dateUtc="2025-10-27T02:40:00Z">
+                <w:del w:id="588" w:author="Daniel Noble" w:date="2025-10-27T13:40:00Z" w16du:dateUtc="2025-10-27T02:40:00Z">
+                  <m:rPr>
+                    <m:sty m:val="p"/>
+                  </m:rPr>
+                  <w:rPr>
+                    <w:rFonts w:ascii="Cambria Math" w:hAnsi="Cambria Math"/>
+                  </w:rPr>
+                  <m:t>⋅</m:t>
+                </w:del>
+              </m:r>
+              <m:r>
+                <w:del w:id="589" w:author="Daniel Noble" w:date="2025-10-27T13:40:00Z" w16du:dateUtc="2025-10-27T02:40:00Z">
+                  <m:rPr>
+                    <m:sty m:val="b"/>
+                  </m:rPr>
+                  <w:rPr>
+                    <w:rFonts w:ascii="Cambria Math" w:hAnsi="Cambria Math"/>
+                  </w:rPr>
+                  <m:t>z</m:t>
+                </w:del>
+              </m:r>
+              <m:r>
+                <w:del w:id="590" w:author="Daniel Noble" w:date="2025-10-27T13:40:00Z" w16du:dateUtc="2025-10-27T02:40:00Z">
+                  <m:rPr>
+                    <m:sty m:val="p"/>
+                  </m:rPr>
+                  <w:rPr>
+                    <w:rFonts w:ascii="Cambria Math" w:hAnsi="Cambria Math"/>
+                  </w:rPr>
+                  <m:t>+</m:t>
+                </w:del>
+              </m:r>
+              <m:r>
+                <w:del w:id="591" w:author="Daniel Noble" w:date="2025-10-27T13:40:00Z" w16du:dateUtc="2025-10-27T02:40:00Z">
                   <m:rPr>
                     <m:sty m:val="b"/>
                   </m:rPr>
@@ -5813,7 +5776,7 @@
                 </w:del>
               </m:r>
             </m:oMath>
-            <w:del w:id="586" w:author="Daniel Noble" w:date="2025-10-27T13:40:00Z" w16du:dateUtc="2025-10-27T02:40:00Z">
+            <w:del w:id="592" w:author="Daniel Noble" w:date="2025-10-27T13:40:00Z" w16du:dateUtc="2025-10-27T02:40:00Z">
               <w:r>
                 <w:delText>; [90]). While the multivariate breeders equation can be useful for predicting short term evolutionary responses (i.e., one or a few generations) it likely has limited in predictive power over longer timespans because of changes in heritability and selection through time [83,90].</w:delText>
               </w:r>
@@ -5824,7 +5787,7 @@
               <w:pStyle w:val="BodyText"/>
               <w:spacing w:after="16" w:line="360" w:lineRule="auto"/>
             </w:pPr>
-            <w:del w:id="587" w:author="Daniel Noble" w:date="2025-10-27T13:40:00Z" w16du:dateUtc="2025-10-27T02:40:00Z">
+            <w:del w:id="593" w:author="Daniel Noble" w:date="2025-10-27T13:40:00Z" w16du:dateUtc="2025-10-27T02:40:00Z">
               <w:r>
                 <w:delText xml:space="preserve">Measuring and incorporating both plasticity and evolution into our proposed systems modelling framework is challenging because such models usually focus on one or a few ‘traits’. Studies that have attempted to measure plasticity and evolutionary potential in traits demonstrate how such processes can shape outcomes in important ways [61,91–95]. For example, applying a TDT framework to isogenic lines of </w:delText>
               </w:r>
@@ -5851,7 +5814,7 @@
             </w:del>
             <m:oMath>
               <m:r>
-                <w:del w:id="588" w:author="Daniel Noble" w:date="2025-10-27T13:40:00Z" w16du:dateUtc="2025-10-27T02:40:00Z">
+                <w:del w:id="594" w:author="Daniel Noble" w:date="2025-10-27T13:40:00Z" w16du:dateUtc="2025-10-27T02:40:00Z">
                   <w:rPr>
                     <w:rFonts w:ascii="Cambria Math" w:hAnsi="Cambria Math"/>
                   </w:rPr>
@@ -5861,7 +5824,7 @@
               <m:sSub>
                 <m:sSubPr>
                   <m:ctrlPr>
-                    <w:del w:id="589" w:author="Daniel Noble" w:date="2025-10-27T13:40:00Z" w16du:dateUtc="2025-10-27T02:40:00Z">
+                    <w:del w:id="595" w:author="Daniel Noble" w:date="2025-10-27T13:40:00Z" w16du:dateUtc="2025-10-27T02:40:00Z">
                       <w:rPr>
                         <w:rFonts w:ascii="Cambria Math" w:hAnsi="Cambria Math"/>
                       </w:rPr>
@@ -5870,7 +5833,7 @@
                 </m:sSubPr>
                 <m:e>
                   <m:r>
-                    <w:del w:id="590" w:author="Daniel Noble" w:date="2025-10-27T13:40:00Z" w16du:dateUtc="2025-10-27T02:40:00Z">
+                    <w:del w:id="596" w:author="Daniel Noble" w:date="2025-10-27T13:40:00Z" w16du:dateUtc="2025-10-27T02:40:00Z">
                       <w:rPr>
                         <w:rFonts w:ascii="Cambria Math" w:hAnsi="Cambria Math"/>
                       </w:rPr>
@@ -5880,7 +5843,7 @@
                 </m:e>
                 <m:sub>
                   <m:r>
-                    <w:del w:id="591" w:author="Daniel Noble" w:date="2025-10-27T13:40:00Z" w16du:dateUtc="2025-10-27T02:40:00Z">
+                    <w:del w:id="597" w:author="Daniel Noble" w:date="2025-10-27T13:40:00Z" w16du:dateUtc="2025-10-27T02:40:00Z">
                       <w:rPr>
                         <w:rFonts w:ascii="Cambria Math" w:hAnsi="Cambria Math"/>
                       </w:rPr>
@@ -5890,14 +5853,14 @@
                 </m:sub>
               </m:sSub>
             </m:oMath>
-            <w:del w:id="592" w:author="Daniel Noble" w:date="2025-10-27T13:40:00Z" w16du:dateUtc="2025-10-27T02:40:00Z">
+            <w:del w:id="598" w:author="Daniel Noble" w:date="2025-10-27T13:40:00Z" w16du:dateUtc="2025-10-27T02:40:00Z">
               <w:r>
                 <w:delText xml:space="preserve">) and also thermal sensitivity (i.e, </w:delText>
               </w:r>
             </w:del>
             <m:oMath>
               <m:r>
-                <w:del w:id="593" w:author="Daniel Noble" w:date="2025-10-27T13:40:00Z" w16du:dateUtc="2025-10-27T02:40:00Z">
+                <w:del w:id="599" w:author="Daniel Noble" w:date="2025-10-27T13:40:00Z" w16du:dateUtc="2025-10-27T02:40:00Z">
                   <w:rPr>
                     <w:rFonts w:ascii="Cambria Math" w:hAnsi="Cambria Math"/>
                   </w:rPr>
@@ -5905,7 +5868,7 @@
                 </w:del>
               </m:r>
             </m:oMath>
-            <w:del w:id="594" w:author="Daniel Noble" w:date="2025-10-27T13:40:00Z" w16du:dateUtc="2025-10-27T02:40:00Z">
+            <w:del w:id="600" w:author="Daniel Noble" w:date="2025-10-27T13:40:00Z" w16du:dateUtc="2025-10-27T02:40:00Z">
               <w:r>
                 <w:delText xml:space="preserve">, slope from TDT curves). Thermal sensitivity in </w:delText>
               </w:r>
@@ -5984,7 +5947,16 @@
               <w:lastRenderedPageBreak/>
               <w:t xml:space="preserve">Box 3: </w:t>
             </w:r>
-            <w:ins w:id="595" w:author="Daniel Noble" w:date="2025-10-27T13:39:00Z" w16du:dateUtc="2025-10-27T02:39:00Z">
+            <w:ins w:id="601" w:author="Daniel Noble" w:date="2025-10-29T09:42:00Z" w16du:dateUtc="2025-10-28T22:42:00Z">
+              <w:r>
+                <w:rPr>
+                  <w:b/>
+                  <w:bCs/>
+                </w:rPr>
+                <w:t xml:space="preserve">An important frontier: </w:t>
+              </w:r>
+            </w:ins>
+            <w:ins w:id="602" w:author="Daniel Noble" w:date="2025-10-27T13:39:00Z" w16du:dateUtc="2025-10-27T02:39:00Z">
               <w:r>
                 <w:rPr>
                   <w:b/>
@@ -5993,7 +5965,7 @@
                 <w:t>Integrating eco-evolutionary feedback within a systems-modelling framework</w:t>
               </w:r>
             </w:ins>
-            <w:del w:id="596" w:author="Daniel Noble" w:date="2025-10-27T13:39:00Z" w16du:dateUtc="2025-10-27T02:39:00Z">
+            <w:del w:id="603" w:author="Daniel Noble" w:date="2025-10-27T13:39:00Z" w16du:dateUtc="2025-10-27T02:39:00Z">
               <w:r>
                 <w:rPr>
                   <w:b/>
@@ -6008,39 +5980,137 @@
               <w:pStyle w:val="BodyText"/>
               <w:spacing w:before="16" w:line="360" w:lineRule="auto"/>
               <w:rPr>
-                <w:ins w:id="597" w:author="Daniel Noble" w:date="2025-10-27T13:40:00Z" w16du:dateUtc="2025-10-27T02:40:00Z"/>
+                <w:ins w:id="604" w:author="Daniel Noble" w:date="2025-10-29T09:44:00Z"/>
+                <w:rFonts w:eastAsiaTheme="minorHAnsi" w:cstheme="minorBidi"/>
+                <w:lang w:eastAsia="en-US"/>
               </w:rPr>
             </w:pPr>
-            <w:ins w:id="598" w:author="Daniel Noble" w:date="2025-10-27T13:40:00Z" w16du:dateUtc="2025-10-27T02:40:00Z">
-              <w:r>
-                <w:t xml:space="preserve">Extreme environments can act as a </w:t>
-              </w:r>
-              <w:commentRangeStart w:id="599"/>
-              <w:r>
-                <w:t xml:space="preserve">potent selective force triggering evolutionary </w:t>
+            <w:ins w:id="605" w:author="Daniel Noble" w:date="2025-10-29T09:44:00Z">
+              <w:r>
+                <w:rPr>
+                  <w:rFonts w:eastAsiaTheme="minorHAnsi" w:cstheme="minorBidi"/>
+                  <w:lang w:eastAsia="en-US"/>
+                </w:rPr>
+                <w:t>Extreme climactic events, such as heatwaves and droughts, are known to result in intense episodes of selection which can lead to rapid evolutionary change when traits are heritable [@Baeckens2025]. In addition, given the intensity of selection associated with extreme climatic events, they have the potential to radically alter the phenotypic and genetic variability available to selection in the future [@Urban2024], potentially impacting a populations resilience to future extremes. Predicting evolutionary responses from extreme heat events is challenging because their rarity and stochasticity make quantifying the strength of selection difficult as it often can only be opportunistically measured [@Baeckens2025]. Predicting evolutionary responses also relies on our ability to predict heatwaves and how organisms experience them in the future – a task that is becoming more tangible with new climate models</w:t>
               </w:r>
             </w:ins>
-            <w:commentRangeEnd w:id="599"/>
-            <w:ins w:id="600" w:author="Daniel Noble" w:date="2025-10-28T16:51:00Z" w16du:dateUtc="2025-10-28T05:51:00Z">
+            <w:ins w:id="606" w:author="Daniel Noble" w:date="2025-10-29T11:54:00Z" w16du:dateUtc="2025-10-29T00:54:00Z">
               <w:r>
                 <w:rPr>
-                  <w:rStyle w:val="CommentReference"/>
-                  <w:rFonts w:asciiTheme="minorHAnsi" w:hAnsiTheme="minorHAnsi"/>
+                  <w:rFonts w:eastAsiaTheme="minorHAnsi" w:cstheme="minorBidi"/>
+                  <w:lang w:eastAsia="en-US"/>
                 </w:rPr>
-                <w:commentReference w:id="599"/>
+                <w:t xml:space="preserve"> </w:t>
+              </w:r>
+              <w:r>
+                <w:rPr>
+                  <w:rFonts w:eastAsiaTheme="minorHAnsi" w:cstheme="minorBidi"/>
+                  <w:lang w:eastAsia="en-US"/>
+                </w:rPr>
+                <w:t>[e.g., @Munoz-Sabater2021; @Eyring2016]</w:t>
               </w:r>
             </w:ins>
-            <w:ins w:id="601" w:author="Daniel Noble" w:date="2025-10-27T13:40:00Z" w16du:dateUtc="2025-10-27T02:40:00Z">
-              <w:r>
-                <w:t xml:space="preserve">change in populations [81–83]. Evolutionary responses will depend on the amount of phenotypic and genetic variation present in a population and exposed to natural selection along with the strength of selection on phenotypes. Extreme environments pose unique challenges for predicting evolutionary change because they are, by definition, rare events. Adaptive evolution will therefore depend on the frequency of extreme environments and the underlying genetic correlation between traits expressed across environments and other conditions [81]. In addition, phenotypic plasticity can result in both maladaptive and adaptive outcomes by either shielding selection on genetic variation or by facilitating persistence and selection, making it difficult to predict the </w:t>
-              </w:r>
-              <w:proofErr w:type="gramStart"/>
-              <w:r>
-                <w:t>long term</w:t>
-              </w:r>
-              <w:proofErr w:type="gramEnd"/>
-              <w:r>
-                <w:t xml:space="preserve"> effects of plasticity and adaptive evolution in building population resilience [82,84–87].</w:t>
+            <w:ins w:id="607" w:author="Daniel Noble" w:date="2025-10-29T09:44:00Z">
+              <w:r>
+                <w:rPr>
+                  <w:rFonts w:eastAsiaTheme="minorHAnsi" w:cstheme="minorBidi"/>
+                  <w:lang w:eastAsia="en-US"/>
+                </w:rPr>
+                <w:t xml:space="preserve">. </w:t>
+              </w:r>
+            </w:ins>
+            <w:ins w:id="608" w:author="Daniel Noble" w:date="2025-10-29T09:44:00Z" w16du:dateUtc="2025-10-28T22:44:00Z">
+              <w:r>
+                <w:t>Evolutionary</w:t>
+              </w:r>
+            </w:ins>
+            <w:ins w:id="609" w:author="Daniel Noble" w:date="2025-10-29T09:44:00Z">
+              <w:r>
+                <w:rPr>
+                  <w:rFonts w:eastAsiaTheme="minorHAnsi" w:cstheme="minorBidi"/>
+                  <w:lang w:eastAsia="en-US"/>
+                </w:rPr>
+                <w:t xml:space="preserve"> </w:t>
+              </w:r>
+            </w:ins>
+            <w:ins w:id="610" w:author="Daniel Noble" w:date="2025-10-29T09:44:00Z" w16du:dateUtc="2025-10-28T22:44:00Z">
+              <w:r>
+                <w:t>consequences</w:t>
+              </w:r>
+            </w:ins>
+            <w:ins w:id="611" w:author="Daniel Noble" w:date="2025-10-29T09:44:00Z">
+              <w:r>
+                <w:rPr>
+                  <w:rFonts w:eastAsiaTheme="minorHAnsi" w:cstheme="minorBidi"/>
+                  <w:lang w:eastAsia="en-US"/>
+                </w:rPr>
+                <w:t xml:space="preserve"> of extreme heat events will depend on their characteristics (e.g., frequency, timing, exposure intensity and duration), the traits under selection and their levels of genetic (co)variation, as well as the demographic and ecological context in which the event occurs [@Chevin2017; @Hoffmann2022; @Hoffmann2011]. Considering various forms of plastic responses (e.g., behavioural, developmental, and physiological </w:t>
+              </w:r>
+            </w:ins>
+            <w:ins w:id="612" w:author="Daniel Noble" w:date="2025-10-29T09:56:00Z" w16du:dateUtc="2025-10-28T22:56:00Z">
+              <w:r>
+                <w:rPr>
+                  <w:rFonts w:eastAsiaTheme="minorHAnsi" w:cstheme="minorBidi"/>
+                  <w:lang w:eastAsia="en-US"/>
+                </w:rPr>
+                <w:t>plasticity</w:t>
+              </w:r>
+            </w:ins>
+            <w:ins w:id="613" w:author="Daniel Noble" w:date="2025-10-29T09:44:00Z">
+              <w:r>
+                <w:rPr>
+                  <w:rFonts w:eastAsiaTheme="minorHAnsi" w:cstheme="minorBidi"/>
+                  <w:lang w:eastAsia="en-US"/>
+                </w:rPr>
+                <w:t xml:space="preserve">) as </w:t>
+              </w:r>
+            </w:ins>
+            <w:ins w:id="614" w:author="Daniel Noble" w:date="2025-10-29T09:57:00Z" w16du:dateUtc="2025-10-28T22:57:00Z">
+              <w:r>
+                <w:rPr>
+                  <w:rFonts w:eastAsiaTheme="minorHAnsi" w:cstheme="minorBidi"/>
+                  <w:lang w:eastAsia="en-US"/>
+                </w:rPr>
+                <w:t>environments</w:t>
+              </w:r>
+            </w:ins>
+            <w:ins w:id="615" w:author="Daniel Noble" w:date="2025-10-29T09:44:00Z">
+              <w:r>
+                <w:rPr>
+                  <w:rFonts w:eastAsiaTheme="minorHAnsi" w:cstheme="minorBidi"/>
+                  <w:lang w:eastAsia="en-US"/>
+                </w:rPr>
+                <w:t xml:space="preserve"> change through time is also crucial because it can dampen selection and shelter genetic variation while also promoting persistence [@Catullo2019; @Ghalambor2015]. Many of these processes can now be incorporated into a systems modelling framework (</w:t>
+              </w:r>
+              <w:proofErr w:type="spellStart"/>
+              <w:r>
+                <w:rPr>
+                  <w:rFonts w:eastAsiaTheme="minorHAnsi" w:cstheme="minorBidi"/>
+                  <w:lang w:eastAsia="en-US"/>
+                </w:rPr>
+                <w:t>e.g</w:t>
+              </w:r>
+              <w:proofErr w:type="spellEnd"/>
+              <w:r>
+                <w:rPr>
+                  <w:rFonts w:eastAsiaTheme="minorHAnsi" w:cstheme="minorBidi"/>
+                  <w:lang w:eastAsia="en-US"/>
+                </w:rPr>
+                <w:t xml:space="preserve">, behavioural plasticity), to capture well known environment-phenotype </w:t>
+              </w:r>
+            </w:ins>
+            <w:ins w:id="616" w:author="Daniel Noble" w:date="2025-10-29T09:45:00Z" w16du:dateUtc="2025-10-28T22:45:00Z">
+              <w:r>
+                <w:t>feedback</w:t>
+              </w:r>
+            </w:ins>
+            <w:ins w:id="617" w:author="Daniel Noble" w:date="2025-10-29T09:44:00Z">
+              <w:r>
+                <w:rPr>
+                  <w:rFonts w:eastAsiaTheme="minorHAnsi" w:cstheme="minorBidi"/>
+                  <w:lang w:eastAsia="en-US"/>
+                </w:rPr>
+                <w:t>.</w:t>
               </w:r>
             </w:ins>
           </w:p>
@@ -6049,36 +6119,115 @@
               <w:pStyle w:val="BodyText"/>
               <w:spacing w:line="360" w:lineRule="auto"/>
               <w:rPr>
-                <w:ins w:id="602" w:author="Daniel Noble" w:date="2025-10-27T13:40:00Z" w16du:dateUtc="2025-10-27T02:40:00Z"/>
+                <w:ins w:id="618" w:author="Daniel Noble" w:date="2025-10-27T13:40:00Z" w16du:dateUtc="2025-10-27T02:40:00Z"/>
+                <w:rFonts w:eastAsiaTheme="minorHAnsi" w:cstheme="minorBidi"/>
+                <w:lang w:eastAsia="en-US"/>
+                <w:rPrChange w:id="619" w:author="Daniel Noble" w:date="2025-10-29T09:55:00Z" w16du:dateUtc="2025-10-28T22:55:00Z">
+                  <w:rPr>
+                    <w:ins w:id="620" w:author="Daniel Noble" w:date="2025-10-27T13:40:00Z" w16du:dateUtc="2025-10-27T02:40:00Z"/>
+                  </w:rPr>
+                </w:rPrChange>
               </w:rPr>
             </w:pPr>
-            <w:ins w:id="603" w:author="Daniel Noble" w:date="2025-10-27T13:40:00Z" w16du:dateUtc="2025-10-27T02:40:00Z">
-              <w:r>
-                <w:t>Plasticity and evolution can be incorporated into a systems modelling framework by allowing environments to govern ‘trait’ development (plasticity) and by incorporating selection and genetic (co)variance estimates for ‘traits’ within these models (evolution). We speak of ‘traits’ broadly here because these need not be traits typically thought of by evolutionary ecologists (e.g., body mass, vital rates). Rather, ‘</w:t>
+            <w:ins w:id="621" w:author="Daniel Noble" w:date="2025-10-29T09:55:00Z">
+              <w:r>
+                <w:rPr>
+                  <w:rFonts w:eastAsiaTheme="minorHAnsi" w:cstheme="minorBidi"/>
+                  <w:lang w:eastAsia="en-US"/>
+                </w:rPr>
+                <w:t xml:space="preserve">A more complete systems modelling approach that captures eco-evolutionary dynamics needs to think about 'traits' more broadly than those typically thought of by evolutionary ecologists (e.g., body mass). For example, 'traits' can include the parameters within models that establish functional traits within a population (e.g., DEB </w:t>
               </w:r>
               <w:proofErr w:type="gramStart"/>
               <w:r>
-                <w:t>traits’</w:t>
+                <w:rPr>
+                  <w:rFonts w:eastAsiaTheme="minorHAnsi" w:cstheme="minorBidi"/>
+                  <w:lang w:eastAsia="en-US"/>
+                </w:rPr>
+                <w:t>parameters)[</w:t>
               </w:r>
               <w:proofErr w:type="gramEnd"/>
               <w:r>
-                <w:t xml:space="preserve"> can include the parameters within models that establish functional traits within a population (e.g., DEB </w:t>
+                <w:rPr>
+                  <w:rFonts w:eastAsiaTheme="minorHAnsi" w:cstheme="minorBidi"/>
+                  <w:lang w:eastAsia="en-US"/>
+                </w:rPr>
+                <w:t>@Sousa2010; @Kearney2009a</w:t>
+              </w:r>
+            </w:ins>
+            <w:ins w:id="622" w:author="Daniel Noble" w:date="2025-10-29T11:51:00Z" w16du:dateUtc="2025-10-29T00:51:00Z">
+              <w:r>
+                <w:rPr>
+                  <w:rFonts w:eastAsiaTheme="minorHAnsi" w:cstheme="minorBidi"/>
+                  <w:lang w:eastAsia="en-US"/>
+                </w:rPr>
+                <w:t>],</w:t>
+              </w:r>
+              <w:r>
+                <w:t xml:space="preserve"> </w:t>
+              </w:r>
+              <w:r>
+                <w:rPr>
+                  <w:rFonts w:eastAsiaTheme="minorHAnsi" w:cstheme="minorBidi"/>
+                  <w:lang w:eastAsia="en-US"/>
+                </w:rPr>
+                <w:t xml:space="preserve">which may provide predictions for suites of resulting traits that emerge </w:t>
+              </w:r>
+              <w:r>
+                <w:rPr>
+                  <w:rFonts w:eastAsiaTheme="minorHAnsi" w:cstheme="minorBidi"/>
+                  <w:lang w:eastAsia="en-US"/>
+                </w:rPr>
+                <w:t>from</w:t>
+              </w:r>
+              <w:r>
+                <w:rPr>
+                  <w:rFonts w:eastAsiaTheme="minorHAnsi" w:cstheme="minorBidi"/>
+                  <w:lang w:eastAsia="en-US"/>
+                </w:rPr>
+                <w:t xml:space="preserve"> such parameters</w:t>
+              </w:r>
+            </w:ins>
+            <w:ins w:id="623" w:author="Daniel Noble" w:date="2025-10-29T09:55:00Z">
+              <w:r>
+                <w:rPr>
+                  <w:rFonts w:eastAsiaTheme="minorHAnsi" w:cstheme="minorBidi"/>
+                  <w:lang w:eastAsia="en-US"/>
+                </w:rPr>
+                <w:t xml:space="preserve">. Furthermore, it needs to consider the </w:t>
+              </w:r>
+            </w:ins>
+            <w:ins w:id="624" w:author="Daniel Noble" w:date="2025-10-29T09:56:00Z" w16du:dateUtc="2025-10-28T22:56:00Z">
+              <w:r>
+                <w:rPr>
+                  <w:rFonts w:eastAsiaTheme="minorHAnsi" w:cstheme="minorBidi"/>
+                  <w:lang w:eastAsia="en-US"/>
+                </w:rPr>
+                <w:t>evolution</w:t>
+              </w:r>
+            </w:ins>
+            <w:ins w:id="625" w:author="Daniel Noble" w:date="2025-10-29T09:55:00Z">
+              <w:r>
+                <w:rPr>
+                  <w:rFonts w:eastAsiaTheme="minorHAnsi" w:cstheme="minorBidi"/>
+                  <w:lang w:eastAsia="en-US"/>
+                </w:rPr>
+                <w:t xml:space="preserve"> of suites of traits which can be done using the multivariate </w:t>
               </w:r>
               <w:proofErr w:type="gramStart"/>
               <w:r>
-                <w:t>parameters)[</w:t>
+                <w:rPr>
+                  <w:rFonts w:eastAsiaTheme="minorHAnsi" w:cstheme="minorBidi"/>
+                  <w:lang w:eastAsia="en-US"/>
+                </w:rPr>
+                <w:t>breeders</w:t>
               </w:r>
               <w:proofErr w:type="gramEnd"/>
               <w:r>
-                <w:t xml:space="preserve">88]. Plasticity can be captured by mapping trait development to the environment. In contrast, evolutionary change takes place in multivariate trait space where genetic variance and covariance between traits (i.e., constraints) along with varying patterns of selection can be used to predict trait changes across generations. One simple way to make such predictions is by using the multivariate </w:t>
-              </w:r>
-              <w:proofErr w:type="gramStart"/>
-              <w:r>
-                <w:t>breeders</w:t>
-              </w:r>
-              <w:proofErr w:type="gramEnd"/>
-              <w:r>
-                <w:t xml:space="preserve"> equation [89]:</w:t>
+                <w:rPr>
+                  <w:rFonts w:eastAsiaTheme="minorHAnsi" w:cstheme="minorBidi"/>
+                  <w:lang w:eastAsia="en-US"/>
+                </w:rPr>
+                <w:t xml:space="preserve"> equation [@Lande1979]:</w:t>
               </w:r>
             </w:ins>
           </w:p>
@@ -6087,7 +6236,7 @@
               <w:pStyle w:val="BodyText"/>
               <w:spacing w:line="360" w:lineRule="auto"/>
               <w:rPr>
-                <w:ins w:id="604" w:author="Daniel Noble" w:date="2025-10-27T13:40:00Z" w16du:dateUtc="2025-10-27T02:40:00Z"/>
+                <w:ins w:id="626" w:author="Daniel Noble" w:date="2025-10-27T13:40:00Z" w16du:dateUtc="2025-10-27T02:40:00Z"/>
               </w:rPr>
             </w:pPr>
             <m:oMathPara>
@@ -6096,7 +6245,7 @@
               </m:oMathParaPr>
               <m:oMath>
                 <m:r>
-                  <w:ins w:id="605" w:author="Daniel Noble" w:date="2025-10-27T13:40:00Z" w16du:dateUtc="2025-10-27T02:40:00Z">
+                  <w:ins w:id="627" w:author="Daniel Noble" w:date="2025-10-27T13:40:00Z" w16du:dateUtc="2025-10-27T02:40:00Z">
                     <w:rPr>
                       <w:rFonts w:ascii="Cambria Math" w:hAnsi="Cambria Math"/>
                     </w:rPr>
@@ -6107,7 +6256,7 @@
                   <m:accPr>
                     <m:chr m:val="‾"/>
                     <m:ctrlPr>
-                      <w:ins w:id="606" w:author="Daniel Noble" w:date="2025-10-27T13:40:00Z" w16du:dateUtc="2025-10-27T02:40:00Z">
+                      <w:ins w:id="628" w:author="Daniel Noble" w:date="2025-10-27T13:40:00Z" w16du:dateUtc="2025-10-27T02:40:00Z">
                         <w:rPr>
                           <w:rFonts w:ascii="Cambria Math" w:hAnsi="Cambria Math"/>
                         </w:rPr>
@@ -6116,7 +6265,7 @@
                   </m:accPr>
                   <m:e>
                     <m:r>
-                      <w:ins w:id="607" w:author="Daniel Noble" w:date="2025-10-27T13:40:00Z" w16du:dateUtc="2025-10-27T02:40:00Z">
+                      <w:ins w:id="629" w:author="Daniel Noble" w:date="2025-10-27T13:40:00Z" w16du:dateUtc="2025-10-27T02:40:00Z">
                         <m:rPr>
                           <m:sty m:val="b"/>
                         </m:rPr>
@@ -6129,7 +6278,7 @@
                   </m:e>
                 </m:acc>
                 <m:r>
-                  <w:ins w:id="608" w:author="Daniel Noble" w:date="2025-10-27T13:40:00Z" w16du:dateUtc="2025-10-27T02:40:00Z">
+                  <w:ins w:id="630" w:author="Daniel Noble" w:date="2025-10-27T13:40:00Z" w16du:dateUtc="2025-10-27T02:40:00Z">
                     <m:rPr>
                       <m:sty m:val="p"/>
                     </m:rPr>
@@ -6140,7 +6289,7 @@
                   </w:ins>
                 </m:r>
                 <m:r>
-                  <w:ins w:id="609" w:author="Daniel Noble" w:date="2025-10-27T13:40:00Z" w16du:dateUtc="2025-10-27T02:40:00Z">
+                  <w:ins w:id="631" w:author="Daniel Noble" w:date="2025-10-27T13:40:00Z" w16du:dateUtc="2025-10-27T02:40:00Z">
                     <m:rPr>
                       <m:sty m:val="b"/>
                     </m:rPr>
@@ -6151,7 +6300,7 @@
                   </w:ins>
                 </m:r>
                 <m:r>
-                  <w:ins w:id="610" w:author="Daniel Noble" w:date="2025-10-27T13:40:00Z" w16du:dateUtc="2025-10-27T02:40:00Z">
+                  <w:ins w:id="632" w:author="Daniel Noble" w:date="2025-10-27T13:40:00Z" w16du:dateUtc="2025-10-27T02:40:00Z">
                     <m:rPr>
                       <m:sty m:val="p"/>
                     </m:rPr>
@@ -6162,7 +6311,7 @@
                   </w:ins>
                 </m:r>
                 <m:r>
-                  <w:ins w:id="611" w:author="Daniel Noble" w:date="2025-10-27T13:40:00Z" w16du:dateUtc="2025-10-27T02:40:00Z">
+                  <w:ins w:id="633" w:author="Daniel Noble" w:date="2025-10-27T13:40:00Z" w16du:dateUtc="2025-10-27T02:40:00Z">
                     <m:rPr>
                       <m:sty m:val="b"/>
                     </m:rPr>
@@ -6173,7 +6322,7 @@
                   </w:ins>
                 </m:r>
                 <m:r>
-                  <w:ins w:id="612" w:author="Daniel Noble" w:date="2025-10-27T13:40:00Z" w16du:dateUtc="2025-10-27T02:40:00Z">
+                  <w:ins w:id="634" w:author="Daniel Noble" w:date="2025-10-27T13:40:00Z" w16du:dateUtc="2025-10-27T02:40:00Z">
                     <w:rPr>
                       <w:rFonts w:ascii="Cambria Math" w:hAnsi="Cambria Math"/>
                     </w:rPr>
@@ -6183,7 +6332,7 @@
                 <m:d>
                   <m:dPr>
                     <m:ctrlPr>
-                      <w:ins w:id="613" w:author="Daniel Noble" w:date="2025-10-27T13:40:00Z" w16du:dateUtc="2025-10-27T02:40:00Z">
+                      <w:ins w:id="635" w:author="Daniel Noble" w:date="2025-10-27T13:40:00Z" w16du:dateUtc="2025-10-27T02:40:00Z">
                         <w:rPr>
                           <w:rFonts w:ascii="Cambria Math" w:hAnsi="Cambria Math"/>
                         </w:rPr>
@@ -6192,7 +6341,7 @@
                   </m:dPr>
                   <m:e>
                     <m:r>
-                      <w:ins w:id="614" w:author="Daniel Noble" w:date="2025-10-27T13:40:00Z" w16du:dateUtc="2025-10-27T02:40:00Z">
+                      <w:ins w:id="636" w:author="Daniel Noble" w:date="2025-10-27T13:40:00Z" w16du:dateUtc="2025-10-27T02:40:00Z">
                         <w:rPr>
                           <w:rFonts w:ascii="Cambria Math" w:hAnsi="Cambria Math"/>
                         </w:rPr>
@@ -6209,17 +6358,17 @@
               <w:pStyle w:val="FirstParagraph"/>
               <w:spacing w:line="360" w:lineRule="auto"/>
               <w:rPr>
-                <w:ins w:id="615" w:author="Daniel Noble" w:date="2025-10-27T13:40:00Z" w16du:dateUtc="2025-10-27T02:40:00Z"/>
+                <w:ins w:id="637" w:author="Daniel Noble" w:date="2025-10-27T13:40:00Z" w16du:dateUtc="2025-10-27T02:40:00Z"/>
               </w:rPr>
             </w:pPr>
-            <w:ins w:id="616" w:author="Daniel Noble" w:date="2025-10-27T13:40:00Z" w16du:dateUtc="2025-10-27T02:40:00Z">
+            <w:ins w:id="638" w:author="Daniel Noble" w:date="2025-10-27T13:40:00Z" w16du:dateUtc="2025-10-27T02:40:00Z">
               <w:r>
                 <w:t xml:space="preserve">where </w:t>
               </w:r>
             </w:ins>
             <m:oMath>
               <m:r>
-                <w:ins w:id="617" w:author="Daniel Noble" w:date="2025-10-27T13:40:00Z" w16du:dateUtc="2025-10-27T02:40:00Z">
+                <w:ins w:id="639" w:author="Daniel Noble" w:date="2025-10-27T13:40:00Z" w16du:dateUtc="2025-10-27T02:40:00Z">
                   <w:rPr>
                     <w:rFonts w:ascii="Cambria Math" w:hAnsi="Cambria Math"/>
                   </w:rPr>
@@ -6230,7 +6379,7 @@
                 <m:accPr>
                   <m:chr m:val="‾"/>
                   <m:ctrlPr>
-                    <w:ins w:id="618" w:author="Daniel Noble" w:date="2025-10-27T13:40:00Z" w16du:dateUtc="2025-10-27T02:40:00Z">
+                    <w:ins w:id="640" w:author="Daniel Noble" w:date="2025-10-27T13:40:00Z" w16du:dateUtc="2025-10-27T02:40:00Z">
                       <w:rPr>
                         <w:rFonts w:ascii="Cambria Math" w:hAnsi="Cambria Math"/>
                       </w:rPr>
@@ -6239,7 +6388,7 @@
                 </m:accPr>
                 <m:e>
                   <m:r>
-                    <w:ins w:id="619" w:author="Daniel Noble" w:date="2025-10-27T13:40:00Z" w16du:dateUtc="2025-10-27T02:40:00Z">
+                    <w:ins w:id="641" w:author="Daniel Noble" w:date="2025-10-27T13:40:00Z" w16du:dateUtc="2025-10-27T02:40:00Z">
                       <m:rPr>
                         <m:sty m:val="b"/>
                       </m:rPr>
@@ -6252,14 +6401,14 @@
                 </m:e>
               </m:acc>
             </m:oMath>
-            <w:ins w:id="620" w:author="Daniel Noble" w:date="2025-10-27T13:40:00Z" w16du:dateUtc="2025-10-27T02:40:00Z">
+            <w:ins w:id="642" w:author="Daniel Noble" w:date="2025-10-27T13:40:00Z" w16du:dateUtc="2025-10-27T02:40:00Z">
               <w:r>
                 <w:t xml:space="preserve"> is the vector of changes in the mean trait values, </w:t>
               </w:r>
             </w:ins>
             <m:oMath>
               <m:r>
-                <w:ins w:id="621" w:author="Daniel Noble" w:date="2025-10-27T13:40:00Z" w16du:dateUtc="2025-10-27T02:40:00Z">
+                <w:ins w:id="643" w:author="Daniel Noble" w:date="2025-10-27T13:40:00Z" w16du:dateUtc="2025-10-27T02:40:00Z">
                   <m:rPr>
                     <m:sty m:val="b"/>
                   </m:rPr>
@@ -6270,14 +6419,14 @@
                 </w:ins>
               </m:r>
             </m:oMath>
-            <w:ins w:id="622" w:author="Daniel Noble" w:date="2025-10-27T13:40:00Z" w16du:dateUtc="2025-10-27T02:40:00Z">
+            <w:ins w:id="644" w:author="Daniel Noble" w:date="2025-10-27T13:40:00Z" w16du:dateUtc="2025-10-27T02:40:00Z">
               <w:r>
                 <w:t xml:space="preserve"> is the genetic covariance matrix and </w:t>
               </w:r>
             </w:ins>
             <m:oMath>
               <m:r>
-                <w:ins w:id="623" w:author="Daniel Noble" w:date="2025-10-27T13:40:00Z" w16du:dateUtc="2025-10-27T02:40:00Z">
+                <w:ins w:id="645" w:author="Daniel Noble" w:date="2025-10-27T13:40:00Z" w16du:dateUtc="2025-10-27T02:40:00Z">
                   <m:rPr>
                     <m:sty m:val="b"/>
                   </m:rPr>
@@ -6288,14 +6437,14 @@
                 </w:ins>
               </m:r>
             </m:oMath>
-            <w:ins w:id="624" w:author="Daniel Noble" w:date="2025-10-27T13:40:00Z" w16du:dateUtc="2025-10-27T02:40:00Z">
+            <w:ins w:id="646" w:author="Daniel Noble" w:date="2025-10-27T13:40:00Z" w16du:dateUtc="2025-10-27T02:40:00Z">
               <w:r>
                 <w:t xml:space="preserve"> is the vector of standardised selection gradients that regress each trait on relative fitness (i.e., </w:t>
               </w:r>
             </w:ins>
             <m:oMath>
               <m:r>
-                <w:ins w:id="625" w:author="Daniel Noble" w:date="2025-10-27T13:40:00Z" w16du:dateUtc="2025-10-27T02:40:00Z">
+                <w:ins w:id="647" w:author="Daniel Noble" w:date="2025-10-27T13:40:00Z" w16du:dateUtc="2025-10-27T02:40:00Z">
                   <m:rPr>
                     <m:sty m:val="b"/>
                   </m:rPr>
@@ -6306,7 +6455,7 @@
                 </w:ins>
               </m:r>
               <m:r>
-                <w:ins w:id="626" w:author="Daniel Noble" w:date="2025-10-27T13:40:00Z" w16du:dateUtc="2025-10-27T02:40:00Z">
+                <w:ins w:id="648" w:author="Daniel Noble" w:date="2025-10-27T13:40:00Z" w16du:dateUtc="2025-10-27T02:40:00Z">
                   <m:rPr>
                     <m:sty m:val="p"/>
                   </m:rPr>
@@ -6317,7 +6466,7 @@
                 </w:ins>
               </m:r>
               <m:r>
-                <w:ins w:id="627" w:author="Daniel Noble" w:date="2025-10-27T13:40:00Z" w16du:dateUtc="2025-10-27T02:40:00Z">
+                <w:ins w:id="649" w:author="Daniel Noble" w:date="2025-10-27T13:40:00Z" w16du:dateUtc="2025-10-27T02:40:00Z">
                   <m:rPr>
                     <m:sty m:val="b"/>
                   </m:rPr>
@@ -6328,7 +6477,7 @@
                 </w:ins>
               </m:r>
               <m:r>
-                <w:ins w:id="628" w:author="Daniel Noble" w:date="2025-10-27T13:40:00Z" w16du:dateUtc="2025-10-27T02:40:00Z">
+                <w:ins w:id="650" w:author="Daniel Noble" w:date="2025-10-27T13:40:00Z" w16du:dateUtc="2025-10-27T02:40:00Z">
                   <m:rPr>
                     <m:sty m:val="p"/>
                   </m:rPr>
@@ -6341,7 +6490,7 @@
               <m:sSup>
                 <m:sSupPr>
                   <m:ctrlPr>
-                    <w:ins w:id="629" w:author="Daniel Noble" w:date="2025-10-27T13:40:00Z" w16du:dateUtc="2025-10-27T02:40:00Z">
+                    <w:ins w:id="651" w:author="Daniel Noble" w:date="2025-10-27T13:40:00Z" w16du:dateUtc="2025-10-27T02:40:00Z">
                       <w:rPr>
                         <w:rFonts w:ascii="Cambria Math" w:hAnsi="Cambria Math"/>
                       </w:rPr>
@@ -6350,7 +6499,7 @@
                 </m:sSupPr>
                 <m:e>
                   <m:r>
-                    <w:ins w:id="630" w:author="Daniel Noble" w:date="2025-10-27T13:40:00Z" w16du:dateUtc="2025-10-27T02:40:00Z">
+                    <w:ins w:id="652" w:author="Daniel Noble" w:date="2025-10-27T13:40:00Z" w16du:dateUtc="2025-10-27T02:40:00Z">
                       <m:rPr>
                         <m:sty m:val="b"/>
                       </m:rPr>
@@ -6363,7 +6512,7 @@
                 </m:e>
                 <m:sup>
                   <m:r>
-                    <w:ins w:id="631" w:author="Daniel Noble" w:date="2025-10-27T13:40:00Z" w16du:dateUtc="2025-10-27T02:40:00Z">
+                    <w:ins w:id="653" w:author="Daniel Noble" w:date="2025-10-27T13:40:00Z" w16du:dateUtc="2025-10-27T02:40:00Z">
                       <m:rPr>
                         <m:sty m:val="b"/>
                       </m:rPr>
@@ -6376,7 +6525,7 @@
                 </m:sup>
               </m:sSup>
               <m:r>
-                <w:ins w:id="632" w:author="Daniel Noble" w:date="2025-10-27T13:40:00Z" w16du:dateUtc="2025-10-27T02:40:00Z">
+                <w:ins w:id="654" w:author="Daniel Noble" w:date="2025-10-27T13:40:00Z" w16du:dateUtc="2025-10-27T02:40:00Z">
                   <m:rPr>
                     <m:sty m:val="p"/>
                   </m:rPr>
@@ -6387,7 +6536,7 @@
                 </w:ins>
               </m:r>
               <m:r>
-                <w:ins w:id="633" w:author="Daniel Noble" w:date="2025-10-27T13:40:00Z" w16du:dateUtc="2025-10-27T02:40:00Z">
+                <w:ins w:id="655" w:author="Daniel Noble" w:date="2025-10-27T13:40:00Z" w16du:dateUtc="2025-10-27T02:40:00Z">
                   <m:rPr>
                     <m:sty m:val="b"/>
                   </m:rPr>
@@ -6398,7 +6547,7 @@
                 </w:ins>
               </m:r>
               <m:r>
-                <w:ins w:id="634" w:author="Daniel Noble" w:date="2025-10-27T13:40:00Z" w16du:dateUtc="2025-10-27T02:40:00Z">
+                <w:ins w:id="656" w:author="Daniel Noble" w:date="2025-10-27T13:40:00Z" w16du:dateUtc="2025-10-27T02:40:00Z">
                   <m:rPr>
                     <m:sty m:val="p"/>
                   </m:rPr>
@@ -6409,7 +6558,7 @@
                 </w:ins>
               </m:r>
               <m:r>
-                <w:ins w:id="635" w:author="Daniel Noble" w:date="2025-10-27T13:40:00Z" w16du:dateUtc="2025-10-27T02:40:00Z">
+                <w:ins w:id="657" w:author="Daniel Noble" w:date="2025-10-27T13:40:00Z" w16du:dateUtc="2025-10-27T02:40:00Z">
                   <m:rPr>
                     <m:sty m:val="b"/>
                   </m:rPr>
@@ -6420,9 +6569,46 @@
                 </w:ins>
               </m:r>
             </m:oMath>
-            <w:ins w:id="636" w:author="Daniel Noble" w:date="2025-10-27T13:40:00Z" w16du:dateUtc="2025-10-27T02:40:00Z">
-              <w:r>
-                <w:t xml:space="preserve">; [90]). While the multivariate </w:t>
+            <w:ins w:id="658" w:author="Daniel Noble" w:date="2025-10-27T13:40:00Z" w16du:dateUtc="2025-10-27T02:40:00Z">
+              <w:r>
+                <w:t xml:space="preserve">; [90]). </w:t>
+              </w:r>
+            </w:ins>
+            <w:ins w:id="659" w:author="Daniel Noble" w:date="2025-10-29T09:57:00Z" w16du:dateUtc="2025-10-28T22:57:00Z">
+              <w:r>
+                <w:t>Plasticity can be captured by mapping trait development to the environment and incorporating environmental variability into the Breeders equation</w:t>
+              </w:r>
+            </w:ins>
+            <w:ins w:id="660" w:author="Daniel Noble" w:date="2025-10-29T10:00:00Z" w16du:dateUtc="2025-10-28T23:00:00Z">
+              <w:r>
+                <w:t xml:space="preserve"> (see also, McGlothlin2014)</w:t>
+              </w:r>
+            </w:ins>
+            <w:ins w:id="661" w:author="Daniel Noble" w:date="2025-10-29T09:57:00Z" w16du:dateUtc="2025-10-28T22:57:00Z">
+              <w:r>
+                <w:t>.</w:t>
+              </w:r>
+              <w:r>
+                <w:t xml:space="preserve"> </w:t>
+              </w:r>
+            </w:ins>
+            <w:ins w:id="662" w:author="Daniel Noble" w:date="2025-10-27T13:40:00Z" w16du:dateUtc="2025-10-27T02:40:00Z">
+              <w:r>
+                <w:t xml:space="preserve">While the multivariate breeders equation can be useful for predicting short term evolutionary responses (i.e., one or a few </w:t>
+              </w:r>
+              <w:r>
+                <w:lastRenderedPageBreak/>
+                <w:t>generations) it likely has limited in predictive power over longer timespans because of changes in heritability and selection through time [83,90].</w:t>
+              </w:r>
+            </w:ins>
+            <w:ins w:id="663" w:author="Daniel Noble" w:date="2025-10-29T09:55:00Z" w16du:dateUtc="2025-10-28T22:55:00Z">
+              <w:r>
+                <w:t xml:space="preserve"> </w:t>
+              </w:r>
+            </w:ins>
+            <w:ins w:id="664" w:author="Daniel Noble" w:date="2025-10-29T09:55:00Z">
+              <w:r>
+                <w:t xml:space="preserve">While the multivariate </w:t>
               </w:r>
               <w:proofErr w:type="gramStart"/>
               <w:r>
@@ -6430,7 +6616,7 @@
               </w:r>
               <w:proofErr w:type="gramEnd"/>
               <w:r>
-                <w:t xml:space="preserve"> equation can be useful for predicting short term evolutionary responses (i.e., one or a few generations) it likely has limited in predictive power over longer timespans because of changes in heritability and selection through time [83,90].</w:t>
+                <w:t xml:space="preserve"> equation can be useful for predicting short term evolutionary responses (i.e., one or a few generations) it likely has limited in predictive power over longer timespans because of changes in heritability and selection through time, which is a future challenge [@Walsh2018; @Hoffmann2011]. </w:t>
               </w:r>
             </w:ins>
           </w:p>
@@ -6439,10 +6625,10 @@
               <w:pStyle w:val="BodyText"/>
               <w:spacing w:before="16" w:line="360" w:lineRule="auto"/>
               <w:rPr>
-                <w:del w:id="637" w:author="Daniel Noble" w:date="2025-10-27T13:39:00Z" w16du:dateUtc="2025-10-27T02:39:00Z"/>
+                <w:del w:id="665" w:author="Daniel Noble" w:date="2025-10-27T13:39:00Z" w16du:dateUtc="2025-10-27T02:39:00Z"/>
               </w:rPr>
             </w:pPr>
-            <w:del w:id="638" w:author="Daniel Noble" w:date="2025-10-27T13:39:00Z" w16du:dateUtc="2025-10-27T02:39:00Z">
+            <w:del w:id="666" w:author="Daniel Noble" w:date="2025-10-27T13:39:00Z" w16du:dateUtc="2025-10-27T02:39:00Z">
               <w:r>
                 <w:delText xml:space="preserve">Extreme heat may threaten the services that natural and agricultural ecosystems provide to people [98]. For example, loss of output from production ecosystems will have substantial economic consequences for a local area. Degradation of natural ecosystems may affect their regulating services, such as flood mitigation. Impacts on cultural services may be severe for communities that are closely connected to a landscape </w:delText>
               </w:r>
@@ -6474,10 +6660,10 @@
               <w:pStyle w:val="BodyText"/>
               <w:spacing w:line="360" w:lineRule="auto"/>
               <w:rPr>
-                <w:del w:id="639" w:author="Daniel Noble" w:date="2025-10-27T13:39:00Z" w16du:dateUtc="2025-10-27T02:39:00Z"/>
+                <w:del w:id="667" w:author="Daniel Noble" w:date="2025-10-27T13:39:00Z" w16du:dateUtc="2025-10-27T02:39:00Z"/>
               </w:rPr>
             </w:pPr>
-            <w:del w:id="640" w:author="Daniel Noble" w:date="2025-10-27T13:39:00Z" w16du:dateUtc="2025-10-27T02:39:00Z">
+            <w:del w:id="668" w:author="Daniel Noble" w:date="2025-10-27T13:39:00Z" w16du:dateUtc="2025-10-27T02:39:00Z">
               <w:r>
                 <w:delText>People may respond to the impacts of extreme heat on ecosystems in a variety of ways. Farmers or ecosystem managers may introduce new species, alter management practices or farm remaining unaffected areas more intensively. Thermal stress may ultimately result in people leaving areas, potentially making remaining human communities more vulnerable through loss of resources, services and community [99]. Thermal risks to ecosystems may also precipitate declines in individual wellbeing, and these consequences may accrue differently across regions and peoples [100]. Many of these impacts and responses, however, are poorly understood.</w:delText>
               </w:r>
@@ -6488,10 +6674,10 @@
               <w:pStyle w:val="BodyText"/>
               <w:spacing w:line="360" w:lineRule="auto"/>
               <w:rPr>
-                <w:del w:id="641" w:author="Daniel Noble" w:date="2025-10-27T13:39:00Z" w16du:dateUtc="2025-10-27T02:39:00Z"/>
+                <w:del w:id="669" w:author="Daniel Noble" w:date="2025-10-27T13:39:00Z" w16du:dateUtc="2025-10-27T02:39:00Z"/>
               </w:rPr>
             </w:pPr>
-            <w:del w:id="642" w:author="Daniel Noble" w:date="2025-10-27T13:39:00Z" w16du:dateUtc="2025-10-27T02:39:00Z">
+            <w:del w:id="670" w:author="Daniel Noble" w:date="2025-10-27T13:39:00Z" w16du:dateUtc="2025-10-27T02:39:00Z">
               <w:r>
                 <w:delText>Thermal stress on ecosystems can affect not only local communities but also human dominated systems, such as cities, far away from affected ecosystems. Cities are intrinsically connected to and rely on other regions to maintain their functionality [101,102]. For example, extreme heat stress may affect essential ecosystem services, such as food production [103], which can in turn affect price and access to food for people living in urban centers, with financial, economic and health consequences. The impacts on local agricultural communities could lead to loss of livelihood, pushing people in rural areas to migrate to cities [104]. These external pressures will interact with a system that is already constrained by multiple stressors, including direct impacts imposed by extreme heat and other aspects of climate change such as extreme rainfall and flooding. If sufficiently widespread, economic and political destabilisation may occur as has already been observed in some parts of the world [105].</w:delText>
               </w:r>
@@ -6502,15 +6688,15 @@
               <w:pStyle w:val="BodyText"/>
               <w:spacing w:line="360" w:lineRule="auto"/>
               <w:rPr>
-                <w:del w:id="643" w:author="Daniel Noble" w:date="2025-10-28T13:30:00Z" w16du:dateUtc="2025-10-28T02:30:00Z"/>
+                <w:del w:id="671" w:author="Daniel Noble" w:date="2025-10-28T13:30:00Z" w16du:dateUtc="2025-10-28T02:30:00Z"/>
               </w:rPr>
             </w:pPr>
-            <w:del w:id="644" w:author="Daniel Noble" w:date="2025-10-27T13:38:00Z" w16du:dateUtc="2025-10-27T02:38:00Z">
+            <w:del w:id="672" w:author="Daniel Noble" w:date="2025-10-27T13:38:00Z" w16du:dateUtc="2025-10-27T02:38:00Z">
               <w:r>
                 <w:delText>Understanding the relationships between people and nature requires adopting a social-ecological systems perspective, where people and nature are interdependent and intertwined [106]. Social-ecological models aim to capture social and natural systems along with their interactions</w:delText>
               </w:r>
             </w:del>
-            <w:del w:id="645" w:author="Daniel Noble" w:date="2025-10-27T13:39:00Z" w16du:dateUtc="2025-10-27T02:39:00Z">
+            <w:del w:id="673" w:author="Daniel Noble" w:date="2025-10-27T13:39:00Z" w16du:dateUtc="2025-10-27T02:39:00Z">
               <w:r>
                 <w:delText xml:space="preserve"> [107]. They are conventionally built using process-based modelling frameworks such as agent-based models, dynamical systems models or state-and-transition models [108]. Process-based approaches are critical to understanding how emergent social-ecological phenomena develop [109], such as tipping points, traps or other dynamics. Such models can display complex emergent behavior resulting from interactions within the social-ecological system. For example, responding to decreased productivity from extreme heat by farming more intensively could lead to a maladaptation or ‘lock-in’ from which it is difficult to escape [110].</w:delText>
               </w:r>
@@ -6528,7 +6714,7 @@
             </w:tblGrid>
             <w:tr>
               <w:trPr>
-                <w:del w:id="646" w:author="Daniel Noble" w:date="2025-10-28T13:30:00Z" w16du:dateUtc="2025-10-28T02:30:00Z"/>
+                <w:del w:id="674" w:author="Daniel Noble" w:date="2025-10-28T13:30:00Z"/>
               </w:trPr>
               <w:tc>
                 <w:tcPr>
@@ -6540,11 +6726,11 @@
                     <w:spacing w:line="360" w:lineRule="auto"/>
                     <w:jc w:val="center"/>
                     <w:rPr>
-                      <w:del w:id="647" w:author="Daniel Noble" w:date="2025-10-27T13:38:00Z" w16du:dateUtc="2025-10-27T02:38:00Z"/>
+                      <w:del w:id="675" w:author="Daniel Noble" w:date="2025-10-27T13:38:00Z" w16du:dateUtc="2025-10-27T02:38:00Z"/>
                     </w:rPr>
                   </w:pPr>
-                  <w:bookmarkStart w:id="648" w:name="fig-box3"/>
-                  <w:del w:id="649" w:author="Daniel Noble" w:date="2025-10-27T13:38:00Z" w16du:dateUtc="2025-10-27T02:38:00Z">
+                  <w:bookmarkStart w:id="676" w:name="fig-box3"/>
+                  <w:del w:id="677" w:author="Daniel Noble" w:date="2025-10-27T13:38:00Z" w16du:dateUtc="2025-10-27T02:38:00Z">
                     <w:r>
                       <w:rPr>
                         <w:noProof/>
@@ -6598,10 +6784,10 @@
                     <w:pStyle w:val="ImageCaption"/>
                     <w:spacing w:before="200" w:line="360" w:lineRule="auto"/>
                     <w:rPr>
-                      <w:del w:id="650" w:author="Daniel Noble" w:date="2025-10-28T13:30:00Z" w16du:dateUtc="2025-10-28T02:30:00Z"/>
+                      <w:del w:id="678" w:author="Daniel Noble" w:date="2025-10-28T13:30:00Z" w16du:dateUtc="2025-10-28T02:30:00Z"/>
                     </w:rPr>
                   </w:pPr>
-                  <w:del w:id="651" w:author="Daniel Noble" w:date="2025-10-27T13:38:00Z" w16du:dateUtc="2025-10-27T02:38:00Z">
+                  <w:del w:id="679" w:author="Daniel Noble" w:date="2025-10-27T13:38:00Z" w16du:dateUtc="2025-10-27T02:38:00Z">
                     <w:r>
                       <w:rPr>
                         <w:b/>
@@ -6625,12 +6811,12 @@
                   </w:del>
                 </w:p>
               </w:tc>
-              <w:bookmarkEnd w:id="648"/>
+              <w:bookmarkEnd w:id="676"/>
             </w:tr>
           </w:tbl>
           <w:p>
             <w:pPr>
-              <w:spacing w:after="0" w:line="360" w:lineRule="auto"/>
+              <w:spacing w:line="360" w:lineRule="auto"/>
             </w:pPr>
           </w:p>
         </w:tc>
@@ -6641,9 +6827,10 @@
         <w:pStyle w:val="Heading1"/>
         <w:spacing w:line="360" w:lineRule="auto"/>
       </w:pPr>
-      <w:bookmarkStart w:id="652" w:name="hot-solutions-for-a-changing-world"/>
-      <w:bookmarkEnd w:id="542"/>
-      <w:r>
+      <w:bookmarkStart w:id="680" w:name="hot-solutions-for-a-changing-world"/>
+      <w:bookmarkEnd w:id="548"/>
+      <w:r>
+        <w:lastRenderedPageBreak/>
         <w:t>‘Hot’ solutions for a changing world</w:t>
       </w:r>
     </w:p>
@@ -6652,7 +6839,7 @@
         <w:pStyle w:val="FirstParagraph"/>
         <w:spacing w:line="360" w:lineRule="auto"/>
       </w:pPr>
-      <w:ins w:id="653" w:author="Daniel Noble" w:date="2025-10-28T14:39:00Z" w16du:dateUtc="2025-10-28T03:39:00Z">
+      <w:ins w:id="681" w:author="Daniel Noble" w:date="2025-10-28T14:39:00Z" w16du:dateUtc="2025-10-28T03:39:00Z">
         <w:r>
           <w:t>E</w:t>
         </w:r>
@@ -6666,7 +6853,7 @@
           <w:t xml:space="preserve"> </w:t>
         </w:r>
       </w:ins>
-      <w:del w:id="654" w:author="Daniel Noble" w:date="2025-10-28T14:39:00Z" w16du:dateUtc="2025-10-28T03:39:00Z">
+      <w:del w:id="682" w:author="Daniel Noble" w:date="2025-10-28T14:39:00Z" w16du:dateUtc="2025-10-28T03:39:00Z">
         <w:r>
           <w:delText>Extreme heat will have dramatic and widespread effects on the socioecological systems that humans rely upon (</w:delText>
         </w:r>
@@ -6682,42 +6869,167 @@
         </w:r>
       </w:del>
       <w:r>
-        <w:t xml:space="preserve"> For example, under current global climate change scenarios, each degree Celsius increase </w:t>
-      </w:r>
-      <w:r>
-        <w:lastRenderedPageBreak/>
-        <w:t xml:space="preserve">in global mean temperature is estimated to reduce the global yield of wheat by 6.0% and soybean by 3.1% [103], exacerbating food shortages. A systems modelling approach can provide us with quantitative tools to make informed predictions, plan interventions and evaluate various scenarios for mitigating the impacts of extreme heat. For example, microclimate and biophysical models can allow for informed predictions about how to mitigate heat stress to crops (e.g. with irrigation interventions), while also considering how such interventions impact pests and beneficial insects (see </w:t>
-      </w:r>
-      <w:hyperlink w:anchor="fig-2">
+        <w:t xml:space="preserve"> For example, under current global climate change scenarios, each degree Celsius increase in global mean temperature is estimated to reduce the global yield of wheat by 6.0% and soybean by 3.1% [103], exacerbating food shortages. </w:t>
+      </w:r>
+      <w:ins w:id="683" w:author="Daniel Noble" w:date="2025-10-29T12:16:00Z" w16du:dateUtc="2025-10-29T01:16:00Z">
+        <w:r>
+          <w:t xml:space="preserve">A systems-modelling approach can help us better understand and predict the varied consequences of interventions to make informed predictions, adjust interventions and evaluate various scenarios for mitigating the impacts of extreme heat in real world situations. </w:t>
+        </w:r>
+      </w:ins>
+      <w:del w:id="684" w:author="Daniel Noble" w:date="2025-10-29T12:16:00Z" w16du:dateUtc="2025-10-29T01:16:00Z">
+        <w:r>
+          <w:delText>A systems modelling approach can provide us with quantitative tools to make informed predictions, plan interventions and evaluate various scenarios for mitigating the impacts of extreme heat.</w:delText>
+        </w:r>
+      </w:del>
+      <w:r>
+        <w:t xml:space="preserve"> </w:t>
+      </w:r>
+      <w:ins w:id="685" w:author="Daniel Noble" w:date="2025-10-29T12:21:00Z" w16du:dateUtc="2025-10-29T01:21:00Z">
+        <w:r>
+          <w:t>A systems-modelling approach can help us develop suitable interventions, predict the varied consequences of such interventions, and allow for adjustments that can improve decision making for mitigating the impacts of extreme heat in real world situations. Using our case study (</w:t>
+        </w:r>
+        <w:r>
+          <w:rPr>
+            <w:b/>
+            <w:bCs/>
+            <w:rPrChange w:id="686" w:author="Daniel Noble" w:date="2025-10-29T12:21:00Z" w16du:dateUtc="2025-10-29T01:21:00Z">
+              <w:rPr/>
+            </w:rPrChange>
+          </w:rPr>
+          <w:t>Boxes 1 &amp; 2</w:t>
+        </w:r>
+        <w:r>
+          <w:t xml:space="preserve">) as a simple example, a systems modelling approach can allow for informed predictions about how to mitigate heat stress to crops while also considering the potential for pest outbreaks. In essence, we want to add a minimal amount of water to a system to cool leaves to avoid depleting limited water supplies while preventing microclimate conditions from becoming more optimal for pests. Making use of real weather data to predict microclimates and organism temperatures we could then assess how adding </w:t>
+        </w:r>
+        <w:proofErr w:type="gramStart"/>
+        <w:r>
+          <w:t>2, 5, 10, or 20 mm</w:t>
+        </w:r>
+        <w:proofErr w:type="gramEnd"/>
+        <w:r>
+          <w:t xml:space="preserve"> d</w:t>
+        </w:r>
+        <w:r>
+          <w:rPr>
+            <w:vertAlign w:val="superscript"/>
+            <w:rPrChange w:id="687" w:author="Daniel Noble" w:date="2025-10-29T12:21:00Z" w16du:dateUtc="2025-10-29T01:21:00Z">
+              <w:rPr/>
+            </w:rPrChange>
+          </w:rPr>
+          <w:t>-1</w:t>
+        </w:r>
+        <w:r>
+          <w:t xml:space="preserve"> of water to the system affects leaf temperature and the life-</w:t>
+        </w:r>
+        <w:proofErr w:type="spellStart"/>
+        <w:r>
+          <w:t>cyles</w:t>
+        </w:r>
+        <w:proofErr w:type="spellEnd"/>
+        <w:r>
+          <w:t xml:space="preserve"> of pests. In our simple example, we can see that adding 5 mm of water can result in a 3.63°C decrease in leaf temperature. Adding more water does not result in significant gains in cooling (see @fig-2). In </w:t>
+        </w:r>
+        <w:proofErr w:type="spellStart"/>
+        <w:r>
+          <w:t>additon</w:t>
+        </w:r>
+        <w:proofErr w:type="spellEnd"/>
+        <w:r>
+          <w:t>, assuming we would add 5 mm d</w:t>
+        </w:r>
+        <w:r>
+          <w:rPr>
+            <w:vertAlign w:val="superscript"/>
+          </w:rPr>
+          <w:t>-1</w:t>
+        </w:r>
+        <w:r>
+          <w:t xml:space="preserve"> each season during heatwave events, grasshopper populations would be suppressed over time whereas adding 2 mm d</w:t>
+        </w:r>
+        <w:r>
+          <w:rPr>
+            <w:vertAlign w:val="superscript"/>
+          </w:rPr>
+          <w:t>-1</w:t>
+        </w:r>
+        <w:r>
+          <w:t>results in grasshopper population growth, leading to potential heatwave associated outbreaks. Here, the optimal solution is adding 5 mm d^-1^ of water to both cool plants and protect them from pests.</w:t>
+        </w:r>
+        <w:r>
+          <w:t xml:space="preserve"> </w:t>
+        </w:r>
+      </w:ins>
+      <w:del w:id="688" w:author="Daniel Noble" w:date="2025-10-29T12:21:00Z" w16du:dateUtc="2025-10-29T01:21:00Z">
+        <w:r>
+          <w:delText xml:space="preserve">For example, microclimate and biophysical models can allow for informed predictions about how to mitigate heat stress to crops (e.g. with irrigation interventions), while also considering how such interventions impact pests and beneficial insects (see </w:delText>
+        </w:r>
+        <w:r>
+          <w:fldChar w:fldCharType="begin"/>
+        </w:r>
+        <w:r>
+          <w:delInstrText>HYPERLINK \l "fig-2" \h</w:delInstrText>
+        </w:r>
+        <w:r>
+          <w:fldChar w:fldCharType="separate"/>
+        </w:r>
         <w:r>
           <w:rPr>
             <w:rStyle w:val="Hyperlink"/>
           </w:rPr>
-          <w:t>Figure 4</w:t>
-        </w:r>
-      </w:hyperlink>
-      <w:r>
-        <w:t xml:space="preserve"> and Case Study 4 &amp; 5 in the </w:t>
-      </w:r>
-      <w:hyperlink r:id="rId12">
+          <w:delText>Figure 4</w:delText>
+        </w:r>
+        <w:r>
+          <w:fldChar w:fldCharType="end"/>
+        </w:r>
+        <w:r>
+          <w:delText xml:space="preserve"> and Case Study 4 &amp; 5 in the </w:delText>
+        </w:r>
+        <w:r>
+          <w:fldChar w:fldCharType="begin"/>
+        </w:r>
+        <w:r>
+          <w:delInstrText>HYPERLINK "https://daniel1noble.github.io/thermal_tol_interactions/" \h</w:delInstrText>
+        </w:r>
+        <w:r>
+          <w:fldChar w:fldCharType="separate"/>
+        </w:r>
         <w:r>
           <w:rPr>
             <w:rStyle w:val="Hyperlink"/>
             <w:i/>
             <w:iCs/>
           </w:rPr>
-          <w:t>Supplementary Online Material</w:t>
-        </w:r>
-      </w:hyperlink>
-      <w:r>
-        <w:t>). Identifying and/or modifying the thermal suitability of landscapes to benefit plants and animals under extreme heat shows immense promise [18]. Additionally, as our understanding of the mechanisms associated with heat tolerance improve, genetic tools, environmental manipulations and artificial breeding can be used to enhance thermal tolerance creating more resilience to extreme heat events [e.g., 56]</w:t>
-      </w:r>
-      <w:ins w:id="655" w:author="Daniel Noble" w:date="2025-10-28T14:39:00Z" w16du:dateUtc="2025-10-28T03:39:00Z">
+          <w:delText>Supplementary Online Material</w:delText>
+        </w:r>
+        <w:r>
+          <w:fldChar w:fldCharType="end"/>
+        </w:r>
+        <w:r>
+          <w:delText xml:space="preserve">). </w:delText>
+        </w:r>
+      </w:del>
+      <w:r>
+        <w:t xml:space="preserve">Identifying and/or modifying the thermal suitability of landscapes to benefit plants and animals under extreme heat </w:t>
+      </w:r>
+      <w:ins w:id="689" w:author="Daniel Noble" w:date="2025-10-29T12:22:00Z" w16du:dateUtc="2025-10-29T01:22:00Z">
+        <w:r>
+          <w:t xml:space="preserve">is a promising feature of a systems-thinking approach </w:t>
+        </w:r>
+      </w:ins>
+      <w:del w:id="690" w:author="Daniel Noble" w:date="2025-10-29T12:22:00Z" w16du:dateUtc="2025-10-29T01:22:00Z">
+        <w:r>
+          <w:delText xml:space="preserve">shows immense promise </w:delText>
+        </w:r>
+      </w:del>
+      <w:r>
+        <w:t>[18]. Additionally, as our understanding of the mechanisms associated with heat tolerance improve, genetic tools, environmental manipulations and artificial breeding can be used to enhance thermal tolerance creating more resilience to extreme heat events [e.g., 56]</w:t>
+      </w:r>
+      <w:ins w:id="691" w:author="Daniel Noble" w:date="2025-10-28T14:39:00Z" w16du:dateUtc="2025-10-28T03:39:00Z">
         <w:r>
           <w:t>.</w:t>
         </w:r>
       </w:ins>
-      <w:del w:id="656" w:author="Daniel Noble" w:date="2025-10-28T14:39:00Z" w16du:dateUtc="2025-10-28T03:39:00Z">
+      <w:del w:id="692" w:author="Daniel Noble" w:date="2025-10-28T14:39:00Z" w16du:dateUtc="2025-10-28T03:39:00Z">
         <w:r>
           <w:delText>,</w:delText>
         </w:r>
@@ -6725,12 +7037,7 @@
       <w:r>
         <w:t xml:space="preserve"> </w:t>
       </w:r>
-      <w:ins w:id="657" w:author="Daniel Noble" w:date="2025-10-28T14:40:00Z" w16du:dateUtc="2025-10-28T03:40:00Z">
-        <w:r>
-          <w:t>Systems-based models can help us better understand and predict the varied consequences of such interventions by providing a calculated understanding of the viability of such approaches in real world situations.</w:t>
-        </w:r>
-      </w:ins>
-      <w:del w:id="658" w:author="Daniel Noble" w:date="2025-10-28T14:40:00Z" w16du:dateUtc="2025-10-28T03:40:00Z">
+      <w:del w:id="693" w:author="Daniel Noble" w:date="2025-10-28T14:40:00Z" w16du:dateUtc="2025-10-28T03:40:00Z">
         <w:r>
           <w:delText>although the extent to which resilience can be actively manipulated remains unknown in many species. Integrating these solutions into a systems modelling framework will then allow for a calculated understanding of the viability of such approaches in real world situations.</w:delText>
         </w:r>
@@ -6757,11 +7064,12 @@
               <w:spacing w:line="360" w:lineRule="auto"/>
               <w:jc w:val="center"/>
             </w:pPr>
-            <w:bookmarkStart w:id="659" w:name="fig-2"/>
+            <w:bookmarkStart w:id="694" w:name="fig-2"/>
             <w:r>
               <w:rPr>
                 <w:noProof/>
               </w:rPr>
+              <w:lastRenderedPageBreak/>
               <w:drawing>
                 <wp:inline distT="0" distB="0" distL="0" distR="0" wp14:anchorId="767E8307" wp14:editId="2059A764">
                   <wp:extent cx="6554470" cy="2884170"/>
@@ -6778,7 +7086,7 @@
                           <pic:cNvPicPr/>
                         </pic:nvPicPr>
                         <pic:blipFill>
-                          <a:blip r:embed="rId13" cstate="print">
+                          <a:blip r:embed="rId12" cstate="print">
                             <a:extLst>
                               <a:ext uri="{28A0092B-C50C-407E-A947-70E740481C1C}">
                                 <a14:useLocalDpi xmlns:a14="http://schemas.microsoft.com/office/drawing/2010/main" val="0"/>
@@ -6818,11 +7126,7 @@
               <w:t>Figure 4- How a systems modelling approach to extreme heat can be used to inform solutions.</w:t>
             </w:r>
             <w:r>
-              <w:t xml:space="preserve"> A hypothetical example of an insect-plant interaction. (A) To counteract an extreme heat wave event, different watering scenarios to cool plants of agricultural importance during heat stress could be applied. Of critical importance is understanding how much water to apply to a system to keep plants cool while minimizing: 1) water use, given that heat waves are often associated with extreme drought conditions and 2) pest outbreaks, given watering may create more ideal conditions for pest insects. (B) We can obtain actual or predicted future climate data from weather stations or climate models for rainfall and create alternative scenarios where rainfall layers are manipulated by modifying the watering regimes during a </w:t>
-            </w:r>
-            <w:r>
-              <w:lastRenderedPageBreak/>
-              <w:t xml:space="preserve">heatwave event. We could then assess how adding </w:t>
+              <w:t xml:space="preserve"> A hypothetical example of an insect-plant interaction. (A) To counteract an extreme heat wave event, different watering scenarios to cool plants of agricultural importance during heat stress could be applied. Of critical importance is understanding how much water to apply to a system to keep plants cool while minimizing: 1) water use, given that heat waves are often associated with extreme drought conditions and 2) pest outbreaks, given watering may create more ideal conditions for pest insects. (B) We can obtain actual or predicted future climate data from weather stations or climate models for rainfall and create alternative scenarios where rainfall layers are manipulated by modifying the watering regimes during a heatwave event. We could then assess how adding </w:t>
             </w:r>
             <w:proofErr w:type="gramStart"/>
             <w:r>
@@ -6901,7 +7205,11 @@
               </m:sSub>
             </m:oMath>
             <w:r>
-              <w:t xml:space="preserve">) for the pest under the different watering scenarios. (E) Using estimates of intrinsic growth rate we can then estimate the population growth rate of grasshoppers using a simple Ricker’s population growth model applied to the different scenarios. Assuming we would add 5 mm </w:t>
+              <w:t xml:space="preserve">) for the pest under the different watering scenarios. (E) Using estimates of intrinsic </w:t>
+            </w:r>
+            <w:r>
+              <w:lastRenderedPageBreak/>
+              <w:t xml:space="preserve">growth rate we can then estimate the population growth rate of grasshoppers using a simple Ricker’s population growth model applied to the different scenarios. Assuming we would add 5 mm </w:t>
             </w:r>
             <w:r>
               <w:t>d</w:t>
@@ -6950,7 +7258,7 @@
             </w:r>
           </w:p>
         </w:tc>
-        <w:bookmarkEnd w:id="659"/>
+        <w:bookmarkEnd w:id="694"/>
       </w:tr>
     </w:tbl>
     <w:tbl>
@@ -7107,8 +7415,8 @@
         <w:pStyle w:val="Heading1"/>
         <w:spacing w:line="360" w:lineRule="auto"/>
       </w:pPr>
-      <w:bookmarkStart w:id="660" w:name="concluding-remarks"/>
-      <w:bookmarkEnd w:id="652"/>
+      <w:bookmarkStart w:id="695" w:name="concluding-remarks"/>
+      <w:bookmarkEnd w:id="680"/>
       <w:r>
         <w:t>Concluding Remarks</w:t>
       </w:r>
@@ -7118,11 +7426,10 @@
         <w:pStyle w:val="FirstParagraph"/>
         <w:spacing w:line="360" w:lineRule="auto"/>
         <w:rPr>
-          <w:ins w:id="661" w:author="Daniel Noble" w:date="2025-10-28T14:41:00Z"/>
-          <w:lang w:val="en-AU"/>
-        </w:rPr>
-      </w:pPr>
-      <w:del w:id="662" w:author="Daniel Noble" w:date="2025-10-28T14:41:00Z" w16du:dateUtc="2025-10-28T03:41:00Z">
+          <w:ins w:id="696" w:author="Daniel Noble" w:date="2025-10-28T14:41:00Z"/>
+        </w:rPr>
+      </w:pPr>
+      <w:del w:id="697" w:author="Daniel Noble" w:date="2025-10-28T14:41:00Z" w16du:dateUtc="2025-10-28T03:41:00Z">
         <w:r>
           <w:delText xml:space="preserve">We have discussed ways in which a better understanding of the impacts of extreme heat on plant and animal systems can be captured through the coupling of models from diverse research fields – models that translate the effects of atmospheric conditions to the biophysical experiences of organisms and how this then scales up to impact individuals, populations and communities. As part of demonstrating the ways in which these models can be coupled, we have developed a series of case studies to show how a systems modelling framework can be approached (see </w:delText>
         </w:r>
@@ -7166,147 +7473,182 @@
           <w:delText>understanding of the impacts that extreme heat will have on organisms, populations, and communities along with how to mitigate these impacts to preserve diverse systems now and into the future.</w:delText>
         </w:r>
       </w:del>
-      <w:ins w:id="663" w:author="Daniel Noble" w:date="2025-10-28T14:41:00Z">
-        <w:r>
-          <w:rPr>
-            <w:lang w:val="en-AU"/>
-          </w:rPr>
+      <w:ins w:id="698" w:author="Daniel Noble" w:date="2025-10-28T14:41:00Z">
+        <w:r>
           <w:t xml:space="preserve">Implementing a systems-modelling approach will no doubt be challenging, particularly for complex communities, and knowledge gaps remain (see </w:t>
         </w:r>
         <w:r>
           <w:rPr>
             <w:b/>
             <w:bCs/>
-            <w:lang w:val="en-AU"/>
           </w:rPr>
           <w:t>Outstanding Questions</w:t>
         </w:r>
         <w:r>
-          <w:rPr>
-            <w:lang w:val="en-AU"/>
-          </w:rPr>
           <w:t>). However, more mechanistic approaches that encapsulate key biological processes (physiology, behaviour, phenology, species interactions and eco</w:t>
         </w:r>
       </w:ins>
-      <w:ins w:id="664" w:author="Daniel Noble" w:date="2025-10-28T14:41:00Z" w16du:dateUtc="2025-10-28T03:41:00Z">
-        <w:r>
-          <w:rPr>
-            <w:lang w:val="en-AU"/>
-          </w:rPr>
+      <w:ins w:id="699" w:author="Daniel Noble" w:date="2025-10-28T14:41:00Z" w16du:dateUtc="2025-10-28T03:41:00Z">
+        <w:r>
           <w:t>-</w:t>
         </w:r>
       </w:ins>
-      <w:ins w:id="665" w:author="Daniel Noble" w:date="2025-10-28T14:41:00Z">
-        <w:r>
-          <w:rPr>
-            <w:lang w:val="en-AU"/>
-          </w:rPr>
+      <w:ins w:id="700" w:author="Daniel Noble" w:date="2025-10-28T14:41:00Z">
+        <w:r>
           <w:t>evolutionary dynamics</w:t>
         </w:r>
       </w:ins>
-      <w:ins w:id="666" w:author="Daniel Noble" w:date="2025-10-28T14:41:00Z" w16du:dateUtc="2025-10-28T03:41:00Z">
-        <w:r>
-          <w:rPr>
-            <w:lang w:val="en-AU"/>
-          </w:rPr>
+      <w:ins w:id="701" w:author="Daniel Noble" w:date="2025-10-28T14:41:00Z" w16du:dateUtc="2025-10-28T03:41:00Z">
+        <w:r>
           <w:t xml:space="preserve"> – </w:t>
         </w:r>
         <w:r>
           <w:rPr>
             <w:b/>
             <w:bCs/>
-            <w:lang w:val="en-AU"/>
-            <w:rPrChange w:id="667" w:author="Daniel Noble" w:date="2025-10-28T14:41:00Z" w16du:dateUtc="2025-10-28T03:41:00Z">
-              <w:rPr>
-                <w:lang w:val="en-AU"/>
-              </w:rPr>
+            <w:rPrChange w:id="702" w:author="Daniel Noble" w:date="2025-10-28T14:41:00Z" w16du:dateUtc="2025-10-28T03:41:00Z">
+              <w:rPr/>
             </w:rPrChange>
           </w:rPr>
           <w:t>Box 3</w:t>
         </w:r>
       </w:ins>
-      <w:ins w:id="668" w:author="Daniel Noble" w:date="2025-10-28T14:41:00Z">
+      <w:ins w:id="703" w:author="Daniel Noble" w:date="2025-10-28T14:41:00Z">
+        <w:r>
+          <w:t xml:space="preserve">) are needed now, more than ever, to better predict biological responses to extreme heat [@Urban2016; @Martinez-De_Leon2024]. Coupled mechanistic models within and across species are expected to have improved predictive power when extrapolated to new conditions and can help better integrate interacting processes [@Urban2016; @Briscoe2023]. Nonetheless, a systems modelling approach will require a solid foundation of species natural history, diverse modelling expertise, and a concerted effort to collect and collate trait and environmental data for model building and validation. </w:t>
+        </w:r>
+        <w:r>
+          <w:lastRenderedPageBreak/>
+          <w:t>However, there are exciting new tools and data that are making overcoming these challenges more feasible [@Maclean2019], and careful consideration of the key processes important to a system can help alleviate these challenges [@Briscoe2023]. For example, large databases of physiological traits for both plants and animals now exist [e.g., @Kattge2020</w:t>
+        </w:r>
+      </w:ins>
+      <w:ins w:id="704" w:author="Daniel Noble" w:date="2025-10-29T11:43:00Z" w16du:dateUtc="2025-10-29T00:43:00Z">
+        <w:r>
+          <w:t xml:space="preserve"> </w:t>
+        </w:r>
+        <w:r>
+          <w:t>@Leiva2025] and advanced missing data approaches</w:t>
+        </w:r>
+      </w:ins>
+      <w:ins w:id="705" w:author="Daniel Noble" w:date="2025-10-28T14:41:00Z">
+        <w:r>
+          <w:t xml:space="preserve"> can help estimate likely parameters for data deficient species [e.g., @Bruggeman2009]. </w:t>
+        </w:r>
+      </w:ins>
+      <w:ins w:id="706" w:author="Daniel Noble" w:date="2025-10-29T09:39:00Z" w16du:dateUtc="2025-10-28T22:39:00Z">
+        <w:r>
+          <w:t xml:space="preserve">In addition, ever more sophisticated and powerful computational pipelines (e.g. </w:t>
+        </w:r>
+        <w:proofErr w:type="spellStart"/>
         <w:r>
           <w:rPr>
-            <w:lang w:val="en-AU"/>
+            <w:i/>
+            <w:iCs/>
+            <w:rPrChange w:id="707" w:author="Daniel Noble" w:date="2025-10-29T09:39:00Z" w16du:dateUtc="2025-10-28T22:39:00Z">
+              <w:rPr/>
+            </w:rPrChange>
           </w:rPr>
-          <w:t xml:space="preserve">) are needed now, more than ever, to better predict biological responses to extreme heat [@Urban2016; @Martinez-De_Leon2024]. Coupled mechanistic models within and across species are expected to have improved predictive power when extrapolated to new conditions and can help better integrate interacting processes [@Urban2016; @Briscoe2023]. Nonetheless, a systems modelling approach will require a solid foundation of species natural history, diverse modelling expertise, and a concerted effort to collect and collate trait and environmental data for model building and validation. As such, a systems-modelling approach is likely to apply to smaller communities of interacting species (e.g. agricultural communities) more easily than natural ecosystems. However, there are exciting new tools and data that are making overcoming these challenges more feasible [@Maclean2019], and careful consideration of the key processes important to a system can help alleviate these challenges [@Briscoe2023]. For example, large databases of physiological traits for both plants and animals now exist [e.g., @Kattge2020] and new missing data approaches can help estimate likely parameters for data deficient species [e.g., </w:t>
-        </w:r>
+          <w:t>NicheMapR</w:t>
+        </w:r>
+        <w:proofErr w:type="spellEnd"/>
+        <w:r>
+          <w:t xml:space="preserve">, </w:t>
+        </w:r>
+        <w:proofErr w:type="spellStart"/>
         <w:r>
           <w:rPr>
-            <w:lang w:val="en-AU"/>
+            <w:i/>
+            <w:iCs/>
+            <w:rPrChange w:id="708" w:author="Daniel Noble" w:date="2025-10-29T09:39:00Z" w16du:dateUtc="2025-10-28T22:39:00Z">
+              <w:rPr/>
+            </w:rPrChange>
           </w:rPr>
-          <w:lastRenderedPageBreak/>
-          <w:t xml:space="preserve">@Bruggeman2009]. In addition, starting with a simpler model and adding complexity as needed can make building systems models more tractable [@Briscoe2023]. Even simple models that compare counterfactual scenarios </w:t>
-        </w:r>
-      </w:ins>
-      <w:ins w:id="669" w:author="Daniel Noble" w:date="2025-10-28T15:26:00Z" w16du:dateUtc="2025-10-28T04:26:00Z">
+          <w:t>TrenchR</w:t>
+        </w:r>
+        <w:proofErr w:type="spellEnd"/>
+        <w:r>
+          <w:t xml:space="preserve">, </w:t>
+        </w:r>
         <w:r>
           <w:rPr>
-            <w:lang w:val="en-AU"/>
+            <w:i/>
+            <w:iCs/>
+            <w:rPrChange w:id="709" w:author="Daniel Noble" w:date="2025-10-29T09:39:00Z" w16du:dateUtc="2025-10-28T22:39:00Z">
+              <w:rPr/>
+            </w:rPrChange>
           </w:rPr>
+          <w:t>mcera5</w:t>
+        </w:r>
+        <w:r>
+          <w:t xml:space="preserve">, </w:t>
+        </w:r>
+        <w:proofErr w:type="spellStart"/>
+        <w:r>
+          <w:rPr>
+            <w:i/>
+            <w:iCs/>
+            <w:rPrChange w:id="710" w:author="Daniel Noble" w:date="2025-10-29T09:39:00Z" w16du:dateUtc="2025-10-28T22:39:00Z">
+              <w:rPr/>
+            </w:rPrChange>
+          </w:rPr>
+          <w:t>terra</w:t>
+        </w:r>
+        <w:r>
+          <w:t xml:space="preserve"> in</w:t>
+        </w:r>
+        <w:proofErr w:type="spellEnd"/>
+        <w:r>
+          <w:t xml:space="preserve"> R) make it easier to implement and connect models. Model selection and validation are important steps in any modelling process and will be more complicated when applied to entire systems. However, starting with a simpler model, validating predictions with empirical data and then adding complexity as needed can make building systems models more tractabl</w:t>
+        </w:r>
+        <w:r>
+          <w:t>e</w:t>
+        </w:r>
+        <w:r>
+          <w:t xml:space="preserve"> </w:t>
+        </w:r>
+      </w:ins>
+      <w:ins w:id="711" w:author="Daniel Noble" w:date="2025-10-28T14:41:00Z">
+        <w:r>
+          <w:t xml:space="preserve">[@Briscoe2023]. Even simple models that compare counterfactual scenarios </w:t>
+        </w:r>
+      </w:ins>
+      <w:ins w:id="712" w:author="Daniel Noble" w:date="2025-10-28T15:26:00Z" w16du:dateUtc="2025-10-28T04:26:00Z">
+        <w:r>
           <w:t>may</w:t>
         </w:r>
       </w:ins>
-      <w:ins w:id="670" w:author="Daniel Noble" w:date="2025-10-28T14:41:00Z">
-        <w:r>
-          <w:rPr>
-            <w:lang w:val="en-AU"/>
-          </w:rPr>
+      <w:ins w:id="713" w:author="Daniel Noble" w:date="2025-10-28T14:41:00Z">
+        <w:r>
           <w:t xml:space="preserve"> provide important quantitative insights into the impacts of extreme heat on organisms, populations and communities</w:t>
         </w:r>
       </w:ins>
-      <w:ins w:id="671" w:author="Daniel Noble" w:date="2025-10-28T15:26:00Z" w16du:dateUtc="2025-10-28T04:26:00Z">
-        <w:r>
-          <w:rPr>
-            <w:lang w:val="en-AU"/>
-          </w:rPr>
+      <w:ins w:id="714" w:author="Daniel Noble" w:date="2025-10-28T15:26:00Z" w16du:dateUtc="2025-10-28T04:26:00Z">
+        <w:r>
           <w:t xml:space="preserve"> </w:t>
         </w:r>
         <w:r>
-          <w:rPr>
-            <w:lang w:val="en-AU"/>
-          </w:rPr>
           <w:t>[@Dudney2025; @Carroll2023; @Dornhaus2022]</w:t>
         </w:r>
       </w:ins>
-      <w:ins w:id="672" w:author="Daniel Noble" w:date="2025-10-28T14:41:00Z">
-        <w:r>
-          <w:rPr>
-            <w:lang w:val="en-AU"/>
-          </w:rPr>
+      <w:ins w:id="715" w:author="Daniel Noble" w:date="2025-10-28T14:41:00Z">
+        <w:r>
           <w:t xml:space="preserve">. Such insights can form the basis for prediction-driven solutions for mitigating the impacts of extreme heat on biodiversity. By working collaboratively and </w:t>
         </w:r>
         <w:proofErr w:type="spellStart"/>
         <w:r>
-          <w:rPr>
-            <w:lang w:val="en-AU"/>
-          </w:rPr>
           <w:t>integratively</w:t>
         </w:r>
         <w:proofErr w:type="spellEnd"/>
         <w:r>
-          <w:rPr>
-            <w:lang w:val="en-AU"/>
-          </w:rPr>
           <w:t xml:space="preserve"> we can develop a more quantitative and predictive understanding of the impacts that extreme heat will have on organisms, populations, and communities along with how to mitigate these impacts to preserve diverse systems now and into the future.</w:t>
         </w:r>
       </w:ins>
     </w:p>
     <w:p>
       <w:pPr>
-        <w:pStyle w:val="FirstParagraph"/>
-        <w:spacing w:line="360" w:lineRule="auto"/>
-        <w:rPr>
-          <w:ins w:id="673" w:author="Daniel Noble" w:date="2025-10-27T13:38:00Z" w16du:dateUtc="2025-10-27T02:38:00Z"/>
-        </w:rPr>
-      </w:pPr>
-    </w:p>
-    <w:p>
-      <w:pPr>
         <w:pStyle w:val="BodyText"/>
         <w:rPr>
-          <w:ins w:id="674" w:author="Daniel Noble" w:date="2025-10-27T13:38:00Z" w16du:dateUtc="2025-10-27T02:38:00Z"/>
+          <w:ins w:id="716" w:author="Daniel Noble" w:date="2025-10-27T13:38:00Z" w16du:dateUtc="2025-10-27T02:38:00Z"/>
         </w:rPr>
       </w:pPr>
     </w:p>
@@ -7314,9 +7656,9 @@
       <w:pPr>
         <w:pStyle w:val="BodyText"/>
         <w:rPr>
-          <w:del w:id="675" w:author="Daniel Noble" w:date="2025-10-28T14:40:00Z" w16du:dateUtc="2025-10-28T03:40:00Z"/>
-        </w:rPr>
-        <w:pPrChange w:id="676" w:author="Daniel Noble" w:date="2025-10-27T13:38:00Z" w16du:dateUtc="2025-10-27T02:38:00Z">
+          <w:del w:id="717" w:author="Daniel Noble" w:date="2025-10-28T14:40:00Z" w16du:dateUtc="2025-10-28T03:40:00Z"/>
+        </w:rPr>
+        <w:pPrChange w:id="718" w:author="Daniel Noble" w:date="2025-10-27T13:38:00Z" w16du:dateUtc="2025-10-27T02:38:00Z">
           <w:pPr>
             <w:pStyle w:val="FirstParagraph"/>
             <w:spacing w:line="360" w:lineRule="auto"/>
@@ -7329,8 +7671,8 @@
         <w:pStyle w:val="Heading1"/>
         <w:spacing w:line="360" w:lineRule="auto"/>
       </w:pPr>
-      <w:bookmarkStart w:id="677" w:name="acknowledgements"/>
-      <w:bookmarkEnd w:id="660"/>
+      <w:bookmarkStart w:id="719" w:name="acknowledgements"/>
+      <w:bookmarkEnd w:id="695"/>
       <w:r>
         <w:t>Acknowledgements</w:t>
       </w:r>
@@ -7364,7 +7706,7 @@
       <w:r>
         <w:t xml:space="preserve">supplement can be found here: </w:t>
       </w:r>
-      <w:hyperlink r:id="rId14" w:history="1">
+      <w:hyperlink r:id="rId13" w:history="1">
         <w:r>
           <w:rPr>
             <w:rStyle w:val="Hyperlink"/>
@@ -7390,9 +7732,10 @@
         <w:pStyle w:val="Heading1"/>
         <w:spacing w:line="360" w:lineRule="auto"/>
       </w:pPr>
-      <w:bookmarkStart w:id="678" w:name="references"/>
-      <w:bookmarkEnd w:id="677"/>
-      <w:r>
+      <w:bookmarkStart w:id="720" w:name="references"/>
+      <w:bookmarkEnd w:id="719"/>
+      <w:r>
+        <w:lastRenderedPageBreak/>
         <w:t>References</w:t>
       </w:r>
     </w:p>
@@ -7407,8 +7750,8 @@
         <w:pStyle w:val="Bibliography"/>
         <w:spacing w:line="360" w:lineRule="auto"/>
       </w:pPr>
-      <w:bookmarkStart w:id="679" w:name="ref-Barriopedro2023"/>
-      <w:bookmarkStart w:id="680" w:name="refs"/>
+      <w:bookmarkStart w:id="721" w:name="ref-Barriopedro2023"/>
+      <w:bookmarkStart w:id="722" w:name="refs"/>
       <w:r>
         <w:t xml:space="preserve">1. </w:t>
       </w:r>
@@ -7442,8 +7785,8 @@
         <w:pStyle w:val="Bibliography"/>
         <w:spacing w:line="360" w:lineRule="auto"/>
       </w:pPr>
-      <w:bookmarkStart w:id="681" w:name="ref-Aglas-Leitner2024"/>
-      <w:bookmarkEnd w:id="679"/>
+      <w:bookmarkStart w:id="723" w:name="ref-Aglas-Leitner2024"/>
+      <w:bookmarkEnd w:id="721"/>
       <w:r>
         <w:t xml:space="preserve">2. </w:t>
       </w:r>
@@ -7477,10 +7820,9 @@
         <w:pStyle w:val="Bibliography"/>
         <w:spacing w:line="360" w:lineRule="auto"/>
       </w:pPr>
-      <w:bookmarkStart w:id="682" w:name="ref-Evans2025"/>
-      <w:bookmarkEnd w:id="681"/>
-      <w:r>
-        <w:lastRenderedPageBreak/>
+      <w:bookmarkStart w:id="724" w:name="ref-Evans2025"/>
+      <w:bookmarkEnd w:id="723"/>
+      <w:r>
         <w:t xml:space="preserve">3. </w:t>
       </w:r>
       <w:r>
@@ -7513,8 +7855,8 @@
         <w:pStyle w:val="Bibliography"/>
         <w:spacing w:line="360" w:lineRule="auto"/>
       </w:pPr>
-      <w:bookmarkStart w:id="683" w:name="ref-Margalef-Marrase2020"/>
-      <w:bookmarkEnd w:id="682"/>
+      <w:bookmarkStart w:id="725" w:name="ref-Margalef-Marrase2020"/>
+      <w:bookmarkEnd w:id="724"/>
       <w:r>
         <w:t xml:space="preserve">4. </w:t>
       </w:r>
@@ -7548,8 +7890,8 @@
         <w:pStyle w:val="Bibliography"/>
         <w:spacing w:line="360" w:lineRule="auto"/>
       </w:pPr>
-      <w:bookmarkStart w:id="684" w:name="ref-Kazenel2024"/>
-      <w:bookmarkEnd w:id="683"/>
+      <w:bookmarkStart w:id="726" w:name="ref-Kazenel2024"/>
+      <w:bookmarkEnd w:id="725"/>
       <w:r>
         <w:t xml:space="preserve">5. </w:t>
       </w:r>
@@ -7580,8 +7922,8 @@
         <w:pStyle w:val="Bibliography"/>
         <w:spacing w:line="360" w:lineRule="auto"/>
       </w:pPr>
-      <w:bookmarkStart w:id="685" w:name="ref-Zhao2017"/>
-      <w:bookmarkEnd w:id="684"/>
+      <w:bookmarkStart w:id="727" w:name="ref-Zhao2017"/>
+      <w:bookmarkEnd w:id="726"/>
       <w:r>
         <w:t xml:space="preserve">6. </w:t>
       </w:r>
@@ -7615,8 +7957,8 @@
         <w:pStyle w:val="Bibliography"/>
         <w:spacing w:line="360" w:lineRule="auto"/>
       </w:pPr>
-      <w:bookmarkStart w:id="686" w:name="ref-Tito2018"/>
-      <w:bookmarkEnd w:id="685"/>
+      <w:bookmarkStart w:id="728" w:name="ref-Tito2018"/>
+      <w:bookmarkEnd w:id="727"/>
       <w:r>
         <w:t xml:space="preserve">7. </w:t>
       </w:r>
@@ -7650,8 +7992,8 @@
         <w:pStyle w:val="Bibliography"/>
         <w:spacing w:line="360" w:lineRule="auto"/>
       </w:pPr>
-      <w:bookmarkStart w:id="687" w:name="ref-Bernacchi2025"/>
-      <w:bookmarkEnd w:id="686"/>
+      <w:bookmarkStart w:id="729" w:name="ref-Bernacchi2025"/>
+      <w:bookmarkEnd w:id="728"/>
       <w:r>
         <w:t xml:space="preserve">8. </w:t>
       </w:r>
@@ -7685,8 +8027,8 @@
         <w:pStyle w:val="Bibliography"/>
         <w:spacing w:line="360" w:lineRule="auto"/>
       </w:pPr>
-      <w:bookmarkStart w:id="688" w:name="ref-Martinez2023"/>
-      <w:bookmarkEnd w:id="687"/>
+      <w:bookmarkStart w:id="730" w:name="ref-Martinez2023"/>
+      <w:bookmarkEnd w:id="729"/>
       <w:r>
         <w:t xml:space="preserve">9. </w:t>
       </w:r>
@@ -7717,8 +8059,8 @@
         <w:pStyle w:val="Bibliography"/>
         <w:spacing w:line="360" w:lineRule="auto"/>
       </w:pPr>
-      <w:bookmarkStart w:id="689" w:name="ref-Rezende2020"/>
-      <w:bookmarkEnd w:id="688"/>
+      <w:bookmarkStart w:id="731" w:name="ref-Rezende2020"/>
+      <w:bookmarkEnd w:id="730"/>
       <w:r>
         <w:t xml:space="preserve">10. </w:t>
       </w:r>
@@ -7752,8 +8094,8 @@
         <w:pStyle w:val="Bibliography"/>
         <w:spacing w:line="360" w:lineRule="auto"/>
       </w:pPr>
-      <w:bookmarkStart w:id="690" w:name="ref-Orsted2024"/>
-      <w:bookmarkEnd w:id="689"/>
+      <w:bookmarkStart w:id="732" w:name="ref-Orsted2024"/>
+      <w:bookmarkEnd w:id="731"/>
       <w:r>
         <w:t xml:space="preserve">11. </w:t>
       </w:r>
@@ -7787,8 +8129,8 @@
         <w:pStyle w:val="Bibliography"/>
         <w:spacing w:line="360" w:lineRule="auto"/>
       </w:pPr>
-      <w:bookmarkStart w:id="691" w:name="ref-Lopez-Goldar2024"/>
-      <w:bookmarkEnd w:id="690"/>
+      <w:bookmarkStart w:id="733" w:name="ref-Lopez-Goldar2024"/>
+      <w:bookmarkEnd w:id="732"/>
       <w:r>
         <w:t xml:space="preserve">12. </w:t>
       </w:r>
@@ -7819,8 +8161,8 @@
         <w:pStyle w:val="Bibliography"/>
         <w:spacing w:line="360" w:lineRule="auto"/>
       </w:pPr>
-      <w:bookmarkStart w:id="692" w:name="ref-Trivedi2022"/>
-      <w:bookmarkEnd w:id="691"/>
+      <w:bookmarkStart w:id="734" w:name="ref-Trivedi2022"/>
+      <w:bookmarkEnd w:id="733"/>
       <w:r>
         <w:t xml:space="preserve">13. </w:t>
       </w:r>
@@ -7854,8 +8196,8 @@
         <w:pStyle w:val="Bibliography"/>
         <w:spacing w:line="360" w:lineRule="auto"/>
       </w:pPr>
-      <w:bookmarkStart w:id="693" w:name="ref-Kooijman2010"/>
-      <w:bookmarkEnd w:id="692"/>
+      <w:bookmarkStart w:id="735" w:name="ref-Kooijman2010"/>
+      <w:bookmarkEnd w:id="734"/>
       <w:r>
         <w:t xml:space="preserve">14. </w:t>
       </w:r>
@@ -7879,8 +8221,8 @@
         <w:pStyle w:val="Bibliography"/>
         <w:spacing w:line="360" w:lineRule="auto"/>
       </w:pPr>
-      <w:bookmarkStart w:id="694" w:name="ref-Kearney2009b"/>
-      <w:bookmarkEnd w:id="693"/>
+      <w:bookmarkStart w:id="736" w:name="ref-Kearney2009b"/>
+      <w:bookmarkEnd w:id="735"/>
       <w:r>
         <w:t xml:space="preserve">15. </w:t>
       </w:r>
@@ -7904,9 +8246,10 @@
         <w:pStyle w:val="Bibliography"/>
         <w:spacing w:line="360" w:lineRule="auto"/>
       </w:pPr>
-      <w:bookmarkStart w:id="695" w:name="ref-Jusup2024"/>
-      <w:bookmarkEnd w:id="694"/>
-      <w:r>
+      <w:bookmarkStart w:id="737" w:name="ref-Jusup2024"/>
+      <w:bookmarkEnd w:id="736"/>
+      <w:r>
+        <w:lastRenderedPageBreak/>
         <w:t xml:space="preserve">16. </w:t>
       </w:r>
       <w:r>
@@ -7926,10 +8269,9 @@
         <w:pStyle w:val="Bibliography"/>
         <w:spacing w:line="360" w:lineRule="auto"/>
       </w:pPr>
-      <w:bookmarkStart w:id="696" w:name="ref-Kearney2024"/>
-      <w:bookmarkEnd w:id="695"/>
-      <w:r>
-        <w:lastRenderedPageBreak/>
+      <w:bookmarkStart w:id="738" w:name="ref-Kearney2024"/>
+      <w:bookmarkEnd w:id="737"/>
+      <w:r>
         <w:t xml:space="preserve">17. </w:t>
       </w:r>
       <w:r>
@@ -7952,8 +8294,8 @@
         <w:pStyle w:val="Bibliography"/>
         <w:spacing w:line="360" w:lineRule="auto"/>
       </w:pPr>
-      <w:bookmarkStart w:id="697" w:name="ref-Briscoe2023"/>
-      <w:bookmarkEnd w:id="696"/>
+      <w:bookmarkStart w:id="739" w:name="ref-Briscoe2023"/>
+      <w:bookmarkEnd w:id="738"/>
       <w:r>
         <w:t xml:space="preserve">18. </w:t>
       </w:r>
@@ -7987,8 +8329,8 @@
         <w:pStyle w:val="Bibliography"/>
         <w:spacing w:line="360" w:lineRule="auto"/>
       </w:pPr>
-      <w:bookmarkStart w:id="698" w:name="ref-Rezende2014"/>
-      <w:bookmarkEnd w:id="697"/>
+      <w:bookmarkStart w:id="740" w:name="ref-Rezende2014"/>
+      <w:bookmarkEnd w:id="739"/>
       <w:r>
         <w:t xml:space="preserve">19. </w:t>
       </w:r>
@@ -8022,8 +8364,8 @@
         <w:pStyle w:val="Bibliography"/>
         <w:spacing w:line="360" w:lineRule="auto"/>
       </w:pPr>
-      <w:bookmarkStart w:id="699" w:name="ref-Arnold2025a"/>
-      <w:bookmarkEnd w:id="698"/>
+      <w:bookmarkStart w:id="741" w:name="ref-Arnold2025a"/>
+      <w:bookmarkEnd w:id="740"/>
       <w:r>
         <w:t xml:space="preserve">20. </w:t>
       </w:r>
@@ -8057,8 +8399,8 @@
         <w:pStyle w:val="Bibliography"/>
         <w:spacing w:line="360" w:lineRule="auto"/>
       </w:pPr>
-      <w:bookmarkStart w:id="700" w:name="ref-Bimler2018"/>
-      <w:bookmarkEnd w:id="699"/>
+      <w:bookmarkStart w:id="742" w:name="ref-Bimler2018"/>
+      <w:bookmarkEnd w:id="741"/>
       <w:r>
         <w:t xml:space="preserve">21. </w:t>
       </w:r>
@@ -8092,8 +8434,8 @@
         <w:pStyle w:val="Bibliography"/>
         <w:spacing w:line="360" w:lineRule="auto"/>
       </w:pPr>
-      <w:bookmarkStart w:id="701" w:name="ref-Bowler2022"/>
-      <w:bookmarkEnd w:id="700"/>
+      <w:bookmarkStart w:id="743" w:name="ref-Bowler2022"/>
+      <w:bookmarkEnd w:id="742"/>
       <w:r>
         <w:t xml:space="preserve">22. </w:t>
       </w:r>
@@ -8127,8 +8469,8 @@
         <w:pStyle w:val="Bibliography"/>
         <w:spacing w:line="360" w:lineRule="auto"/>
       </w:pPr>
-      <w:bookmarkStart w:id="702" w:name="ref-Tushabe2025"/>
-      <w:bookmarkEnd w:id="701"/>
+      <w:bookmarkStart w:id="744" w:name="ref-Tushabe2025"/>
+      <w:bookmarkEnd w:id="743"/>
       <w:r>
         <w:t xml:space="preserve">23. </w:t>
       </w:r>
@@ -8152,8 +8494,8 @@
         <w:pStyle w:val="Bibliography"/>
         <w:spacing w:line="360" w:lineRule="auto"/>
       </w:pPr>
-      <w:bookmarkStart w:id="703" w:name="ref-Fick2017"/>
-      <w:bookmarkEnd w:id="702"/>
+      <w:bookmarkStart w:id="745" w:name="ref-Fick2017"/>
+      <w:bookmarkEnd w:id="744"/>
       <w:r>
         <w:t xml:space="preserve">24. </w:t>
       </w:r>
@@ -8177,8 +8519,8 @@
         <w:pStyle w:val="Bibliography"/>
         <w:spacing w:line="360" w:lineRule="auto"/>
       </w:pPr>
-      <w:bookmarkStart w:id="704" w:name="ref-Kalnay2018"/>
-      <w:bookmarkEnd w:id="703"/>
+      <w:bookmarkStart w:id="746" w:name="ref-Kalnay2018"/>
+      <w:bookmarkEnd w:id="745"/>
       <w:r>
         <w:t xml:space="preserve">25. </w:t>
       </w:r>
@@ -8212,8 +8554,8 @@
         <w:pStyle w:val="Bibliography"/>
         <w:spacing w:line="360" w:lineRule="auto"/>
       </w:pPr>
-      <w:bookmarkStart w:id="705" w:name="ref-Hersbach2020"/>
-      <w:bookmarkEnd w:id="704"/>
+      <w:bookmarkStart w:id="747" w:name="ref-Hersbach2020"/>
+      <w:bookmarkEnd w:id="746"/>
       <w:r>
         <w:t xml:space="preserve">26. </w:t>
       </w:r>
@@ -8247,8 +8589,8 @@
         <w:pStyle w:val="Bibliography"/>
         <w:spacing w:line="360" w:lineRule="auto"/>
       </w:pPr>
-      <w:bookmarkStart w:id="706" w:name="ref-Klinges2022"/>
-      <w:bookmarkEnd w:id="705"/>
+      <w:bookmarkStart w:id="748" w:name="ref-Klinges2022"/>
+      <w:bookmarkEnd w:id="747"/>
       <w:r>
         <w:t xml:space="preserve">27. </w:t>
       </w:r>
@@ -8282,8 +8624,8 @@
         <w:pStyle w:val="Bibliography"/>
         <w:spacing w:line="360" w:lineRule="auto"/>
       </w:pPr>
-      <w:bookmarkStart w:id="707" w:name="ref-Meyer2023"/>
-      <w:bookmarkEnd w:id="706"/>
+      <w:bookmarkStart w:id="749" w:name="ref-Meyer2023"/>
+      <w:bookmarkEnd w:id="748"/>
       <w:r>
         <w:t xml:space="preserve">28. </w:t>
       </w:r>
@@ -8317,8 +8659,8 @@
         <w:pStyle w:val="Bibliography"/>
         <w:spacing w:line="360" w:lineRule="auto"/>
       </w:pPr>
-      <w:bookmarkStart w:id="708" w:name="ref-Munoz-Sabater2021"/>
-      <w:bookmarkEnd w:id="707"/>
+      <w:bookmarkStart w:id="750" w:name="ref-Munoz-Sabater2021"/>
+      <w:bookmarkEnd w:id="749"/>
       <w:r>
         <w:t xml:space="preserve">29. </w:t>
       </w:r>
@@ -8352,8 +8694,8 @@
         <w:pStyle w:val="Bibliography"/>
         <w:spacing w:line="360" w:lineRule="auto"/>
       </w:pPr>
-      <w:bookmarkStart w:id="709" w:name="ref-Bezanson2012"/>
-      <w:bookmarkEnd w:id="708"/>
+      <w:bookmarkStart w:id="751" w:name="ref-Bezanson2012"/>
+      <w:bookmarkEnd w:id="750"/>
       <w:r>
         <w:t xml:space="preserve">30. </w:t>
       </w:r>
@@ -8384,8 +8726,8 @@
         <w:pStyle w:val="Bibliography"/>
         <w:spacing w:line="360" w:lineRule="auto"/>
       </w:pPr>
-      <w:bookmarkStart w:id="710" w:name="ref-Bonan2019"/>
-      <w:bookmarkEnd w:id="709"/>
+      <w:bookmarkStart w:id="752" w:name="ref-Bonan2019"/>
+      <w:bookmarkEnd w:id="751"/>
       <w:r>
         <w:t xml:space="preserve">31. </w:t>
       </w:r>
@@ -8409,10 +8751,9 @@
         <w:pStyle w:val="Bibliography"/>
         <w:spacing w:line="360" w:lineRule="auto"/>
       </w:pPr>
-      <w:bookmarkStart w:id="711" w:name="ref-Argles2022"/>
-      <w:bookmarkEnd w:id="710"/>
-      <w:r>
-        <w:lastRenderedPageBreak/>
+      <w:bookmarkStart w:id="753" w:name="ref-Argles2022"/>
+      <w:bookmarkEnd w:id="752"/>
+      <w:r>
         <w:t xml:space="preserve">32. </w:t>
       </w:r>
       <w:r>
@@ -8445,8 +8786,8 @@
         <w:pStyle w:val="Bibliography"/>
         <w:spacing w:line="360" w:lineRule="auto"/>
       </w:pPr>
-      <w:bookmarkStart w:id="712" w:name="ref-Kearney2017"/>
-      <w:bookmarkEnd w:id="711"/>
+      <w:bookmarkStart w:id="754" w:name="ref-Kearney2017"/>
+      <w:bookmarkEnd w:id="753"/>
       <w:r>
         <w:t xml:space="preserve">33. </w:t>
       </w:r>
@@ -8470,9 +8811,10 @@
         <w:pStyle w:val="Bibliography"/>
         <w:spacing w:line="360" w:lineRule="auto"/>
       </w:pPr>
-      <w:bookmarkStart w:id="713" w:name="ref-Maclean2019"/>
-      <w:bookmarkEnd w:id="712"/>
-      <w:r>
+      <w:bookmarkStart w:id="755" w:name="ref-Maclean2019"/>
+      <w:bookmarkEnd w:id="754"/>
+      <w:r>
+        <w:lastRenderedPageBreak/>
         <w:t xml:space="preserve">34. </w:t>
       </w:r>
       <w:r>
@@ -8505,8 +8847,8 @@
         <w:pStyle w:val="Bibliography"/>
         <w:spacing w:line="360" w:lineRule="auto"/>
       </w:pPr>
-      <w:bookmarkStart w:id="714" w:name="ref-Kearney2020"/>
-      <w:bookmarkEnd w:id="713"/>
+      <w:bookmarkStart w:id="756" w:name="ref-Kearney2020"/>
+      <w:bookmarkEnd w:id="755"/>
       <w:r>
         <w:t xml:space="preserve">35. </w:t>
       </w:r>
@@ -8540,8 +8882,8 @@
         <w:pStyle w:val="Bibliography"/>
         <w:spacing w:line="360" w:lineRule="auto"/>
       </w:pPr>
-      <w:bookmarkStart w:id="715" w:name="ref-Maclean2021"/>
-      <w:bookmarkEnd w:id="714"/>
+      <w:bookmarkStart w:id="757" w:name="ref-Maclean2021"/>
+      <w:bookmarkEnd w:id="756"/>
       <w:r>
         <w:t xml:space="preserve">36. </w:t>
       </w:r>
@@ -8575,8 +8917,8 @@
         <w:pStyle w:val="Bibliography"/>
         <w:spacing w:line="360" w:lineRule="auto"/>
       </w:pPr>
-      <w:bookmarkStart w:id="716" w:name="ref-Buckley2023"/>
-      <w:bookmarkEnd w:id="715"/>
+      <w:bookmarkStart w:id="758" w:name="ref-Buckley2023"/>
+      <w:bookmarkEnd w:id="757"/>
       <w:r>
         <w:t xml:space="preserve">37. </w:t>
       </w:r>
@@ -8610,8 +8952,8 @@
         <w:pStyle w:val="Bibliography"/>
         <w:spacing w:line="360" w:lineRule="auto"/>
       </w:pPr>
-      <w:bookmarkStart w:id="717" w:name="ref-De_Frenne2024"/>
-      <w:bookmarkEnd w:id="716"/>
+      <w:bookmarkStart w:id="759" w:name="ref-De_Frenne2024"/>
+      <w:bookmarkEnd w:id="758"/>
       <w:r>
         <w:t xml:space="preserve">38. </w:t>
       </w:r>
@@ -8642,8 +8984,8 @@
         <w:pStyle w:val="Bibliography"/>
         <w:spacing w:line="360" w:lineRule="auto"/>
       </w:pPr>
-      <w:bookmarkStart w:id="718" w:name="ref-Levy2016"/>
-      <w:bookmarkEnd w:id="717"/>
+      <w:bookmarkStart w:id="760" w:name="ref-Levy2016"/>
+      <w:bookmarkEnd w:id="759"/>
       <w:r>
         <w:t xml:space="preserve">39. </w:t>
       </w:r>
@@ -8677,8 +9019,8 @@
         <w:pStyle w:val="Bibliography"/>
         <w:spacing w:line="360" w:lineRule="auto"/>
       </w:pPr>
-      <w:bookmarkStart w:id="719" w:name="ref-Drake2018"/>
-      <w:bookmarkEnd w:id="718"/>
+      <w:bookmarkStart w:id="761" w:name="ref-Drake2018"/>
+      <w:bookmarkEnd w:id="760"/>
       <w:r>
         <w:t xml:space="preserve">40. </w:t>
       </w:r>
@@ -8712,8 +9054,8 @@
         <w:pStyle w:val="Bibliography"/>
         <w:spacing w:line="360" w:lineRule="auto"/>
       </w:pPr>
-      <w:bookmarkStart w:id="720" w:name="ref-Holzworth2018"/>
-      <w:bookmarkEnd w:id="719"/>
+      <w:bookmarkStart w:id="762" w:name="ref-Holzworth2018"/>
+      <w:bookmarkEnd w:id="761"/>
       <w:r>
         <w:t xml:space="preserve">41. </w:t>
       </w:r>
@@ -8747,8 +9089,8 @@
         <w:pStyle w:val="Bibliography"/>
         <w:spacing w:line="360" w:lineRule="auto"/>
       </w:pPr>
-      <w:bookmarkStart w:id="721" w:name="ref-Medlyn2011"/>
-      <w:bookmarkEnd w:id="720"/>
+      <w:bookmarkStart w:id="763" w:name="ref-Medlyn2011"/>
+      <w:bookmarkEnd w:id="762"/>
       <w:r>
         <w:t xml:space="preserve">42. </w:t>
       </w:r>
@@ -8782,8 +9124,8 @@
         <w:pStyle w:val="Bibliography"/>
         <w:spacing w:line="360" w:lineRule="auto"/>
       </w:pPr>
-      <w:bookmarkStart w:id="722" w:name="ref-Porter1973"/>
-      <w:bookmarkEnd w:id="721"/>
+      <w:bookmarkStart w:id="764" w:name="ref-Porter1973"/>
+      <w:bookmarkEnd w:id="763"/>
       <w:r>
         <w:t xml:space="preserve">43. </w:t>
       </w:r>
@@ -8817,8 +9159,8 @@
         <w:pStyle w:val="Bibliography"/>
         <w:spacing w:line="360" w:lineRule="auto"/>
       </w:pPr>
-      <w:bookmarkStart w:id="723" w:name="ref-Porter1969"/>
-      <w:bookmarkEnd w:id="722"/>
+      <w:bookmarkStart w:id="765" w:name="ref-Porter1969"/>
+      <w:bookmarkEnd w:id="764"/>
       <w:r>
         <w:t xml:space="preserve">44. </w:t>
       </w:r>
@@ -8842,10 +9184,9 @@
         <w:pStyle w:val="Bibliography"/>
         <w:spacing w:line="360" w:lineRule="auto"/>
       </w:pPr>
-      <w:bookmarkStart w:id="724" w:name="ref-Riddell2017"/>
-      <w:bookmarkEnd w:id="723"/>
-      <w:r>
-        <w:lastRenderedPageBreak/>
+      <w:bookmarkStart w:id="766" w:name="ref-Riddell2017"/>
+      <w:bookmarkEnd w:id="765"/>
+      <w:r>
         <w:t xml:space="preserve">45. </w:t>
       </w:r>
       <w:r>
@@ -8878,8 +9219,8 @@
         <w:pStyle w:val="Bibliography"/>
         <w:spacing w:line="360" w:lineRule="auto"/>
       </w:pPr>
-      <w:bookmarkStart w:id="725" w:name="ref-Duursma2015"/>
-      <w:bookmarkEnd w:id="724"/>
+      <w:bookmarkStart w:id="767" w:name="ref-Duursma2015"/>
+      <w:bookmarkEnd w:id="766"/>
       <w:r>
         <w:t xml:space="preserve">46. </w:t>
       </w:r>
@@ -8903,8 +9244,8 @@
         <w:pStyle w:val="Bibliography"/>
         <w:spacing w:line="360" w:lineRule="auto"/>
       </w:pPr>
-      <w:bookmarkStart w:id="726" w:name="ref-Briscoe2022"/>
-      <w:bookmarkEnd w:id="725"/>
+      <w:bookmarkStart w:id="768" w:name="ref-Briscoe2022"/>
+      <w:bookmarkEnd w:id="767"/>
       <w:r>
         <w:t xml:space="preserve">47. </w:t>
       </w:r>
@@ -8938,8 +9279,8 @@
         <w:pStyle w:val="Bibliography"/>
         <w:spacing w:line="360" w:lineRule="auto"/>
       </w:pPr>
-      <w:bookmarkStart w:id="727" w:name="ref-Loughran2020"/>
-      <w:bookmarkEnd w:id="726"/>
+      <w:bookmarkStart w:id="769" w:name="ref-Loughran2020"/>
+      <w:bookmarkEnd w:id="768"/>
       <w:r>
         <w:t xml:space="preserve">48. </w:t>
       </w:r>
@@ -8963,8 +9304,8 @@
         <w:pStyle w:val="Bibliography"/>
         <w:spacing w:line="360" w:lineRule="auto"/>
       </w:pPr>
-      <w:bookmarkStart w:id="728" w:name="ref-Sharpe2022"/>
-      <w:bookmarkEnd w:id="727"/>
+      <w:bookmarkStart w:id="770" w:name="ref-Sharpe2022"/>
+      <w:bookmarkEnd w:id="769"/>
       <w:r>
         <w:t xml:space="preserve">49. </w:t>
       </w:r>
@@ -8998,9 +9339,10 @@
         <w:pStyle w:val="Bibliography"/>
         <w:spacing w:line="360" w:lineRule="auto"/>
       </w:pPr>
-      <w:bookmarkStart w:id="729" w:name="ref-Posch2024"/>
-      <w:bookmarkEnd w:id="728"/>
-      <w:r>
+      <w:bookmarkStart w:id="771" w:name="ref-Posch2024"/>
+      <w:bookmarkEnd w:id="770"/>
+      <w:r>
+        <w:lastRenderedPageBreak/>
         <w:t xml:space="preserve">50. </w:t>
       </w:r>
       <w:r>
@@ -9033,8 +9375,8 @@
         <w:pStyle w:val="Bibliography"/>
         <w:spacing w:line="360" w:lineRule="auto"/>
       </w:pPr>
-      <w:bookmarkStart w:id="730" w:name="ref-Orsted2022"/>
-      <w:bookmarkEnd w:id="729"/>
+      <w:bookmarkStart w:id="772" w:name="ref-Orsted2022"/>
+      <w:bookmarkEnd w:id="771"/>
       <w:r>
         <w:t xml:space="preserve">51. </w:t>
       </w:r>
@@ -9068,8 +9410,8 @@
         <w:pStyle w:val="Bibliography"/>
         <w:spacing w:line="360" w:lineRule="auto"/>
       </w:pPr>
-      <w:bookmarkStart w:id="731" w:name="ref-Jagadish2021"/>
-      <w:bookmarkEnd w:id="730"/>
+      <w:bookmarkStart w:id="773" w:name="ref-Jagadish2021"/>
+      <w:bookmarkEnd w:id="772"/>
       <w:r>
         <w:t xml:space="preserve">52. </w:t>
       </w:r>
@@ -9103,8 +9445,8 @@
         <w:pStyle w:val="Bibliography"/>
         <w:spacing w:line="360" w:lineRule="auto"/>
       </w:pPr>
-      <w:bookmarkStart w:id="732" w:name="ref-Faber2024"/>
-      <w:bookmarkEnd w:id="731"/>
+      <w:bookmarkStart w:id="774" w:name="ref-Faber2024"/>
+      <w:bookmarkEnd w:id="773"/>
       <w:r>
         <w:t xml:space="preserve">53. </w:t>
       </w:r>
@@ -9138,8 +9480,8 @@
         <w:pStyle w:val="Bibliography"/>
         <w:spacing w:line="360" w:lineRule="auto"/>
       </w:pPr>
-      <w:bookmarkStart w:id="733" w:name="ref-Martinez-De_Leon2024"/>
-      <w:bookmarkEnd w:id="732"/>
+      <w:bookmarkStart w:id="775" w:name="ref-Martinez-De_Leon2024"/>
+      <w:bookmarkEnd w:id="774"/>
       <w:r>
         <w:t xml:space="preserve">54. </w:t>
       </w:r>
@@ -9160,8 +9502,8 @@
         <w:pStyle w:val="Bibliography"/>
         <w:spacing w:line="360" w:lineRule="auto"/>
       </w:pPr>
-      <w:bookmarkStart w:id="734" w:name="ref-Chouhan2023"/>
-      <w:bookmarkEnd w:id="733"/>
+      <w:bookmarkStart w:id="776" w:name="ref-Chouhan2023"/>
+      <w:bookmarkEnd w:id="775"/>
       <w:r>
         <w:t xml:space="preserve">55. </w:t>
       </w:r>
@@ -9195,8 +9537,8 @@
         <w:pStyle w:val="Bibliography"/>
         <w:spacing w:line="360" w:lineRule="auto"/>
       </w:pPr>
-      <w:bookmarkStart w:id="735" w:name="ref-Marquez2007"/>
-      <w:bookmarkEnd w:id="734"/>
+      <w:bookmarkStart w:id="777" w:name="ref-Marquez2007"/>
+      <w:bookmarkEnd w:id="776"/>
       <w:r>
         <w:t xml:space="preserve">56. </w:t>
       </w:r>
@@ -9230,8 +9572,8 @@
         <w:pStyle w:val="Bibliography"/>
         <w:spacing w:line="360" w:lineRule="auto"/>
       </w:pPr>
-      <w:bookmarkStart w:id="736" w:name="ref-Dastogeer2022"/>
-      <w:bookmarkEnd w:id="735"/>
+      <w:bookmarkStart w:id="778" w:name="ref-Dastogeer2022"/>
+      <w:bookmarkEnd w:id="777"/>
       <w:r>
         <w:t xml:space="preserve">57. </w:t>
       </w:r>
@@ -9265,8 +9607,8 @@
         <w:pStyle w:val="Bibliography"/>
         <w:spacing w:line="360" w:lineRule="auto"/>
       </w:pPr>
-      <w:bookmarkStart w:id="737" w:name="ref-Hoang2019"/>
-      <w:bookmarkEnd w:id="736"/>
+      <w:bookmarkStart w:id="779" w:name="ref-Hoang2019"/>
+      <w:bookmarkEnd w:id="778"/>
       <w:r>
         <w:t xml:space="preserve">58. </w:t>
       </w:r>
@@ -9300,10 +9642,9 @@
         <w:pStyle w:val="Bibliography"/>
         <w:spacing w:line="360" w:lineRule="auto"/>
       </w:pPr>
-      <w:bookmarkStart w:id="738" w:name="ref-Marchin2022"/>
-      <w:bookmarkEnd w:id="737"/>
-      <w:r>
-        <w:lastRenderedPageBreak/>
+      <w:bookmarkStart w:id="780" w:name="ref-Marchin2022"/>
+      <w:bookmarkEnd w:id="779"/>
+      <w:r>
         <w:t xml:space="preserve">59. </w:t>
       </w:r>
       <w:r>
@@ -9336,8 +9677,8 @@
         <w:pStyle w:val="Bibliography"/>
         <w:spacing w:line="360" w:lineRule="auto"/>
       </w:pPr>
-      <w:bookmarkStart w:id="739" w:name="ref-Li2025"/>
-      <w:bookmarkEnd w:id="738"/>
+      <w:bookmarkStart w:id="781" w:name="ref-Li2025"/>
+      <w:bookmarkEnd w:id="780"/>
       <w:r>
         <w:t xml:space="preserve">60. </w:t>
       </w:r>
@@ -9371,8 +9712,8 @@
         <w:pStyle w:val="Bibliography"/>
         <w:spacing w:line="360" w:lineRule="auto"/>
       </w:pPr>
-      <w:bookmarkStart w:id="740" w:name="ref-Youngblood2025"/>
-      <w:bookmarkEnd w:id="739"/>
+      <w:bookmarkStart w:id="782" w:name="ref-Youngblood2025"/>
+      <w:bookmarkEnd w:id="781"/>
       <w:r>
         <w:t xml:space="preserve">61. </w:t>
       </w:r>
@@ -9403,8 +9744,8 @@
         <w:pStyle w:val="Bibliography"/>
         <w:spacing w:line="360" w:lineRule="auto"/>
       </w:pPr>
-      <w:bookmarkStart w:id="741" w:name="ref-Mengutay2013"/>
-      <w:bookmarkEnd w:id="740"/>
+      <w:bookmarkStart w:id="783" w:name="ref-Mengutay2013"/>
+      <w:bookmarkEnd w:id="782"/>
       <w:r>
         <w:t xml:space="preserve">62. </w:t>
       </w:r>
@@ -9438,8 +9779,8 @@
         <w:pStyle w:val="Bibliography"/>
         <w:spacing w:line="360" w:lineRule="auto"/>
       </w:pPr>
-      <w:bookmarkStart w:id="742" w:name="ref-Andersen2010"/>
-      <w:bookmarkEnd w:id="741"/>
+      <w:bookmarkStart w:id="784" w:name="ref-Andersen2010"/>
+      <w:bookmarkEnd w:id="783"/>
       <w:r>
         <w:t xml:space="preserve">63. </w:t>
       </w:r>
@@ -9473,8 +9814,8 @@
         <w:pStyle w:val="Bibliography"/>
         <w:spacing w:line="360" w:lineRule="auto"/>
       </w:pPr>
-      <w:bookmarkStart w:id="743" w:name="ref-Nisbet2000"/>
-      <w:bookmarkEnd w:id="742"/>
+      <w:bookmarkStart w:id="785" w:name="ref-Nisbet2000"/>
+      <w:bookmarkEnd w:id="784"/>
       <w:r>
         <w:t xml:space="preserve">64. </w:t>
       </w:r>
@@ -9508,8 +9849,8 @@
         <w:pStyle w:val="Bibliography"/>
         <w:spacing w:line="360" w:lineRule="auto"/>
       </w:pPr>
-      <w:bookmarkStart w:id="744" w:name="ref-Jager2020"/>
-      <w:bookmarkEnd w:id="743"/>
+      <w:bookmarkStart w:id="786" w:name="ref-Jager2020"/>
+      <w:bookmarkEnd w:id="785"/>
       <w:r>
         <w:t xml:space="preserve">65. </w:t>
       </w:r>
@@ -9533,8 +9874,8 @@
         <w:pStyle w:val="Bibliography"/>
         <w:spacing w:line="360" w:lineRule="auto"/>
       </w:pPr>
-      <w:bookmarkStart w:id="745" w:name="ref-Kearney2013"/>
-      <w:bookmarkEnd w:id="744"/>
+      <w:bookmarkStart w:id="787" w:name="ref-Kearney2013"/>
+      <w:bookmarkEnd w:id="786"/>
       <w:r>
         <w:t xml:space="preserve">66. </w:t>
       </w:r>
@@ -9568,9 +9909,10 @@
         <w:pStyle w:val="Bibliography"/>
         <w:spacing w:line="360" w:lineRule="auto"/>
       </w:pPr>
-      <w:bookmarkStart w:id="746" w:name="ref-Kearney2010"/>
-      <w:bookmarkEnd w:id="745"/>
-      <w:r>
+      <w:bookmarkStart w:id="788" w:name="ref-Kearney2010"/>
+      <w:bookmarkEnd w:id="787"/>
+      <w:r>
+        <w:lastRenderedPageBreak/>
         <w:t xml:space="preserve">67. </w:t>
       </w:r>
       <w:r>
@@ -9603,8 +9945,8 @@
         <w:pStyle w:val="Bibliography"/>
         <w:spacing w:line="360" w:lineRule="auto"/>
       </w:pPr>
-      <w:bookmarkStart w:id="747" w:name="ref-Marques2018"/>
-      <w:bookmarkEnd w:id="746"/>
+      <w:bookmarkStart w:id="789" w:name="ref-Marques2018"/>
+      <w:bookmarkEnd w:id="788"/>
       <w:r>
         <w:t xml:space="preserve">68. </w:t>
       </w:r>
@@ -9638,8 +9980,8 @@
         <w:pStyle w:val="Bibliography"/>
         <w:spacing w:line="360" w:lineRule="auto"/>
       </w:pPr>
-      <w:bookmarkStart w:id="748" w:name="ref-Kooijman2021"/>
-      <w:bookmarkEnd w:id="747"/>
+      <w:bookmarkStart w:id="790" w:name="ref-Kooijman2021"/>
+      <w:bookmarkEnd w:id="789"/>
       <w:r>
         <w:t xml:space="preserve">69. </w:t>
       </w:r>
@@ -9673,8 +10015,8 @@
         <w:pStyle w:val="Bibliography"/>
         <w:spacing w:line="360" w:lineRule="auto"/>
       </w:pPr>
-      <w:bookmarkStart w:id="749" w:name="ref-Bruggeman2009"/>
-      <w:bookmarkEnd w:id="748"/>
+      <w:bookmarkStart w:id="791" w:name="ref-Bruggeman2009"/>
+      <w:bookmarkEnd w:id="790"/>
       <w:r>
         <w:t xml:space="preserve">70. </w:t>
       </w:r>
@@ -9708,8 +10050,8 @@
         <w:pStyle w:val="Bibliography"/>
         <w:spacing w:line="360" w:lineRule="auto"/>
       </w:pPr>
-      <w:bookmarkStart w:id="750" w:name="ref-Kearney2020a"/>
-      <w:bookmarkEnd w:id="749"/>
+      <w:bookmarkStart w:id="792" w:name="ref-Kearney2020a"/>
+      <w:bookmarkEnd w:id="791"/>
       <w:r>
         <w:t xml:space="preserve">71. </w:t>
       </w:r>
@@ -9733,8 +10075,8 @@
         <w:pStyle w:val="Bibliography"/>
         <w:spacing w:line="360" w:lineRule="auto"/>
       </w:pPr>
-      <w:bookmarkStart w:id="751" w:name="ref-Kumarathunge2019"/>
-      <w:bookmarkEnd w:id="750"/>
+      <w:bookmarkStart w:id="793" w:name="ref-Kumarathunge2019"/>
+      <w:bookmarkEnd w:id="792"/>
       <w:r>
         <w:t xml:space="preserve">72. </w:t>
       </w:r>
@@ -9768,10 +10110,9 @@
         <w:pStyle w:val="Bibliography"/>
         <w:spacing w:line="360" w:lineRule="auto"/>
       </w:pPr>
-      <w:bookmarkStart w:id="752" w:name="ref-De_Kauwe2020"/>
-      <w:bookmarkEnd w:id="751"/>
-      <w:r>
-        <w:lastRenderedPageBreak/>
+      <w:bookmarkStart w:id="794" w:name="ref-De_Kauwe2020"/>
+      <w:bookmarkEnd w:id="793"/>
+      <w:r>
         <w:t xml:space="preserve">73. </w:t>
       </w:r>
       <w:r>
@@ -9804,8 +10145,8 @@
         <w:pStyle w:val="Bibliography"/>
         <w:spacing w:line="360" w:lineRule="auto"/>
       </w:pPr>
-      <w:bookmarkStart w:id="753" w:name="ref-Chesson2000"/>
-      <w:bookmarkEnd w:id="752"/>
+      <w:bookmarkStart w:id="795" w:name="ref-Chesson2000"/>
+      <w:bookmarkEnd w:id="794"/>
       <w:r>
         <w:t xml:space="preserve">74. </w:t>
       </w:r>
@@ -9829,8 +10170,8 @@
         <w:pStyle w:val="Bibliography"/>
         <w:spacing w:line="360" w:lineRule="auto"/>
       </w:pPr>
-      <w:bookmarkStart w:id="754" w:name="ref-Ricker1954a"/>
-      <w:bookmarkEnd w:id="753"/>
+      <w:bookmarkStart w:id="796" w:name="ref-Ricker1954a"/>
+      <w:bookmarkEnd w:id="795"/>
       <w:r>
         <w:t xml:space="preserve">75. </w:t>
       </w:r>
@@ -9854,8 +10195,8 @@
         <w:pStyle w:val="Bibliography"/>
         <w:spacing w:line="360" w:lineRule="auto"/>
       </w:pPr>
-      <w:bookmarkStart w:id="755" w:name="ref-Beverton2012"/>
-      <w:bookmarkEnd w:id="754"/>
+      <w:bookmarkStart w:id="797" w:name="ref-Beverton2012"/>
+      <w:bookmarkEnd w:id="796"/>
       <w:r>
         <w:t xml:space="preserve">76. </w:t>
       </w:r>
@@ -9879,8 +10220,8 @@
         <w:pStyle w:val="Bibliography"/>
         <w:spacing w:line="360" w:lineRule="auto"/>
       </w:pPr>
-      <w:bookmarkStart w:id="756" w:name="ref-Mayfield2017"/>
-      <w:bookmarkEnd w:id="755"/>
+      <w:bookmarkStart w:id="798" w:name="ref-Mayfield2017"/>
+      <w:bookmarkEnd w:id="797"/>
       <w:r>
         <w:t xml:space="preserve">77. </w:t>
       </w:r>
@@ -9904,8 +10245,8 @@
         <w:pStyle w:val="Bibliography"/>
         <w:spacing w:line="360" w:lineRule="auto"/>
       </w:pPr>
-      <w:bookmarkStart w:id="757" w:name="ref-Buche2025"/>
-      <w:bookmarkEnd w:id="756"/>
+      <w:bookmarkStart w:id="799" w:name="ref-Buche2025"/>
+      <w:bookmarkEnd w:id="798"/>
       <w:r>
         <w:t xml:space="preserve">78. </w:t>
       </w:r>
@@ -9939,8 +10280,8 @@
         <w:pStyle w:val="Bibliography"/>
         <w:spacing w:line="360" w:lineRule="auto"/>
       </w:pPr>
-      <w:bookmarkStart w:id="758" w:name="ref-Bimler2024"/>
-      <w:bookmarkEnd w:id="757"/>
+      <w:bookmarkStart w:id="800" w:name="ref-Bimler2024"/>
+      <w:bookmarkEnd w:id="799"/>
       <w:r>
         <w:t xml:space="preserve">79. </w:t>
       </w:r>
@@ -9974,8 +10315,8 @@
         <w:pStyle w:val="Bibliography"/>
         <w:spacing w:line="360" w:lineRule="auto"/>
       </w:pPr>
-      <w:bookmarkStart w:id="759" w:name="ref-Martyn2021"/>
-      <w:bookmarkEnd w:id="758"/>
+      <w:bookmarkStart w:id="801" w:name="ref-Martyn2021"/>
+      <w:bookmarkEnd w:id="800"/>
       <w:r>
         <w:t xml:space="preserve">80. </w:t>
       </w:r>
@@ -10009,8 +10350,8 @@
         <w:pStyle w:val="Bibliography"/>
         <w:spacing w:line="360" w:lineRule="auto"/>
       </w:pPr>
-      <w:bookmarkStart w:id="760" w:name="ref-Chevin2017"/>
-      <w:bookmarkEnd w:id="759"/>
+      <w:bookmarkStart w:id="802" w:name="ref-Chevin2017"/>
+      <w:bookmarkEnd w:id="801"/>
       <w:r>
         <w:t xml:space="preserve">81. </w:t>
       </w:r>
@@ -10034,8 +10375,8 @@
         <w:pStyle w:val="Bibliography"/>
         <w:spacing w:line="360" w:lineRule="auto"/>
       </w:pPr>
-      <w:bookmarkStart w:id="761" w:name="ref-Urban2024"/>
-      <w:bookmarkEnd w:id="760"/>
+      <w:bookmarkStart w:id="803" w:name="ref-Urban2024"/>
+      <w:bookmarkEnd w:id="802"/>
       <w:r>
         <w:t xml:space="preserve">82. </w:t>
       </w:r>
@@ -10069,8 +10410,8 @@
         <w:pStyle w:val="Bibliography"/>
         <w:spacing w:line="360" w:lineRule="auto"/>
       </w:pPr>
-      <w:bookmarkStart w:id="762" w:name="ref-Hoffmann2011"/>
-      <w:bookmarkEnd w:id="761"/>
+      <w:bookmarkStart w:id="804" w:name="ref-Hoffmann2011"/>
+      <w:bookmarkEnd w:id="803"/>
       <w:r>
         <w:t xml:space="preserve">83. </w:t>
       </w:r>
@@ -10084,8 +10425,8 @@
         <w:pStyle w:val="Bibliography"/>
         <w:spacing w:line="360" w:lineRule="auto"/>
       </w:pPr>
-      <w:bookmarkStart w:id="763" w:name="ref-Hoffmann2022"/>
-      <w:bookmarkEnd w:id="762"/>
+      <w:bookmarkStart w:id="805" w:name="ref-Hoffmann2022"/>
+      <w:bookmarkEnd w:id="804"/>
       <w:r>
         <w:t xml:space="preserve">84. </w:t>
       </w:r>
@@ -10109,9 +10450,10 @@
         <w:pStyle w:val="Bibliography"/>
         <w:spacing w:line="360" w:lineRule="auto"/>
       </w:pPr>
-      <w:bookmarkStart w:id="764" w:name="ref-Ghalambor2015"/>
-      <w:bookmarkEnd w:id="763"/>
-      <w:r>
+      <w:bookmarkStart w:id="806" w:name="ref-Ghalambor2015"/>
+      <w:bookmarkEnd w:id="805"/>
+      <w:r>
+        <w:lastRenderedPageBreak/>
         <w:t xml:space="preserve">85. </w:t>
       </w:r>
       <w:r>
@@ -10144,8 +10486,8 @@
         <w:pStyle w:val="Bibliography"/>
         <w:spacing w:line="360" w:lineRule="auto"/>
       </w:pPr>
-      <w:bookmarkStart w:id="765" w:name="ref-Oostra2018"/>
-      <w:bookmarkEnd w:id="764"/>
+      <w:bookmarkStart w:id="807" w:name="ref-Oostra2018"/>
+      <w:bookmarkEnd w:id="806"/>
       <w:r>
         <w:t xml:space="preserve">86. </w:t>
       </w:r>
@@ -10179,8 +10521,8 @@
         <w:pStyle w:val="Bibliography"/>
         <w:spacing w:line="360" w:lineRule="auto"/>
       </w:pPr>
-      <w:bookmarkStart w:id="766" w:name="ref-Noble2019"/>
-      <w:bookmarkEnd w:id="765"/>
+      <w:bookmarkStart w:id="808" w:name="ref-Noble2019"/>
+      <w:bookmarkEnd w:id="807"/>
       <w:r>
         <w:t xml:space="preserve">87. </w:t>
       </w:r>
@@ -10214,10 +10556,9 @@
         <w:pStyle w:val="Bibliography"/>
         <w:spacing w:line="360" w:lineRule="auto"/>
       </w:pPr>
-      <w:bookmarkStart w:id="767" w:name="ref-Sousa2010"/>
-      <w:bookmarkEnd w:id="766"/>
-      <w:r>
-        <w:lastRenderedPageBreak/>
+      <w:bookmarkStart w:id="809" w:name="ref-Sousa2010"/>
+      <w:bookmarkEnd w:id="808"/>
+      <w:r>
         <w:t xml:space="preserve">88. </w:t>
       </w:r>
       <w:r>
@@ -10250,8 +10591,8 @@
         <w:pStyle w:val="Bibliography"/>
         <w:spacing w:line="360" w:lineRule="auto"/>
       </w:pPr>
-      <w:bookmarkStart w:id="768" w:name="ref-Lande1979"/>
-      <w:bookmarkEnd w:id="767"/>
+      <w:bookmarkStart w:id="810" w:name="ref-Lande1979"/>
+      <w:bookmarkEnd w:id="809"/>
       <w:r>
         <w:t xml:space="preserve">89. </w:t>
       </w:r>
@@ -10275,8 +10616,8 @@
         <w:pStyle w:val="Bibliography"/>
         <w:spacing w:line="360" w:lineRule="auto"/>
       </w:pPr>
-      <w:bookmarkStart w:id="769" w:name="ref-Walsh2018"/>
-      <w:bookmarkEnd w:id="768"/>
+      <w:bookmarkStart w:id="811" w:name="ref-Walsh2018"/>
+      <w:bookmarkEnd w:id="810"/>
       <w:r>
         <w:t xml:space="preserve">90. </w:t>
       </w:r>
@@ -10300,8 +10641,8 @@
         <w:pStyle w:val="Bibliography"/>
         <w:spacing w:line="360" w:lineRule="auto"/>
       </w:pPr>
-      <w:bookmarkStart w:id="770" w:name="ref-Baeza_Icaza2025"/>
-      <w:bookmarkEnd w:id="769"/>
+      <w:bookmarkStart w:id="812" w:name="ref-Baeza_Icaza2025"/>
+      <w:bookmarkEnd w:id="811"/>
       <w:r>
         <w:t xml:space="preserve">91. </w:t>
       </w:r>
@@ -10335,8 +10676,8 @@
         <w:pStyle w:val="Bibliography"/>
         <w:spacing w:line="360" w:lineRule="auto"/>
       </w:pPr>
-      <w:bookmarkStart w:id="771" w:name="ref-Kearney2009a"/>
-      <w:bookmarkEnd w:id="770"/>
+      <w:bookmarkStart w:id="813" w:name="ref-Kearney2009a"/>
+      <w:bookmarkEnd w:id="812"/>
       <w:r>
         <w:t xml:space="preserve">92. </w:t>
       </w:r>
@@ -10370,8 +10711,8 @@
         <w:pStyle w:val="Bibliography"/>
         <w:spacing w:line="360" w:lineRule="auto"/>
       </w:pPr>
-      <w:bookmarkStart w:id="772" w:name="ref-Ellner2011"/>
-      <w:bookmarkEnd w:id="771"/>
+      <w:bookmarkStart w:id="814" w:name="ref-Ellner2011"/>
+      <w:bookmarkEnd w:id="813"/>
       <w:r>
         <w:t xml:space="preserve">93. </w:t>
       </w:r>
@@ -10405,8 +10746,8 @@
         <w:pStyle w:val="Bibliography"/>
         <w:spacing w:line="360" w:lineRule="auto"/>
       </w:pPr>
-      <w:bookmarkStart w:id="773" w:name="ref-Pottier2022a"/>
-      <w:bookmarkEnd w:id="772"/>
+      <w:bookmarkStart w:id="815" w:name="ref-Pottier2022a"/>
+      <w:bookmarkEnd w:id="814"/>
       <w:r>
         <w:t xml:space="preserve">94. </w:t>
       </w:r>
@@ -10440,8 +10781,8 @@
         <w:pStyle w:val="Bibliography"/>
         <w:spacing w:line="360" w:lineRule="auto"/>
       </w:pPr>
-      <w:bookmarkStart w:id="774" w:name="ref-Leiva2024b"/>
-      <w:bookmarkEnd w:id="773"/>
+      <w:bookmarkStart w:id="816" w:name="ref-Leiva2024b"/>
+      <w:bookmarkEnd w:id="815"/>
       <w:r>
         <w:t xml:space="preserve">95. </w:t>
       </w:r>
@@ -10465,8 +10806,8 @@
         <w:pStyle w:val="Bibliography"/>
         <w:spacing w:line="360" w:lineRule="auto"/>
       </w:pPr>
-      <w:bookmarkStart w:id="775" w:name="ref-Arnold2019a"/>
-      <w:bookmarkEnd w:id="774"/>
+      <w:bookmarkStart w:id="817" w:name="ref-Arnold2019a"/>
+      <w:bookmarkEnd w:id="816"/>
       <w:r>
         <w:t xml:space="preserve">96. </w:t>
       </w:r>
@@ -10500,8 +10841,8 @@
         <w:pStyle w:val="Bibliography"/>
         <w:spacing w:line="360" w:lineRule="auto"/>
       </w:pPr>
-      <w:bookmarkStart w:id="776" w:name="ref-Arnold2024"/>
-      <w:bookmarkEnd w:id="775"/>
+      <w:bookmarkStart w:id="818" w:name="ref-Arnold2024"/>
+      <w:bookmarkEnd w:id="817"/>
       <w:r>
         <w:t xml:space="preserve">97. </w:t>
       </w:r>
@@ -10535,8 +10876,8 @@
         <w:pStyle w:val="Bibliography"/>
         <w:spacing w:line="360" w:lineRule="auto"/>
       </w:pPr>
-      <w:bookmarkStart w:id="777" w:name="ref-Assessment_undated-fv"/>
-      <w:bookmarkEnd w:id="776"/>
+      <w:bookmarkStart w:id="819" w:name="ref-Assessment_undated-fv"/>
+      <w:bookmarkEnd w:id="818"/>
       <w:r>
         <w:t xml:space="preserve">98. </w:t>
       </w:r>
@@ -10550,8 +10891,8 @@
         <w:pStyle w:val="Bibliography"/>
         <w:spacing w:line="360" w:lineRule="auto"/>
       </w:pPr>
-      <w:bookmarkStart w:id="778" w:name="ref-Dandy2019"/>
-      <w:bookmarkEnd w:id="777"/>
+      <w:bookmarkStart w:id="820" w:name="ref-Dandy2019"/>
+      <w:bookmarkEnd w:id="819"/>
       <w:r>
         <w:t xml:space="preserve">99. </w:t>
       </w:r>
@@ -10585,8 +10926,8 @@
         <w:pStyle w:val="Bibliography"/>
         <w:spacing w:line="360" w:lineRule="auto"/>
       </w:pPr>
-      <w:bookmarkStart w:id="779" w:name="ref-Leviston2018"/>
-      <w:bookmarkEnd w:id="778"/>
+      <w:bookmarkStart w:id="821" w:name="ref-Leviston2018"/>
+      <w:bookmarkEnd w:id="820"/>
       <w:r>
         <w:t xml:space="preserve">100. </w:t>
       </w:r>
@@ -10620,8 +10961,8 @@
         <w:pStyle w:val="Bibliography"/>
         <w:spacing w:line="360" w:lineRule="auto"/>
       </w:pPr>
-      <w:bookmarkStart w:id="780" w:name="ref-Bai2016"/>
-      <w:bookmarkEnd w:id="779"/>
+      <w:bookmarkStart w:id="822" w:name="ref-Bai2016"/>
+      <w:bookmarkEnd w:id="821"/>
       <w:r>
         <w:t xml:space="preserve">101. </w:t>
       </w:r>
@@ -10655,8 +10996,8 @@
         <w:pStyle w:val="Bibliography"/>
         <w:spacing w:line="360" w:lineRule="auto"/>
       </w:pPr>
-      <w:bookmarkStart w:id="781" w:name="ref-Grimm2008"/>
-      <w:bookmarkEnd w:id="780"/>
+      <w:bookmarkStart w:id="823" w:name="ref-Grimm2008"/>
+      <w:bookmarkEnd w:id="822"/>
       <w:r>
         <w:lastRenderedPageBreak/>
         <w:t xml:space="preserve">102. </w:t>
@@ -10691,8 +11032,8 @@
         <w:pStyle w:val="Bibliography"/>
         <w:spacing w:line="360" w:lineRule="auto"/>
       </w:pPr>
-      <w:bookmarkStart w:id="782" w:name="ref-Shekhawat2022"/>
-      <w:bookmarkEnd w:id="781"/>
+      <w:bookmarkStart w:id="824" w:name="ref-Shekhawat2022"/>
+      <w:bookmarkEnd w:id="823"/>
       <w:r>
         <w:t xml:space="preserve">103. </w:t>
       </w:r>
@@ -10726,8 +11067,8 @@
         <w:pStyle w:val="Bibliography"/>
         <w:spacing w:line="360" w:lineRule="auto"/>
       </w:pPr>
-      <w:bookmarkStart w:id="783" w:name="ref-Black2011"/>
-      <w:bookmarkEnd w:id="782"/>
+      <w:bookmarkStart w:id="825" w:name="ref-Black2011"/>
+      <w:bookmarkEnd w:id="824"/>
       <w:r>
         <w:t xml:space="preserve">104. </w:t>
       </w:r>
@@ -10761,8 +11102,8 @@
         <w:pStyle w:val="Bibliography"/>
         <w:spacing w:line="360" w:lineRule="auto"/>
       </w:pPr>
-      <w:bookmarkStart w:id="784" w:name="ref-Neil_Adger1999"/>
-      <w:bookmarkEnd w:id="783"/>
+      <w:bookmarkStart w:id="826" w:name="ref-Neil_Adger1999"/>
+      <w:bookmarkEnd w:id="825"/>
       <w:r>
         <w:t xml:space="preserve">105. </w:t>
       </w:r>
@@ -10786,8 +11127,8 @@
         <w:pStyle w:val="Bibliography"/>
         <w:spacing w:line="360" w:lineRule="auto"/>
       </w:pPr>
-      <w:bookmarkStart w:id="785" w:name="ref-Folke2016"/>
-      <w:bookmarkEnd w:id="784"/>
+      <w:bookmarkStart w:id="827" w:name="ref-Folke2016"/>
+      <w:bookmarkEnd w:id="826"/>
       <w:r>
         <w:t xml:space="preserve">106. </w:t>
       </w:r>
@@ -10821,8 +11162,8 @@
         <w:pStyle w:val="Bibliography"/>
         <w:spacing w:line="360" w:lineRule="auto"/>
       </w:pPr>
-      <w:bookmarkStart w:id="786" w:name="ref-Schluter2012"/>
-      <w:bookmarkEnd w:id="785"/>
+      <w:bookmarkStart w:id="828" w:name="ref-Schluter2012"/>
+      <w:bookmarkEnd w:id="827"/>
       <w:r>
         <w:t xml:space="preserve">107. </w:t>
       </w:r>
@@ -10856,8 +11197,8 @@
         <w:pStyle w:val="Bibliography"/>
         <w:spacing w:line="360" w:lineRule="auto"/>
       </w:pPr>
-      <w:bookmarkStart w:id="787" w:name="ref-Biggs2021"/>
-      <w:bookmarkEnd w:id="786"/>
+      <w:bookmarkStart w:id="829" w:name="ref-Biggs2021"/>
+      <w:bookmarkEnd w:id="828"/>
       <w:r>
         <w:t xml:space="preserve">108. </w:t>
       </w:r>
@@ -10891,8 +11232,8 @@
         <w:pStyle w:val="Bibliography"/>
         <w:spacing w:line="360" w:lineRule="auto"/>
       </w:pPr>
-      <w:bookmarkStart w:id="788" w:name="ref-Brown2021"/>
-      <w:bookmarkEnd w:id="787"/>
+      <w:bookmarkStart w:id="830" w:name="ref-Brown2021"/>
+      <w:bookmarkEnd w:id="829"/>
       <w:r>
         <w:t xml:space="preserve">109. </w:t>
       </w:r>
@@ -10916,8 +11257,8 @@
         <w:pStyle w:val="Bibliography"/>
         <w:spacing w:line="360" w:lineRule="auto"/>
       </w:pPr>
-      <w:bookmarkStart w:id="789" w:name="ref-Wise2014"/>
-      <w:bookmarkEnd w:id="788"/>
+      <w:bookmarkStart w:id="831" w:name="ref-Wise2014"/>
+      <w:bookmarkEnd w:id="830"/>
       <w:r>
         <w:t xml:space="preserve">110. </w:t>
       </w:r>
@@ -10946,9 +11287,9 @@
         <w:t xml:space="preserve"> 28, 325–336</w:t>
       </w:r>
     </w:p>
-    <w:bookmarkEnd w:id="678"/>
-    <w:bookmarkEnd w:id="680"/>
-    <w:bookmarkEnd w:id="789"/>
+    <w:bookmarkEnd w:id="720"/>
+    <w:bookmarkEnd w:id="722"/>
+    <w:bookmarkEnd w:id="831"/>
     <w:p>
       <w:pPr>
         <w:pStyle w:val="BodyText"/>
@@ -11097,7 +11438,7 @@
       </w:r>
     </w:p>
   </w:comment>
-  <w:comment w:id="599" w:author="Daniel Noble" w:date="2025-10-28T16:51:00Z" w:initials="DN">
+  <w:comment w:id="543" w:author="Daniel Noble" w:date="2025-10-29T09:29:00Z" w:initials="DN">
     <w:p>
       <w:pPr>
         <w:pStyle w:val="CommentText"/>
@@ -11109,10 +11450,7 @@
         <w:annotationRef/>
       </w:r>
       <w:r>
-        <w:t xml:space="preserve">Major </w:t>
-      </w:r>
-      <w:r>
-        <w:t>update.</w:t>
+        <w:t>C17</w:t>
       </w:r>
     </w:p>
   </w:comment>
@@ -11128,7 +11466,7 @@
   <w15:commentEx w15:paraId="27C8B33B" w15:done="0"/>
   <w15:commentEx w15:paraId="34403755" w15:done="0"/>
   <w15:commentEx w15:paraId="35E10EFC" w15:done="0"/>
-  <w15:commentEx w15:paraId="25C9A419" w15:done="0"/>
+  <w15:commentEx w15:paraId="4BC2BA44" w15:done="0"/>
 </w15:commentsEx>
 </file>
 
@@ -11141,7 +11479,7 @@
   <w16cex:commentExtensible w16cex:durableId="08F54D14" w16cex:dateUtc="2025-10-27T01:03:00Z"/>
   <w16cex:commentExtensible w16cex:durableId="68BE281F" w16cex:dateUtc="2025-10-27T02:15:00Z"/>
   <w16cex:commentExtensible w16cex:durableId="4D5871D4" w16cex:dateUtc="2025-10-27T02:35:00Z"/>
-  <w16cex:commentExtensible w16cex:durableId="38128027" w16cex:dateUtc="2025-10-28T05:51:00Z"/>
+  <w16cex:commentExtensible w16cex:durableId="29D5BD7E" w16cex:dateUtc="2025-10-28T22:29:00Z"/>
 </w16cex:commentsExtensible>
 </file>
 
@@ -11154,7 +11492,7 @@
   <w16cid:commentId w16cid:paraId="27C8B33B" w16cid:durableId="08F54D14"/>
   <w16cid:commentId w16cid:paraId="34403755" w16cid:durableId="68BE281F"/>
   <w16cid:commentId w16cid:paraId="35E10EFC" w16cid:durableId="4D5871D4"/>
-  <w16cid:commentId w16cid:paraId="25C9A419" w16cid:durableId="38128027"/>
+  <w16cid:commentId w16cid:paraId="4BC2BA44" w16cid:durableId="29D5BD7E"/>
 </w16cid:commentsIds>
 </file>
 
@@ -12477,6 +12815,14 @@
   <w:style w:type="paragraph" w:default="1" w:styleId="Normal">
     <w:name w:val="Normal"/>
     <w:qFormat/>
+    <w:rsid w:val="001377B0"/>
+    <w:pPr>
+      <w:spacing w:after="0"/>
+    </w:pPr>
+    <w:rPr>
+      <w:rFonts w:ascii="Times New Roman" w:eastAsia="Times New Roman" w:hAnsi="Times New Roman" w:cs="Times New Roman"/>
+      <w:lang w:val="en-AU" w:eastAsia="en-GB"/>
+    </w:rPr>
   </w:style>
   <w:style w:type="paragraph" w:styleId="Heading1">
     <w:name w:val="heading 1"/>
@@ -12488,11 +12834,11 @@
     <w:pPr>
       <w:keepNext/>
       <w:keepLines/>
-      <w:spacing w:before="480" w:after="0"/>
+      <w:spacing w:before="480"/>
       <w:outlineLvl w:val="0"/>
     </w:pPr>
     <w:rPr>
-      <w:rFonts w:ascii="Times New Roman" w:eastAsiaTheme="majorEastAsia" w:hAnsi="Times New Roman" w:cstheme="majorBidi"/>
+      <w:rFonts w:eastAsiaTheme="majorEastAsia" w:cstheme="majorBidi"/>
       <w:b/>
       <w:bCs/>
       <w:color w:val="000000" w:themeColor="text1"/>
@@ -12511,11 +12857,11 @@
     <w:pPr>
       <w:keepNext/>
       <w:keepLines/>
-      <w:spacing w:before="200" w:after="0"/>
+      <w:spacing w:before="200"/>
       <w:outlineLvl w:val="1"/>
     </w:pPr>
     <w:rPr>
-      <w:rFonts w:ascii="Times New Roman" w:eastAsiaTheme="majorEastAsia" w:hAnsi="Times New Roman" w:cstheme="majorBidi"/>
+      <w:rFonts w:eastAsiaTheme="majorEastAsia" w:cstheme="majorBidi"/>
       <w:b/>
       <w:bCs/>
       <w:color w:val="000000" w:themeColor="text1"/>
@@ -12534,11 +12880,11 @@
     <w:pPr>
       <w:keepNext/>
       <w:keepLines/>
-      <w:spacing w:before="200" w:after="0"/>
+      <w:spacing w:before="200"/>
       <w:outlineLvl w:val="2"/>
     </w:pPr>
     <w:rPr>
-      <w:rFonts w:ascii="Times New Roman" w:eastAsiaTheme="majorEastAsia" w:hAnsi="Times New Roman" w:cstheme="majorBidi"/>
+      <w:rFonts w:eastAsiaTheme="majorEastAsia" w:cstheme="majorBidi"/>
       <w:b/>
       <w:bCs/>
       <w:color w:val="000000" w:themeColor="text1"/>
@@ -12557,11 +12903,11 @@
     <w:pPr>
       <w:keepNext/>
       <w:keepLines/>
-      <w:spacing w:before="200" w:after="0"/>
+      <w:spacing w:before="200"/>
       <w:outlineLvl w:val="3"/>
     </w:pPr>
     <w:rPr>
-      <w:rFonts w:ascii="Times New Roman" w:eastAsiaTheme="majorEastAsia" w:hAnsi="Times New Roman" w:cstheme="majorBidi"/>
+      <w:rFonts w:eastAsiaTheme="majorEastAsia" w:cstheme="majorBidi"/>
       <w:b/>
       <w:bCs/>
       <w:color w:val="000000" w:themeColor="text1"/>
@@ -12578,11 +12924,11 @@
     <w:pPr>
       <w:keepNext/>
       <w:keepLines/>
-      <w:spacing w:before="200" w:after="0"/>
+      <w:spacing w:before="200"/>
       <w:outlineLvl w:val="4"/>
     </w:pPr>
     <w:rPr>
-      <w:rFonts w:ascii="Times New Roman" w:eastAsiaTheme="majorEastAsia" w:hAnsi="Times New Roman" w:cstheme="majorBidi"/>
+      <w:rFonts w:eastAsiaTheme="majorEastAsia" w:cstheme="majorBidi"/>
       <w:i/>
       <w:iCs/>
       <w:color w:val="000000" w:themeColor="text1"/>
@@ -12598,7 +12944,7 @@
     <w:pPr>
       <w:keepNext/>
       <w:keepLines/>
-      <w:spacing w:before="200" w:after="0"/>
+      <w:spacing w:before="200"/>
       <w:outlineLvl w:val="5"/>
     </w:pPr>
     <w:rPr>
@@ -12616,7 +12962,7 @@
     <w:pPr>
       <w:keepNext/>
       <w:keepLines/>
-      <w:spacing w:before="200" w:after="0"/>
+      <w:spacing w:before="200"/>
       <w:outlineLvl w:val="6"/>
     </w:pPr>
     <w:rPr>
@@ -12634,7 +12980,7 @@
     <w:pPr>
       <w:keepNext/>
       <w:keepLines/>
-      <w:spacing w:before="200" w:after="0"/>
+      <w:spacing w:before="200"/>
       <w:outlineLvl w:val="7"/>
     </w:pPr>
     <w:rPr>
@@ -12652,7 +12998,7 @@
     <w:pPr>
       <w:keepNext/>
       <w:keepLines/>
-      <w:spacing w:before="200" w:after="0"/>
+      <w:spacing w:before="200"/>
       <w:outlineLvl w:val="8"/>
     </w:pPr>
     <w:rPr>
@@ -12695,9 +13041,6 @@
     <w:pPr>
       <w:spacing w:before="180" w:after="180"/>
     </w:pPr>
-    <w:rPr>
-      <w:rFonts w:ascii="Times New Roman" w:hAnsi="Times New Roman"/>
-    </w:rPr>
   </w:style>
   <w:style w:type="paragraph" w:customStyle="1" w:styleId="FirstParagraph">
     <w:name w:val="First Paragraph"/>
@@ -12727,7 +13070,7 @@
       <w:jc w:val="center"/>
     </w:pPr>
     <w:rPr>
-      <w:rFonts w:ascii="Times New Roman" w:eastAsiaTheme="majorEastAsia" w:hAnsi="Times New Roman" w:cstheme="majorBidi"/>
+      <w:rFonts w:eastAsiaTheme="majorEastAsia" w:cstheme="majorBidi"/>
       <w:b/>
       <w:bCs/>
       <w:color w:val="000000" w:themeColor="text1"/>
@@ -12799,9 +13142,6 @@
     <w:pPr>
       <w:ind w:left="227" w:hanging="227"/>
     </w:pPr>
-    <w:rPr>
-      <w:rFonts w:ascii="Times New Roman" w:hAnsi="Times New Roman"/>
-    </w:rPr>
   </w:style>
   <w:style w:type="paragraph" w:styleId="BlockText">
     <w:name w:val="Block Text"/>
@@ -12849,7 +13189,6 @@
     <w:pPr>
       <w:keepNext/>
       <w:keepLines/>
-      <w:spacing w:after="0"/>
     </w:pPr>
     <w:rPr>
       <w:b/>
@@ -12878,7 +13217,6 @@
       <w:keepNext/>
     </w:pPr>
     <w:rPr>
-      <w:rFonts w:ascii="Times New Roman" w:hAnsi="Times New Roman"/>
       <w:i w:val="0"/>
     </w:rPr>
   </w:style>
@@ -12887,7 +13225,6 @@
     <w:basedOn w:val="Caption"/>
     <w:rsid w:val="00BB46C2"/>
     <w:rPr>
-      <w:rFonts w:ascii="Times New Roman" w:hAnsi="Times New Roman"/>
       <w:i w:val="0"/>
     </w:rPr>
   </w:style>

</xml_diff>